<commit_message>
fix(docx): replace hardcoded 1/1/26 in Direct templates with {{bid_date_formatted}}
User reported the generated proposal docx always showed DATE: 1/1/26
regardless of the actual bid date. Root cause: Kyle's source templates
have '1/1/26' literally typed into the DATE header (twice — top page +
repeating header on continuation pages). The annotation pass had no
rule for it, so the static text passed straight through.

Fix:
- Add 1/1/26 -> {{bid_date_formatted}} rule for Epoxy/Polish/Combo/Budget
  Direct templates (4 templates, 10 substitutions total)
- Send bid_date_formatted (M/D/YY) from proposal-review.html — derived
  from state.bid_date and falling back to today if blank

GC + Gyp templates use different hardcoded dates (05/1/26, 4/1/26) —
not patched yet, follow-up.

Co-Authored-By: Claude Opus 4.7 (1M context) <noreply@anthropic.com>
</commit_message>
<xml_diff>
--- a/backend/templates/Direct/XX.XX TREADWELL EPOXY PROPOSAL - New Direct.docx
+++ b/backend/templates/Direct/XX.XX TREADWELL EPOXY PROPOSAL - New Direct.docx
@@ -519,7 +519,7 @@
                                 <w:sz w:val="18"/>
                                 <w:szCs w:val="18"/>
                               </w:rPr>
-                              <w:t>1</w:t>
+                              <w:t xml:space="preserve">{{bid_date_formatted}}</w:t>
                             </w:r>
                             <w:r>
                               <w:rPr>
@@ -528,7 +528,7 @@
                                 <w:sz w:val="18"/>
                                 <w:szCs w:val="18"/>
                               </w:rPr>
-                              <w:t>/</w:t>
+                              <w:t/>
                             </w:r>
                             <w:r>
                               <w:rPr>
@@ -537,7 +537,7 @@
                                 <w:sz w:val="18"/>
                                 <w:szCs w:val="18"/>
                               </w:rPr>
-                              <w:t>1</w:t>
+                              <w:t/>
                             </w:r>
                             <w:r>
                               <w:rPr>
@@ -546,7 +546,7 @@
                                 <w:sz w:val="18"/>
                                 <w:szCs w:val="18"/>
                               </w:rPr>
-                              <w:t>/</w:t>
+                              <w:t/>
                             </w:r>
                             <w:r>
                               <w:rPr>
@@ -555,7 +555,7 @@
                                 <w:sz w:val="18"/>
                                 <w:szCs w:val="18"/>
                               </w:rPr>
-                              <w:t>2</w:t>
+                              <w:t/>
                             </w:r>
                             <w:r>
                               <w:rPr>
@@ -564,7 +564,7 @@
                                 <w:sz w:val="18"/>
                                 <w:szCs w:val="18"/>
                               </w:rPr>
-                              <w:t>6</w:t>
+                              <w:t/>
                             </w:r>
                           </w:p>
                         </w:txbxContent>
@@ -611,7 +611,7 @@
                           <w:sz w:val="18"/>
                           <w:szCs w:val="18"/>
                         </w:rPr>
-                        <w:t>1</w:t>
+                        <w:t xml:space="preserve">{{bid_date_formatted}}</w:t>
                       </w:r>
                       <w:r>
                         <w:rPr>
@@ -620,7 +620,7 @@
                           <w:sz w:val="18"/>
                           <w:szCs w:val="18"/>
                         </w:rPr>
-                        <w:t>/</w:t>
+                        <w:t/>
                       </w:r>
                       <w:r>
                         <w:rPr>
@@ -629,7 +629,7 @@
                           <w:sz w:val="18"/>
                           <w:szCs w:val="18"/>
                         </w:rPr>
-                        <w:t>1</w:t>
+                        <w:t/>
                       </w:r>
                       <w:r>
                         <w:rPr>
@@ -638,7 +638,7 @@
                           <w:sz w:val="18"/>
                           <w:szCs w:val="18"/>
                         </w:rPr>
-                        <w:t>/</w:t>
+                        <w:t/>
                       </w:r>
                       <w:r>
                         <w:rPr>
@@ -647,7 +647,7 @@
                           <w:sz w:val="18"/>
                           <w:szCs w:val="18"/>
                         </w:rPr>
-                        <w:t>2</w:t>
+                        <w:t/>
                       </w:r>
                       <w:r>
                         <w:rPr>
@@ -656,7 +656,7 @@
                           <w:sz w:val="18"/>
                           <w:szCs w:val="18"/>
                         </w:rPr>
-                        <w:t>6</w:t>
+                        <w:t/>
                       </w:r>
                     </w:p>
                   </w:txbxContent>

</xml_diff>

<commit_message>
feat(proposal): sign with the signed-in estimator, remove hardcoded "Troy Holmes"
Troy has left Treadwell, but his name was typed into the 3 Direct proposal
templates (Epoxy/Polish/Combo) as the signature — so every Direct proposal was
signed "Troy Holmes" regardless of who made it. Replace it with an
{{estimator_name}} token (collapsing the doubled run), add an editable
"Estimator" field on the Proposal screen pre-filled from the signed-in user,
and backfill estimator_name from the authenticated user on /api/generate so it's
never blank, never a raw token, and never Troy. Local fill test + new
test_estimator_name_replaces_troy cover all 3 work types.

Co-Authored-By: Claude Opus 4.8 (1M context) <noreply@anthropic.com>
</commit_message>
<xml_diff>
--- a/backend/templates/Direct/XX.XX TREADWELL EPOXY PROPOSAL - New Direct.docx
+++ b/backend/templates/Direct/XX.XX TREADWELL EPOXY PROPOSAL - New Direct.docx
@@ -5002,7 +5002,7 @@
                                 <w:sz w:val="18"/>
                                 <w:szCs w:val="18"/>
                               </w:rPr>
-                              <w:t>Troy Holmes</w:t>
+                              <w:t xml:space="preserve">{{estimator_name}}</w:t>
                             </w:r>
                           </w:p>
                         </w:txbxContent>
@@ -5084,15 +5084,15 @@
                           <w:sz w:val="18"/>
                           <w:szCs w:val="18"/>
                         </w:rPr>
-                        <w:t xml:space="preserve">Troy </w:t>
-                      </w:r>
-                      <w:r>
-                        <w:rPr>
-                          <w:color w:val="404040" w:themeColor="text1" w:themeTint="BF"/>
-                          <w:sz w:val="18"/>
-                          <w:szCs w:val="18"/>
-                        </w:rPr>
-                        <w:t>Holmes</w:t>
+                        <w:t xml:space="preserve">{{estimator_name}}</w:t>
+                      </w:r>
+                      <w:r>
+                        <w:rPr>
+                          <w:color w:val="404040" w:themeColor="text1" w:themeTint="BF"/>
+                          <w:sz w:val="18"/>
+                          <w:szCs w:val="18"/>
+                        </w:rPr>
+                        <w:t/>
                       </w:r>
                     </w:p>
                   </w:txbxContent>

</xml_diff>

<commit_message>
feat(proposal): epoxy WORK section lists each picked system (Option 1/2 dynamic)
The epoxy proposal's WORK section now repeats per picked system instead of a
single hardcoded block: 1 system → "System:   <name>" (no Option label), 2+ →
"Option 1: …" / "Option 2: …", with each system's texture + area (SF, and LF
only when there's cove). Built backend-side from the System 1/2 estimate cells
(Epoxy!A22/E20/E34, A26/E24/E37) with a single-system fallback from flat values
so the {{#system}} block always has ≥1 row. Annotated the epoxy template's WORK
text box (both DrawingML + VML copies) with {{#system}} markers; made the writer
always strip an empty system block (like price_line/alternate) so markers never
leak. Scoped to epoxy for now (combo/polish unchanged).

Co-Authored-By: Claude Opus 4.8 (1M context) <noreply@anthropic.com>
</commit_message>
<xml_diff>
--- a/backend/templates/Direct/XX.XX TREADWELL EPOXY PROPOSAL - New Direct.docx
+++ b/backend/templates/Direct/XX.XX TREADWELL EPOXY PROPOSAL - New Direct.docx
@@ -860,25 +860,33 @@
                                 <w:sz w:val="16"/>
                                 <w:szCs w:val="16"/>
                               </w:rPr>
-                              <w:t>System:</w:t>
-                            </w:r>
-                            <w:r>
+                              <w:t xml:space="preserve">{{#system}}</w:t>
+                            </w:r>
+                          </w:p>
+                          <w:p>
+                            <w:pPr>
+                              <w:pStyle w:val="ListParagraph"/>
+                              <w:numPr>
+                                <w:ilvl w:val="0"/>
+                                <w:numId w:val="4"/>
+                              </w:numPr>
+                              <w:spacing w:line="276" w:lineRule="auto"/>
                               <w:rPr>
                                 <w:rFonts w:ascii="Zetta Serif Book" w:hAnsi="Zetta Serif Book"/>
                                 <w:color w:val="404040" w:themeColor="text1" w:themeTint="BF"/>
                                 <w:sz w:val="16"/>
                                 <w:szCs w:val="16"/>
                               </w:rPr>
-                              <w:t xml:space="preserve">   </w:t>
-                            </w:r>
-                            <w:r>
-                              <w:rPr>
-                                <w:rFonts w:ascii="Zetta Serif Book" w:hAnsi="Zetta Serif Book"/>
+                            </w:pPr>
+                            <w:r>
+                              <w:rPr>
+                                <w:rFonts w:ascii="Zetta Serif Book" w:hAnsi="Zetta Serif Book"/>
+                                <w:b/>
                                 <w:color w:val="404040" w:themeColor="text1" w:themeTint="BF"/>
                                 <w:sz w:val="16"/>
                                 <w:szCs w:val="16"/>
                               </w:rPr>
-                              <w:t xml:space="preserve">{{system_name}}</w:t>
+                              <w:t xml:space="preserve">{{system.label}}</w:t>
                             </w:r>
                           </w:p>
                           <w:p>
@@ -900,16 +908,7 @@
                                 <w:sz w:val="16"/>
                                 <w:szCs w:val="16"/>
                               </w:rPr>
-                              <w:t xml:space="preserve">Texture:  </w:t>
-                            </w:r>
-                            <w:r>
-                              <w:rPr>
-                                <w:rFonts w:ascii="Zetta Serif Book" w:hAnsi="Zetta Serif Book"/>
-                                <w:color w:val="404040" w:themeColor="text1" w:themeTint="BF"/>
-                                <w:sz w:val="16"/>
-                                <w:szCs w:val="16"/>
-                              </w:rPr>
-                              <w:t xml:space="preserve">{{texture}}</w:t>
+                              <w:t xml:space="preserve">Texture:  {{system.texture}}</w:t>
                             </w:r>
                           </w:p>
                           <w:p>
@@ -938,125 +937,33 @@
                                 <w:sz w:val="16"/>
                                 <w:szCs w:val="16"/>
                               </w:rPr>
-                              <w:t xml:space="preserve">Area: ~{{epoxy_sf}} SF of epoxy flooring and {{cove_lf}} LF of epoxy base</w:t>
-                            </w:r>
-                            <w:r>
+                              <w:t xml:space="preserve">Area: {{system.area}}</w:t>
+                            </w:r>
+                          </w:p>
+                          <w:p>
+                            <w:pPr>
+                              <w:pStyle w:val="ListParagraph"/>
+                              <w:numPr>
+                                <w:ilvl w:val="0"/>
+                                <w:numId w:val="4"/>
+                              </w:numPr>
+                              <w:spacing w:line="276" w:lineRule="auto"/>
                               <w:rPr>
                                 <w:rFonts w:ascii="Zetta Serif Book" w:hAnsi="Zetta Serif Book"/>
                                 <w:color w:val="404040" w:themeColor="text1" w:themeTint="BF"/>
                                 <w:sz w:val="16"/>
                                 <w:szCs w:val="16"/>
                               </w:rPr>
-                              <w:t xml:space="preserve"/>
-                            </w:r>
-                            <w:r>
-                              <w:rPr>
-                                <w:rFonts w:ascii="Zetta Serif Book" w:hAnsi="Zetta Serif Book"/>
+                            </w:pPr>
+                            <w:r>
+                              <w:rPr>
+                                <w:rFonts w:ascii="Zetta Serif Book" w:hAnsi="Zetta Serif Book"/>
+                                <w:b/>
                                 <w:color w:val="404040" w:themeColor="text1" w:themeTint="BF"/>
                                 <w:sz w:val="16"/>
                                 <w:szCs w:val="16"/>
                               </w:rPr>
-                              <w:tab/>
-                              <w:t/>
-                            </w:r>
-                            <w:r>
-                              <w:rPr>
-                                <w:rFonts w:ascii="Zetta Serif Book" w:hAnsi="Zetta Serif Book"/>
-                                <w:color w:val="404040" w:themeColor="text1" w:themeTint="BF"/>
-                                <w:sz w:val="16"/>
-                                <w:szCs w:val="16"/>
-                              </w:rPr>
-                              <w:t/>
-                            </w:r>
-                            <w:r>
-                              <w:rPr>
-                                <w:rFonts w:ascii="Zetta Serif Book" w:hAnsi="Zetta Serif Book"/>
-                                <w:color w:val="404040" w:themeColor="text1" w:themeTint="BF"/>
-                                <w:sz w:val="16"/>
-                                <w:szCs w:val="16"/>
-                              </w:rPr>
-                              <w:t xml:space="preserve"/>
-                            </w:r>
-                            <w:r>
-                              <w:rPr>
-                                <w:rFonts w:ascii="Zetta Serif Book" w:hAnsi="Zetta Serif Book"/>
-                                <w:color w:val="404040" w:themeColor="text1" w:themeTint="BF"/>
-                                <w:sz w:val="16"/>
-                                <w:szCs w:val="16"/>
-                              </w:rPr>
-                              <w:t xml:space="preserve"/>
-                            </w:r>
-                            <w:r>
-                              <w:rPr>
-                                <w:rFonts w:ascii="Zetta Serif Book" w:hAnsi="Zetta Serif Book"/>
-                                <w:color w:val="404040" w:themeColor="text1" w:themeTint="BF"/>
-                                <w:sz w:val="16"/>
-                                <w:szCs w:val="16"/>
-                              </w:rPr>
-                              <w:t xml:space="preserve"/>
-                            </w:r>
-                            <w:r>
-                              <w:rPr>
-                                <w:rFonts w:ascii="Zetta Serif Book" w:hAnsi="Zetta Serif Book"/>
-                                <w:color w:val="404040" w:themeColor="text1" w:themeTint="BF"/>
-                                <w:sz w:val="16"/>
-                                <w:szCs w:val="16"/>
-                              </w:rPr>
-                              <w:t/>
-                            </w:r>
-                            <w:r>
-                              <w:rPr>
-                                <w:rFonts w:ascii="Zetta Serif Book" w:hAnsi="Zetta Serif Book"/>
-                                <w:color w:val="404040" w:themeColor="text1" w:themeTint="BF"/>
-                                <w:sz w:val="16"/>
-                                <w:szCs w:val="16"/>
-                              </w:rPr>
-                              <w:t xml:space="preserve"/>
-                            </w:r>
-                            <w:r>
-                              <w:rPr>
-                                <w:rFonts w:ascii="Zetta Serif Book" w:hAnsi="Zetta Serif Book"/>
-                                <w:color w:val="404040" w:themeColor="text1" w:themeTint="BF"/>
-                                <w:sz w:val="16"/>
-                                <w:szCs w:val="16"/>
-                              </w:rPr>
-                              <w:t xml:space="preserve"/>
-                            </w:r>
-                            <w:r>
-                              <w:rPr>
-                                <w:rFonts w:ascii="Zetta Serif Book" w:hAnsi="Zetta Serif Book"/>
-                                <w:color w:val="404040" w:themeColor="text1" w:themeTint="BF"/>
-                                <w:sz w:val="16"/>
-                                <w:szCs w:val="16"/>
-                              </w:rPr>
-                              <w:t xml:space="preserve"/>
-                            </w:r>
-                            <w:r>
-                              <w:rPr>
-                                <w:rFonts w:ascii="Zetta Serif Book" w:hAnsi="Zetta Serif Book"/>
-                                <w:color w:val="404040" w:themeColor="text1" w:themeTint="BF"/>
-                                <w:sz w:val="16"/>
-                                <w:szCs w:val="16"/>
-                              </w:rPr>
-                              <w:t xml:space="preserve"/>
-                            </w:r>
-                            <w:r>
-                              <w:rPr>
-                                <w:rFonts w:ascii="Zetta Serif Book" w:hAnsi="Zetta Serif Book"/>
-                                <w:color w:val="404040" w:themeColor="text1" w:themeTint="BF"/>
-                                <w:sz w:val="16"/>
-                                <w:szCs w:val="16"/>
-                              </w:rPr>
-                              <w:t xml:space="preserve"/>
-                            </w:r>
-                            <w:r>
-                              <w:rPr>
-                                <w:rFonts w:ascii="Zetta Serif Book" w:hAnsi="Zetta Serif Book"/>
-                                <w:color w:val="404040" w:themeColor="text1" w:themeTint="BF"/>
-                                <w:sz w:val="16"/>
-                                <w:szCs w:val="16"/>
-                              </w:rPr>
-                              <w:t/>
+                              <w:t xml:space="preserve">{{/system}}</w:t>
                             </w:r>
                           </w:p>
                           <w:p>
@@ -1777,25 +1684,33 @@
                           <w:sz w:val="16"/>
                           <w:szCs w:val="16"/>
                         </w:rPr>
-                        <w:t>System:</w:t>
-                      </w:r>
-                      <w:r>
+                        <w:t xml:space="preserve">{{#system}}</w:t>
+                      </w:r>
+                    </w:p>
+                    <w:p>
+                      <w:pPr>
+                        <w:pStyle w:val="ListParagraph"/>
+                        <w:numPr>
+                          <w:ilvl w:val="0"/>
+                          <w:numId w:val="4"/>
+                        </w:numPr>
+                        <w:spacing w:line="276" w:lineRule="auto"/>
                         <w:rPr>
                           <w:rFonts w:ascii="Zetta Serif Book" w:hAnsi="Zetta Serif Book"/>
                           <w:color w:val="404040" w:themeColor="text1" w:themeTint="BF"/>
                           <w:sz w:val="16"/>
                           <w:szCs w:val="16"/>
                         </w:rPr>
-                        <w:t xml:space="preserve">   </w:t>
-                      </w:r>
-                      <w:r>
-                        <w:rPr>
-                          <w:rFonts w:ascii="Zetta Serif Book" w:hAnsi="Zetta Serif Book"/>
+                      </w:pPr>
+                      <w:r>
+                        <w:rPr>
+                          <w:rFonts w:ascii="Zetta Serif Book" w:hAnsi="Zetta Serif Book"/>
+                          <w:b/>
                           <w:color w:val="404040" w:themeColor="text1" w:themeTint="BF"/>
                           <w:sz w:val="16"/>
                           <w:szCs w:val="16"/>
                         </w:rPr>
-                        <w:t xml:space="preserve">{{system_name}}</w:t>
+                        <w:t xml:space="preserve">{{system.label}}</w:t>
                       </w:r>
                     </w:p>
                     <w:p>
@@ -1817,16 +1732,7 @@
                           <w:sz w:val="16"/>
                           <w:szCs w:val="16"/>
                         </w:rPr>
-                        <w:t xml:space="preserve">Texture:  </w:t>
-                      </w:r>
-                      <w:r>
-                        <w:rPr>
-                          <w:rFonts w:ascii="Zetta Serif Book" w:hAnsi="Zetta Serif Book"/>
-                          <w:color w:val="404040" w:themeColor="text1" w:themeTint="BF"/>
-                          <w:sz w:val="16"/>
-                          <w:szCs w:val="16"/>
-                        </w:rPr>
-                        <w:t xml:space="preserve">{{texture}}</w:t>
+                        <w:t xml:space="preserve">Texture:  {{system.texture}}</w:t>
                       </w:r>
                     </w:p>
                     <w:p>
@@ -1855,125 +1761,33 @@
                           <w:sz w:val="16"/>
                           <w:szCs w:val="16"/>
                         </w:rPr>
-                        <w:t xml:space="preserve">Area: ~{{epoxy_sf}} SF of epoxy flooring and {{cove_lf}} LF of epoxy base</w:t>
-                      </w:r>
-                      <w:r>
+                        <w:t xml:space="preserve">Area: {{system.area}}</w:t>
+                      </w:r>
+                    </w:p>
+                    <w:p>
+                      <w:pPr>
+                        <w:pStyle w:val="ListParagraph"/>
+                        <w:numPr>
+                          <w:ilvl w:val="0"/>
+                          <w:numId w:val="4"/>
+                        </w:numPr>
+                        <w:spacing w:line="276" w:lineRule="auto"/>
                         <w:rPr>
                           <w:rFonts w:ascii="Zetta Serif Book" w:hAnsi="Zetta Serif Book"/>
                           <w:color w:val="404040" w:themeColor="text1" w:themeTint="BF"/>
                           <w:sz w:val="16"/>
                           <w:szCs w:val="16"/>
                         </w:rPr>
-                        <w:t xml:space="preserve"/>
-                      </w:r>
-                      <w:r>
-                        <w:rPr>
-                          <w:rFonts w:ascii="Zetta Serif Book" w:hAnsi="Zetta Serif Book"/>
+                      </w:pPr>
+                      <w:r>
+                        <w:rPr>
+                          <w:rFonts w:ascii="Zetta Serif Book" w:hAnsi="Zetta Serif Book"/>
+                          <w:b/>
                           <w:color w:val="404040" w:themeColor="text1" w:themeTint="BF"/>
                           <w:sz w:val="16"/>
                           <w:szCs w:val="16"/>
                         </w:rPr>
-                        <w:tab/>
-                        <w:t/>
-                      </w:r>
-                      <w:r>
-                        <w:rPr>
-                          <w:rFonts w:ascii="Zetta Serif Book" w:hAnsi="Zetta Serif Book"/>
-                          <w:color w:val="404040" w:themeColor="text1" w:themeTint="BF"/>
-                          <w:sz w:val="16"/>
-                          <w:szCs w:val="16"/>
-                        </w:rPr>
-                        <w:t/>
-                      </w:r>
-                      <w:r>
-                        <w:rPr>
-                          <w:rFonts w:ascii="Zetta Serif Book" w:hAnsi="Zetta Serif Book"/>
-                          <w:color w:val="404040" w:themeColor="text1" w:themeTint="BF"/>
-                          <w:sz w:val="16"/>
-                          <w:szCs w:val="16"/>
-                        </w:rPr>
-                        <w:t xml:space="preserve"/>
-                      </w:r>
-                      <w:r>
-                        <w:rPr>
-                          <w:rFonts w:ascii="Zetta Serif Book" w:hAnsi="Zetta Serif Book"/>
-                          <w:color w:val="404040" w:themeColor="text1" w:themeTint="BF"/>
-                          <w:sz w:val="16"/>
-                          <w:szCs w:val="16"/>
-                        </w:rPr>
-                        <w:t xml:space="preserve"/>
-                      </w:r>
-                      <w:r>
-                        <w:rPr>
-                          <w:rFonts w:ascii="Zetta Serif Book" w:hAnsi="Zetta Serif Book"/>
-                          <w:color w:val="404040" w:themeColor="text1" w:themeTint="BF"/>
-                          <w:sz w:val="16"/>
-                          <w:szCs w:val="16"/>
-                        </w:rPr>
-                        <w:t xml:space="preserve"/>
-                      </w:r>
-                      <w:r>
-                        <w:rPr>
-                          <w:rFonts w:ascii="Zetta Serif Book" w:hAnsi="Zetta Serif Book"/>
-                          <w:color w:val="404040" w:themeColor="text1" w:themeTint="BF"/>
-                          <w:sz w:val="16"/>
-                          <w:szCs w:val="16"/>
-                        </w:rPr>
-                        <w:t/>
-                      </w:r>
-                      <w:r>
-                        <w:rPr>
-                          <w:rFonts w:ascii="Zetta Serif Book" w:hAnsi="Zetta Serif Book"/>
-                          <w:color w:val="404040" w:themeColor="text1" w:themeTint="BF"/>
-                          <w:sz w:val="16"/>
-                          <w:szCs w:val="16"/>
-                        </w:rPr>
-                        <w:t xml:space="preserve"/>
-                      </w:r>
-                      <w:r>
-                        <w:rPr>
-                          <w:rFonts w:ascii="Zetta Serif Book" w:hAnsi="Zetta Serif Book"/>
-                          <w:color w:val="404040" w:themeColor="text1" w:themeTint="BF"/>
-                          <w:sz w:val="16"/>
-                          <w:szCs w:val="16"/>
-                        </w:rPr>
-                        <w:t xml:space="preserve"/>
-                      </w:r>
-                      <w:r>
-                        <w:rPr>
-                          <w:rFonts w:ascii="Zetta Serif Book" w:hAnsi="Zetta Serif Book"/>
-                          <w:color w:val="404040" w:themeColor="text1" w:themeTint="BF"/>
-                          <w:sz w:val="16"/>
-                          <w:szCs w:val="16"/>
-                        </w:rPr>
-                        <w:t xml:space="preserve"/>
-                      </w:r>
-                      <w:r>
-                        <w:rPr>
-                          <w:rFonts w:ascii="Zetta Serif Book" w:hAnsi="Zetta Serif Book"/>
-                          <w:color w:val="404040" w:themeColor="text1" w:themeTint="BF"/>
-                          <w:sz w:val="16"/>
-                          <w:szCs w:val="16"/>
-                        </w:rPr>
-                        <w:t xml:space="preserve"/>
-                      </w:r>
-                      <w:r>
-                        <w:rPr>
-                          <w:rFonts w:ascii="Zetta Serif Book" w:hAnsi="Zetta Serif Book"/>
-                          <w:color w:val="404040" w:themeColor="text1" w:themeTint="BF"/>
-                          <w:sz w:val="16"/>
-                          <w:szCs w:val="16"/>
-                        </w:rPr>
-                        <w:t xml:space="preserve"/>
-                      </w:r>
-                      <w:r>
-                        <w:rPr>
-                          <w:rFonts w:ascii="Zetta Serif Book" w:hAnsi="Zetta Serif Book"/>
-                          <w:color w:val="404040" w:themeColor="text1" w:themeTint="BF"/>
-                          <w:sz w:val="16"/>
-                          <w:szCs w:val="16"/>
-                        </w:rPr>
-                        <w:t/>
+                        <w:t xml:space="preserve">{{/system}}</w:t>
                       </w:r>
                     </w:p>
                     <w:p>

</xml_diff>

<commit_message>
fix(proposal): preserve WORK column formatting + restore boilerplate defaults
- The epoxy WORK {{#system}} block now keeps the original run structure — bold
  "System:"/"Option N:" label + a regular-weight system name + the bold Area
  line — instead of collapsing to one bold run, so values line up like the
  template again. Backend emits prefix/name/sqft/lf_clause to match.
- Restored the proposal boilerplate (scope, schedule, exclusions, add-option)
  as REAL default values, not placeholders. Removing the placeholders had left
  Schedule blank in the generated doc; now every proposal carries the standard
  text unless autofill / a manual edit overrides it.

Co-Authored-By: Claude Opus 4.8 (1M context) <noreply@anthropic.com>
</commit_message>
<xml_diff>
--- a/backend/templates/Direct/XX.XX TREADWELL EPOXY PROPOSAL - New Direct.docx
+++ b/backend/templates/Direct/XX.XX TREADWELL EPOXY PROPOSAL - New Direct.docx
@@ -838,28 +838,7 @@
                             </w:r>
                           </w:p>
                           <w:p>
-                            <w:pPr>
-                              <w:pStyle w:val="ListParagraph"/>
-                              <w:numPr>
-                                <w:ilvl w:val="0"/>
-                                <w:numId w:val="4"/>
-                              </w:numPr>
-                              <w:spacing w:line="276" w:lineRule="auto"/>
-                              <w:rPr>
-                                <w:rFonts w:ascii="Zetta Serif Book" w:hAnsi="Zetta Serif Book"/>
-                                <w:color w:val="404040" w:themeColor="text1" w:themeTint="BF"/>
-                                <w:sz w:val="16"/>
-                                <w:szCs w:val="16"/>
-                              </w:rPr>
-                            </w:pPr>
-                            <w:r>
-                              <w:rPr>
-                                <w:rFonts w:ascii="Zetta Serif Book" w:hAnsi="Zetta Serif Book"/>
-                                <w:b/>
-                                <w:color w:val="404040" w:themeColor="text1" w:themeTint="BF"/>
-                                <w:sz w:val="16"/>
-                                <w:szCs w:val="16"/>
-                              </w:rPr>
+                            <w:r>
                               <w:t xml:space="preserve">{{#system}}</w:t>
                             </w:r>
                           </w:p>
@@ -886,7 +865,25 @@
                                 <w:sz w:val="16"/>
                                 <w:szCs w:val="16"/>
                               </w:rPr>
-                              <w:t xml:space="preserve">{{system.label}}</w:t>
+                              <w:t xml:space="preserve">{{system.prefix}}</w:t>
+                            </w:r>
+                            <w:r>
+                              <w:rPr>
+                                <w:rFonts w:ascii="Zetta Serif Book" w:hAnsi="Zetta Serif Book"/>
+                                <w:color w:val="404040" w:themeColor="text1" w:themeTint="BF"/>
+                                <w:sz w:val="16"/>
+                                <w:szCs w:val="16"/>
+                              </w:rPr>
+                              <w:t xml:space="preserve">   </w:t>
+                            </w:r>
+                            <w:r>
+                              <w:rPr>
+                                <w:rFonts w:ascii="Zetta Serif Book" w:hAnsi="Zetta Serif Book"/>
+                                <w:color w:val="404040" w:themeColor="text1" w:themeTint="BF"/>
+                                <w:sz w:val="16"/>
+                                <w:szCs w:val="16"/>
+                              </w:rPr>
+                              <w:t xml:space="preserve">{{system.name}}</w:t>
                             </w:r>
                           </w:p>
                           <w:p>
@@ -908,7 +905,16 @@
                                 <w:sz w:val="16"/>
                                 <w:szCs w:val="16"/>
                               </w:rPr>
-                              <w:t xml:space="preserve">Texture:  {{system.texture}}</w:t>
+                              <w:t xml:space="preserve">Texture:  </w:t>
+                            </w:r>
+                            <w:r>
+                              <w:rPr>
+                                <w:rFonts w:ascii="Zetta Serif Book" w:hAnsi="Zetta Serif Book"/>
+                                <w:color w:val="404040" w:themeColor="text1" w:themeTint="BF"/>
+                                <w:sz w:val="16"/>
+                                <w:szCs w:val="16"/>
+                              </w:rPr>
+                              <w:t xml:space="preserve">{{system.texture}}</w:t>
                             </w:r>
                           </w:p>
                           <w:p>
@@ -937,32 +943,129 @@
                                 <w:sz w:val="16"/>
                                 <w:szCs w:val="16"/>
                               </w:rPr>
-                              <w:t xml:space="preserve">Area: {{system.area}}</w:t>
+                              <w:t xml:space="preserve">Area: ~{{system.sqft}} SF of epoxy flooring{{system.lf_clause}}</w:t>
+                            </w:r>
+                            <w:r>
+                              <w:rPr>
+                                <w:rFonts w:ascii="Zetta Serif Book" w:hAnsi="Zetta Serif Book"/>
+                                <w:color w:val="404040" w:themeColor="text1" w:themeTint="BF"/>
+                                <w:sz w:val="16"/>
+                                <w:szCs w:val="16"/>
+                              </w:rPr>
+                              <w:t xml:space="preserve"/>
+                            </w:r>
+                            <w:r>
+                              <w:rPr>
+                                <w:rFonts w:ascii="Zetta Serif Book" w:hAnsi="Zetta Serif Book"/>
+                                <w:color w:val="404040" w:themeColor="text1" w:themeTint="BF"/>
+                                <w:sz w:val="16"/>
+                                <w:szCs w:val="16"/>
+                              </w:rPr>
+                              <w:tab/>
+                              <w:t/>
+                            </w:r>
+                            <w:r>
+                              <w:rPr>
+                                <w:rFonts w:ascii="Zetta Serif Book" w:hAnsi="Zetta Serif Book"/>
+                                <w:color w:val="404040" w:themeColor="text1" w:themeTint="BF"/>
+                                <w:sz w:val="16"/>
+                                <w:szCs w:val="16"/>
+                              </w:rPr>
+                              <w:t/>
+                            </w:r>
+                            <w:r>
+                              <w:rPr>
+                                <w:rFonts w:ascii="Zetta Serif Book" w:hAnsi="Zetta Serif Book"/>
+                                <w:color w:val="404040" w:themeColor="text1" w:themeTint="BF"/>
+                                <w:sz w:val="16"/>
+                                <w:szCs w:val="16"/>
+                              </w:rPr>
+                              <w:t xml:space="preserve"/>
+                            </w:r>
+                            <w:r>
+                              <w:rPr>
+                                <w:rFonts w:ascii="Zetta Serif Book" w:hAnsi="Zetta Serif Book"/>
+                                <w:color w:val="404040" w:themeColor="text1" w:themeTint="BF"/>
+                                <w:sz w:val="16"/>
+                                <w:szCs w:val="16"/>
+                              </w:rPr>
+                              <w:t xml:space="preserve"/>
+                            </w:r>
+                            <w:r>
+                              <w:rPr>
+                                <w:rFonts w:ascii="Zetta Serif Book" w:hAnsi="Zetta Serif Book"/>
+                                <w:color w:val="404040" w:themeColor="text1" w:themeTint="BF"/>
+                                <w:sz w:val="16"/>
+                                <w:szCs w:val="16"/>
+                              </w:rPr>
+                              <w:t xml:space="preserve"/>
+                            </w:r>
+                            <w:r>
+                              <w:rPr>
+                                <w:rFonts w:ascii="Zetta Serif Book" w:hAnsi="Zetta Serif Book"/>
+                                <w:color w:val="404040" w:themeColor="text1" w:themeTint="BF"/>
+                                <w:sz w:val="16"/>
+                                <w:szCs w:val="16"/>
+                              </w:rPr>
+                              <w:t/>
+                            </w:r>
+                            <w:r>
+                              <w:rPr>
+                                <w:rFonts w:ascii="Zetta Serif Book" w:hAnsi="Zetta Serif Book"/>
+                                <w:color w:val="404040" w:themeColor="text1" w:themeTint="BF"/>
+                                <w:sz w:val="16"/>
+                                <w:szCs w:val="16"/>
+                              </w:rPr>
+                              <w:t xml:space="preserve"/>
+                            </w:r>
+                            <w:r>
+                              <w:rPr>
+                                <w:rFonts w:ascii="Zetta Serif Book" w:hAnsi="Zetta Serif Book"/>
+                                <w:color w:val="404040" w:themeColor="text1" w:themeTint="BF"/>
+                                <w:sz w:val="16"/>
+                                <w:szCs w:val="16"/>
+                              </w:rPr>
+                              <w:t xml:space="preserve"/>
+                            </w:r>
+                            <w:r>
+                              <w:rPr>
+                                <w:rFonts w:ascii="Zetta Serif Book" w:hAnsi="Zetta Serif Book"/>
+                                <w:color w:val="404040" w:themeColor="text1" w:themeTint="BF"/>
+                                <w:sz w:val="16"/>
+                                <w:szCs w:val="16"/>
+                              </w:rPr>
+                              <w:t xml:space="preserve"/>
+                            </w:r>
+                            <w:r>
+                              <w:rPr>
+                                <w:rFonts w:ascii="Zetta Serif Book" w:hAnsi="Zetta Serif Book"/>
+                                <w:color w:val="404040" w:themeColor="text1" w:themeTint="BF"/>
+                                <w:sz w:val="16"/>
+                                <w:szCs w:val="16"/>
+                              </w:rPr>
+                              <w:t xml:space="preserve"/>
+                            </w:r>
+                            <w:r>
+                              <w:rPr>
+                                <w:rFonts w:ascii="Zetta Serif Book" w:hAnsi="Zetta Serif Book"/>
+                                <w:color w:val="404040" w:themeColor="text1" w:themeTint="BF"/>
+                                <w:sz w:val="16"/>
+                                <w:szCs w:val="16"/>
+                              </w:rPr>
+                              <w:t xml:space="preserve"/>
+                            </w:r>
+                            <w:r>
+                              <w:rPr>
+                                <w:rFonts w:ascii="Zetta Serif Book" w:hAnsi="Zetta Serif Book"/>
+                                <w:color w:val="404040" w:themeColor="text1" w:themeTint="BF"/>
+                                <w:sz w:val="16"/>
+                                <w:szCs w:val="16"/>
+                              </w:rPr>
+                              <w:t/>
                             </w:r>
                           </w:p>
                           <w:p>
-                            <w:pPr>
-                              <w:pStyle w:val="ListParagraph"/>
-                              <w:numPr>
-                                <w:ilvl w:val="0"/>
-                                <w:numId w:val="4"/>
-                              </w:numPr>
-                              <w:spacing w:line="276" w:lineRule="auto"/>
-                              <w:rPr>
-                                <w:rFonts w:ascii="Zetta Serif Book" w:hAnsi="Zetta Serif Book"/>
-                                <w:color w:val="404040" w:themeColor="text1" w:themeTint="BF"/>
-                                <w:sz w:val="16"/>
-                                <w:szCs w:val="16"/>
-                              </w:rPr>
-                            </w:pPr>
-                            <w:r>
-                              <w:rPr>
-                                <w:rFonts w:ascii="Zetta Serif Book" w:hAnsi="Zetta Serif Book"/>
-                                <w:b/>
-                                <w:color w:val="404040" w:themeColor="text1" w:themeTint="BF"/>
-                                <w:sz w:val="16"/>
-                                <w:szCs w:val="16"/>
-                              </w:rPr>
+                            <w:r>
                               <w:t xml:space="preserve">{{/system}}</w:t>
                             </w:r>
                           </w:p>
@@ -1662,28 +1765,7 @@
                       </w:r>
                     </w:p>
                     <w:p>
-                      <w:pPr>
-                        <w:pStyle w:val="ListParagraph"/>
-                        <w:numPr>
-                          <w:ilvl w:val="0"/>
-                          <w:numId w:val="4"/>
-                        </w:numPr>
-                        <w:spacing w:line="276" w:lineRule="auto"/>
-                        <w:rPr>
-                          <w:rFonts w:ascii="Zetta Serif Book" w:hAnsi="Zetta Serif Book"/>
-                          <w:color w:val="404040" w:themeColor="text1" w:themeTint="BF"/>
-                          <w:sz w:val="16"/>
-                          <w:szCs w:val="16"/>
-                        </w:rPr>
-                      </w:pPr>
-                      <w:r>
-                        <w:rPr>
-                          <w:rFonts w:ascii="Zetta Serif Book" w:hAnsi="Zetta Serif Book"/>
-                          <w:b/>
-                          <w:color w:val="404040" w:themeColor="text1" w:themeTint="BF"/>
-                          <w:sz w:val="16"/>
-                          <w:szCs w:val="16"/>
-                        </w:rPr>
+                      <w:r>
                         <w:t xml:space="preserve">{{#system}}</w:t>
                       </w:r>
                     </w:p>
@@ -1710,7 +1792,25 @@
                           <w:sz w:val="16"/>
                           <w:szCs w:val="16"/>
                         </w:rPr>
-                        <w:t xml:space="preserve">{{system.label}}</w:t>
+                        <w:t xml:space="preserve">{{system.prefix}}</w:t>
+                      </w:r>
+                      <w:r>
+                        <w:rPr>
+                          <w:rFonts w:ascii="Zetta Serif Book" w:hAnsi="Zetta Serif Book"/>
+                          <w:color w:val="404040" w:themeColor="text1" w:themeTint="BF"/>
+                          <w:sz w:val="16"/>
+                          <w:szCs w:val="16"/>
+                        </w:rPr>
+                        <w:t xml:space="preserve">   </w:t>
+                      </w:r>
+                      <w:r>
+                        <w:rPr>
+                          <w:rFonts w:ascii="Zetta Serif Book" w:hAnsi="Zetta Serif Book"/>
+                          <w:color w:val="404040" w:themeColor="text1" w:themeTint="BF"/>
+                          <w:sz w:val="16"/>
+                          <w:szCs w:val="16"/>
+                        </w:rPr>
+                        <w:t xml:space="preserve">{{system.name}}</w:t>
                       </w:r>
                     </w:p>
                     <w:p>
@@ -1732,7 +1832,16 @@
                           <w:sz w:val="16"/>
                           <w:szCs w:val="16"/>
                         </w:rPr>
-                        <w:t xml:space="preserve">Texture:  {{system.texture}}</w:t>
+                        <w:t xml:space="preserve">Texture:  </w:t>
+                      </w:r>
+                      <w:r>
+                        <w:rPr>
+                          <w:rFonts w:ascii="Zetta Serif Book" w:hAnsi="Zetta Serif Book"/>
+                          <w:color w:val="404040" w:themeColor="text1" w:themeTint="BF"/>
+                          <w:sz w:val="16"/>
+                          <w:szCs w:val="16"/>
+                        </w:rPr>
+                        <w:t xml:space="preserve">{{system.texture}}</w:t>
                       </w:r>
                     </w:p>
                     <w:p>
@@ -1761,32 +1870,129 @@
                           <w:sz w:val="16"/>
                           <w:szCs w:val="16"/>
                         </w:rPr>
-                        <w:t xml:space="preserve">Area: {{system.area}}</w:t>
+                        <w:t xml:space="preserve">Area: ~{{system.sqft}} SF of epoxy flooring{{system.lf_clause}}</w:t>
+                      </w:r>
+                      <w:r>
+                        <w:rPr>
+                          <w:rFonts w:ascii="Zetta Serif Book" w:hAnsi="Zetta Serif Book"/>
+                          <w:color w:val="404040" w:themeColor="text1" w:themeTint="BF"/>
+                          <w:sz w:val="16"/>
+                          <w:szCs w:val="16"/>
+                        </w:rPr>
+                        <w:t xml:space="preserve"/>
+                      </w:r>
+                      <w:r>
+                        <w:rPr>
+                          <w:rFonts w:ascii="Zetta Serif Book" w:hAnsi="Zetta Serif Book"/>
+                          <w:color w:val="404040" w:themeColor="text1" w:themeTint="BF"/>
+                          <w:sz w:val="16"/>
+                          <w:szCs w:val="16"/>
+                        </w:rPr>
+                        <w:tab/>
+                        <w:t/>
+                      </w:r>
+                      <w:r>
+                        <w:rPr>
+                          <w:rFonts w:ascii="Zetta Serif Book" w:hAnsi="Zetta Serif Book"/>
+                          <w:color w:val="404040" w:themeColor="text1" w:themeTint="BF"/>
+                          <w:sz w:val="16"/>
+                          <w:szCs w:val="16"/>
+                        </w:rPr>
+                        <w:t/>
+                      </w:r>
+                      <w:r>
+                        <w:rPr>
+                          <w:rFonts w:ascii="Zetta Serif Book" w:hAnsi="Zetta Serif Book"/>
+                          <w:color w:val="404040" w:themeColor="text1" w:themeTint="BF"/>
+                          <w:sz w:val="16"/>
+                          <w:szCs w:val="16"/>
+                        </w:rPr>
+                        <w:t xml:space="preserve"/>
+                      </w:r>
+                      <w:r>
+                        <w:rPr>
+                          <w:rFonts w:ascii="Zetta Serif Book" w:hAnsi="Zetta Serif Book"/>
+                          <w:color w:val="404040" w:themeColor="text1" w:themeTint="BF"/>
+                          <w:sz w:val="16"/>
+                          <w:szCs w:val="16"/>
+                        </w:rPr>
+                        <w:t xml:space="preserve"/>
+                      </w:r>
+                      <w:r>
+                        <w:rPr>
+                          <w:rFonts w:ascii="Zetta Serif Book" w:hAnsi="Zetta Serif Book"/>
+                          <w:color w:val="404040" w:themeColor="text1" w:themeTint="BF"/>
+                          <w:sz w:val="16"/>
+                          <w:szCs w:val="16"/>
+                        </w:rPr>
+                        <w:t xml:space="preserve"/>
+                      </w:r>
+                      <w:r>
+                        <w:rPr>
+                          <w:rFonts w:ascii="Zetta Serif Book" w:hAnsi="Zetta Serif Book"/>
+                          <w:color w:val="404040" w:themeColor="text1" w:themeTint="BF"/>
+                          <w:sz w:val="16"/>
+                          <w:szCs w:val="16"/>
+                        </w:rPr>
+                        <w:t/>
+                      </w:r>
+                      <w:r>
+                        <w:rPr>
+                          <w:rFonts w:ascii="Zetta Serif Book" w:hAnsi="Zetta Serif Book"/>
+                          <w:color w:val="404040" w:themeColor="text1" w:themeTint="BF"/>
+                          <w:sz w:val="16"/>
+                          <w:szCs w:val="16"/>
+                        </w:rPr>
+                        <w:t xml:space="preserve"/>
+                      </w:r>
+                      <w:r>
+                        <w:rPr>
+                          <w:rFonts w:ascii="Zetta Serif Book" w:hAnsi="Zetta Serif Book"/>
+                          <w:color w:val="404040" w:themeColor="text1" w:themeTint="BF"/>
+                          <w:sz w:val="16"/>
+                          <w:szCs w:val="16"/>
+                        </w:rPr>
+                        <w:t xml:space="preserve"/>
+                      </w:r>
+                      <w:r>
+                        <w:rPr>
+                          <w:rFonts w:ascii="Zetta Serif Book" w:hAnsi="Zetta Serif Book"/>
+                          <w:color w:val="404040" w:themeColor="text1" w:themeTint="BF"/>
+                          <w:sz w:val="16"/>
+                          <w:szCs w:val="16"/>
+                        </w:rPr>
+                        <w:t xml:space="preserve"/>
+                      </w:r>
+                      <w:r>
+                        <w:rPr>
+                          <w:rFonts w:ascii="Zetta Serif Book" w:hAnsi="Zetta Serif Book"/>
+                          <w:color w:val="404040" w:themeColor="text1" w:themeTint="BF"/>
+                          <w:sz w:val="16"/>
+                          <w:szCs w:val="16"/>
+                        </w:rPr>
+                        <w:t xml:space="preserve"/>
+                      </w:r>
+                      <w:r>
+                        <w:rPr>
+                          <w:rFonts w:ascii="Zetta Serif Book" w:hAnsi="Zetta Serif Book"/>
+                          <w:color w:val="404040" w:themeColor="text1" w:themeTint="BF"/>
+                          <w:sz w:val="16"/>
+                          <w:szCs w:val="16"/>
+                        </w:rPr>
+                        <w:t xml:space="preserve"/>
+                      </w:r>
+                      <w:r>
+                        <w:rPr>
+                          <w:rFonts w:ascii="Zetta Serif Book" w:hAnsi="Zetta Serif Book"/>
+                          <w:color w:val="404040" w:themeColor="text1" w:themeTint="BF"/>
+                          <w:sz w:val="16"/>
+                          <w:szCs w:val="16"/>
+                        </w:rPr>
+                        <w:t/>
                       </w:r>
                     </w:p>
                     <w:p>
-                      <w:pPr>
-                        <w:pStyle w:val="ListParagraph"/>
-                        <w:numPr>
-                          <w:ilvl w:val="0"/>
-                          <w:numId w:val="4"/>
-                        </w:numPr>
-                        <w:spacing w:line="276" w:lineRule="auto"/>
-                        <w:rPr>
-                          <w:rFonts w:ascii="Zetta Serif Book" w:hAnsi="Zetta Serif Book"/>
-                          <w:color w:val="404040" w:themeColor="text1" w:themeTint="BF"/>
-                          <w:sz w:val="16"/>
-                          <w:szCs w:val="16"/>
-                        </w:rPr>
-                      </w:pPr>
-                      <w:r>
-                        <w:rPr>
-                          <w:rFonts w:ascii="Zetta Serif Book" w:hAnsi="Zetta Serif Book"/>
-                          <w:b/>
-                          <w:color w:val="404040" w:themeColor="text1" w:themeTint="BF"/>
-                          <w:sz w:val="16"/>
-                          <w:szCs w:val="16"/>
-                        </w:rPr>
+                      <w:r>
                         <w:t xml:space="preserve">{{/system}}</w:t>
                       </w:r>
                     </w:p>

</xml_diff>

<commit_message>
feat(proposal): itemized epoxy PRICE breakdown + Kansas-only remodel tax
The epoxy PRICE block now itemizes for transparency, summing to the sheet's
Total Lump Sum:
  Base Bid  +  Material Sales Tax  [+  Kansas Remodel Tax]  =  Total
- Material Sales Tax is always shown (even $0) for transparency; figure comes
  from the engine's D80 sales tax.
- Kansas Remodel Tax sits in a conditional {{#remodel}} block — it appears only
  when the estimate's Remodel toggle (D6) is on (remodel_tax > 0) and is hidden
  otherwise. The label is hardcoded "Kansas Remodel Tax" (never the job's state,
  so Missouri jobs no longer read "Missouri Remodel Tax"). Alternate block label
  fixed to Kansas too.
- Dropped the "(material sales tax INCLUDED)" note since tax is now itemized.
Base Bid is the remainder (Total − sales − remodel) so the lines always add up.
Scoped to the epoxy Direct template for now.

Co-Authored-By: Claude Opus 4.8 (1M context) <noreply@anthropic.com>
</commit_message>
<xml_diff>
--- a/backend/templates/Direct/XX.XX TREADWELL EPOXY PROPOSAL - New Direct.docx
+++ b/backend/templates/Direct/XX.XX TREADWELL EPOXY PROPOSAL - New Direct.docx
@@ -3628,7 +3628,7 @@
                                 <w:sz w:val="18"/>
                                 <w:szCs w:val="18"/>
                               </w:rPr>
-                              <w:t xml:space="preserve">{{lump_sum_formatted}} – Epoxy flooring as described above (material sales tax INCLUDED)</w:t>
+                              <w:t xml:space="preserve">{{base_bid_formatted}} – Epoxy flooring as described above</w:t>
                             </w:r>
                             <w:proofErr w:type="spellStart"/>
                             <w:r>
@@ -3786,7 +3786,7 @@
                                 <w:highlight w:val="yellow"/>
                                 <w:u w:val="single"/>
                               </w:rPr>
-                              <w:t xml:space="preserve">{{tax_amount_formatted}} – {{state_name}} Remodel Tax</w:t>
+                              <w:t xml:space="preserve">{{material_tax_formatted}} – Material Sales Tax</w:t>
                             </w:r>
                             <w:r>
                               <w:rPr>
@@ -3850,6 +3850,11 @@
                                 <w:szCs w:val="18"/>
                               </w:rPr>
                               <w:t xml:space="preserve"/>
+                            </w:r>
+                          </w:p>
+                          <w:p>
+                            <w:r>
+                              <w:t xml:space="preserve">{{#remodel}}</w:t>
                             </w:r>
                           </w:p>
                           <w:p>
@@ -3870,22 +3875,81 @@
                             <w:r>
                               <w:rPr>
                                 <w:rFonts w:ascii="Zetta Serif Book" w:hAnsi="Zetta Serif Book"/>
-                                <w:b/>
-                                <w:bCs/>
-                                <w:color w:val="404040" w:themeColor="text1" w:themeTint="BF"/>
-                                <w:sz w:val="18"/>
-                                <w:szCs w:val="18"/>
-                              </w:rPr>
-                              <w:t xml:space="preserve">{{total_formatted}} – Total</w:t>
-                            </w:r>
-                            <w:r>
-                              <w:rPr>
-                                <w:rFonts w:ascii="Zetta Serif Book" w:hAnsi="Zetta Serif Book"/>
-                                <w:color w:val="404040" w:themeColor="text1" w:themeTint="BF"/>
-                                <w:sz w:val="18"/>
-                                <w:szCs w:val="18"/>
+                                <w:color w:val="404040" w:themeColor="text1" w:themeTint="BF"/>
+                                <w:sz w:val="18"/>
+                                <w:szCs w:val="18"/>
+                                <w:highlight w:val="yellow"/>
+                                <w:u w:val="single"/>
+                              </w:rPr>
+                              <w:t xml:space="preserve">{{remodel.amount_formatted}} – Kansas Remodel Tax</w:t>
+                            </w:r>
+                            <w:r>
+                              <w:rPr>
+                                <w:rFonts w:ascii="Zetta Serif Book" w:hAnsi="Zetta Serif Book"/>
+                                <w:color w:val="404040" w:themeColor="text1" w:themeTint="BF"/>
+                                <w:sz w:val="18"/>
+                                <w:szCs w:val="18"/>
+                                <w:highlight w:val="yellow"/>
+                                <w:u w:val="single"/>
                               </w:rPr>
                               <w:t xml:space="preserve"/>
+                            </w:r>
+                            <w:r>
+                              <w:rPr>
+                                <w:rFonts w:ascii="Zetta Serif Book" w:hAnsi="Zetta Serif Book"/>
+                                <w:color w:val="404040" w:themeColor="text1" w:themeTint="BF"/>
+                                <w:sz w:val="18"/>
+                                <w:szCs w:val="18"/>
+                                <w:highlight w:val="yellow"/>
+                                <w:u w:val="single"/>
+                              </w:rPr>
+                              <w:t/>
+                            </w:r>
+                            <w:r>
+                              <w:rPr>
+                                <w:rFonts w:ascii="Zetta Serif Book" w:hAnsi="Zetta Serif Book"/>
+                                <w:color w:val="404040" w:themeColor="text1" w:themeTint="BF"/>
+                                <w:sz w:val="18"/>
+                                <w:szCs w:val="18"/>
+                                <w:highlight w:val="yellow"/>
+                                <w:u w:val="single"/>
+                              </w:rPr>
+                              <w:t/>
+                            </w:r>
+                            <w:r>
+                              <w:rPr>
+                                <w:rFonts w:ascii="Zetta Serif Book" w:hAnsi="Zetta Serif Book"/>
+                                <w:color w:val="404040" w:themeColor="text1" w:themeTint="BF"/>
+                                <w:sz w:val="18"/>
+                                <w:szCs w:val="18"/>
+                                <w:highlight w:val="yellow"/>
+                                <w:u w:val="single"/>
+                              </w:rPr>
+                              <w:t xml:space="preserve"/>
+                            </w:r>
+                            <w:r>
+                              <w:rPr>
+                                <w:rFonts w:ascii="Zetta Serif Book" w:hAnsi="Zetta Serif Book"/>
+                                <w:color w:val="404040" w:themeColor="text1" w:themeTint="BF"/>
+                                <w:sz w:val="18"/>
+                                <w:szCs w:val="18"/>
+                                <w:highlight w:val="yellow"/>
+                              </w:rPr>
+                              <w:t/>
+                            </w:r>
+                            <w:r>
+                              <w:rPr>
+                                <w:rFonts w:ascii="Zetta Serif Book" w:hAnsi="Zetta Serif Book"/>
+                                <w:color w:val="404040" w:themeColor="text1" w:themeTint="BF"/>
+                                <w:sz w:val="18"/>
+                                <w:szCs w:val="18"/>
+                              </w:rPr>
+                              <w:t xml:space="preserve"/>
+                            </w:r>
+                          </w:p>
+                          <w:p>
+                            <w:r>
+                              <w:t xml:space="preserve">{{/remodel}}</w:t>
                             </w:r>
                           </w:p>
                           <w:p>
@@ -3912,7 +3976,16 @@
                                 <w:sz w:val="18"/>
                                 <w:szCs w:val="18"/>
                               </w:rPr>
-                              <w:t xml:space="preserve">{{#price_line}}</w:t>
+                              <w:t xml:space="preserve">{{total_formatted}} – Total</w:t>
+                            </w:r>
+                            <w:r>
+                              <w:rPr>
+                                <w:rFonts w:ascii="Zetta Serif Book" w:hAnsi="Zetta Serif Book"/>
+                                <w:color w:val="404040" w:themeColor="text1" w:themeTint="BF"/>
+                                <w:sz w:val="18"/>
+                                <w:szCs w:val="18"/>
+                              </w:rPr>
+                              <w:t xml:space="preserve"/>
                             </w:r>
                           </w:p>
                           <w:p>
@@ -3939,7 +4012,7 @@
                                 <w:sz w:val="18"/>
                                 <w:szCs w:val="18"/>
                               </w:rPr>
-                              <w:t xml:space="preserve">{{price_line.amount_formatted}} – {{price_line.label}}</w:t>
+                              <w:t xml:space="preserve">{{#price_line}}</w:t>
                             </w:r>
                           </w:p>
                           <w:p>
@@ -3966,7 +4039,7 @@
                                 <w:sz w:val="18"/>
                                 <w:szCs w:val="18"/>
                               </w:rPr>
-                              <w:t xml:space="preserve">{{/price_line}}</w:t>
+                              <w:t xml:space="preserve">{{price_line.amount_formatted}} – {{price_line.label}}</w:t>
                             </w:r>
                           </w:p>
                           <w:p>
@@ -3993,7 +4066,7 @@
                                 <w:sz w:val="18"/>
                                 <w:szCs w:val="18"/>
                               </w:rPr>
-                              <w:t xml:space="preserve">{{#alternate}}</w:t>
+                              <w:t xml:space="preserve">{{/price_line}}</w:t>
                             </w:r>
                           </w:p>
                           <w:p>
@@ -4020,7 +4093,7 @@
                                 <w:sz w:val="18"/>
                                 <w:szCs w:val="18"/>
                               </w:rPr>
-                              <w:t xml:space="preserve">ALTERNATE SYSTEM — {{alternate.system_name}}</w:t>
+                              <w:t xml:space="preserve">{{#alternate}}</w:t>
                             </w:r>
                           </w:p>
                           <w:p>
@@ -4047,7 +4120,7 @@
                                 <w:sz w:val="18"/>
                                 <w:szCs w:val="18"/>
                               </w:rPr>
-                              <w:t xml:space="preserve">{{alternate.lump_sum_formatted}} – Flooring as described above (material sales tax INCLUDED)</w:t>
+                              <w:t xml:space="preserve">ALTERNATE SYSTEM — {{alternate.system_name}}</w:t>
                             </w:r>
                           </w:p>
                           <w:p>
@@ -4074,7 +4147,34 @@
                                 <w:sz w:val="18"/>
                                 <w:szCs w:val="18"/>
                               </w:rPr>
-                              <w:t xml:space="preserve">{{alternate.remodel_tax}} – {{state_name}} Remodel Tax</w:t>
+                              <w:t xml:space="preserve">{{alternate.lump_sum_formatted}} – Flooring as described above (material sales tax INCLUDED)</w:t>
+                            </w:r>
+                          </w:p>
+                          <w:p>
+                            <w:pPr>
+                              <w:pStyle w:val="ListParagraph"/>
+                              <w:numPr>
+                                <w:ilvl w:val="0"/>
+                                <w:numId w:val="3"/>
+                              </w:numPr>
+                              <w:spacing w:line="300" w:lineRule="auto"/>
+                              <w:rPr>
+                                <w:rFonts w:ascii="Zetta Serif Book" w:hAnsi="Zetta Serif Book"/>
+                                <w:color w:val="404040" w:themeColor="text1" w:themeTint="BF"/>
+                                <w:sz w:val="18"/>
+                                <w:szCs w:val="18"/>
+                              </w:rPr>
+                            </w:pPr>
+                            <w:r>
+                              <w:rPr>
+                                <w:rFonts w:ascii="Zetta Serif Book" w:hAnsi="Zetta Serif Book"/>
+                                <w:b/>
+                                <w:bCs/>
+                                <w:color w:val="404040" w:themeColor="text1" w:themeTint="BF"/>
+                                <w:sz w:val="18"/>
+                                <w:szCs w:val="18"/>
+                              </w:rPr>
+                              <w:t xml:space="preserve">{{alternate.remodel_tax}} – Kansas Remodel Tax</w:t>
                             </w:r>
                           </w:p>
                           <w:p>
@@ -4279,7 +4379,7 @@
                           <w:sz w:val="18"/>
                           <w:szCs w:val="18"/>
                         </w:rPr>
-                        <w:t xml:space="preserve">{{lump_sum_formatted}} – Epoxy flooring as described above (material sales tax INCLUDED)</w:t>
+                        <w:t xml:space="preserve">{{base_bid_formatted}} – Epoxy flooring as described above</w:t>
                       </w:r>
                       <w:proofErr w:type="spellStart"/>
                       <w:r>
@@ -4437,7 +4537,7 @@
                           <w:highlight w:val="yellow"/>
                           <w:u w:val="single"/>
                         </w:rPr>
-                        <w:t xml:space="preserve">{{tax_amount_formatted}} – {{state_name}} Remodel Tax</w:t>
+                        <w:t xml:space="preserve">{{material_tax_formatted}} – Material Sales Tax</w:t>
                       </w:r>
                       <w:r>
                         <w:rPr>
@@ -4501,6 +4601,11 @@
                           <w:szCs w:val="18"/>
                         </w:rPr>
                         <w:t xml:space="preserve"/>
+                      </w:r>
+                    </w:p>
+                    <w:p>
+                      <w:r>
+                        <w:t xml:space="preserve">{{#remodel}}</w:t>
                       </w:r>
                     </w:p>
                     <w:p>
@@ -4521,22 +4626,33 @@
                       <w:r>
                         <w:rPr>
                           <w:rFonts w:ascii="Zetta Serif Book" w:hAnsi="Zetta Serif Book"/>
-                          <w:b/>
-                          <w:bCs/>
-                          <w:color w:val="404040" w:themeColor="text1" w:themeTint="BF"/>
-                          <w:sz w:val="18"/>
-                          <w:szCs w:val="18"/>
-                        </w:rPr>
-                        <w:t xml:space="preserve">{{total_formatted}} – Total</w:t>
-                      </w:r>
-                      <w:r>
-                        <w:rPr>
-                          <w:rFonts w:ascii="Zetta Serif Book" w:hAnsi="Zetta Serif Book"/>
-                          <w:b/>
-                          <w:bCs/>
-                          <w:color w:val="404040" w:themeColor="text1" w:themeTint="BF"/>
-                          <w:sz w:val="18"/>
-                          <w:szCs w:val="18"/>
+                          <w:color w:val="404040" w:themeColor="text1" w:themeTint="BF"/>
+                          <w:sz w:val="18"/>
+                          <w:szCs w:val="18"/>
+                          <w:highlight w:val="yellow"/>
+                          <w:u w:val="single"/>
+                        </w:rPr>
+                        <w:t xml:space="preserve">{{remodel.amount_formatted}} – Kansas Remodel Tax</w:t>
+                      </w:r>
+                      <w:r>
+                        <w:rPr>
+                          <w:rFonts w:ascii="Zetta Serif Book" w:hAnsi="Zetta Serif Book"/>
+                          <w:color w:val="404040" w:themeColor="text1" w:themeTint="BF"/>
+                          <w:sz w:val="18"/>
+                          <w:szCs w:val="18"/>
+                          <w:highlight w:val="yellow"/>
+                          <w:u w:val="single"/>
+                        </w:rPr>
+                        <w:t xml:space="preserve"/>
+                      </w:r>
+                      <w:r>
+                        <w:rPr>
+                          <w:rFonts w:ascii="Zetta Serif Book" w:hAnsi="Zetta Serif Book"/>
+                          <w:color w:val="404040" w:themeColor="text1" w:themeTint="BF"/>
+                          <w:sz w:val="18"/>
+                          <w:szCs w:val="18"/>
+                          <w:highlight w:val="yellow"/>
+                          <w:u w:val="single"/>
                         </w:rPr>
                         <w:t/>
                       </w:r>
@@ -4546,8 +4662,45 @@
                           <w:color w:val="404040" w:themeColor="text1" w:themeTint="BF"/>
                           <w:sz w:val="18"/>
                           <w:szCs w:val="18"/>
+                          <w:highlight w:val="yellow"/>
+                          <w:u w:val="single"/>
+                        </w:rPr>
+                        <w:t/>
+                      </w:r>
+                      <w:r>
+                        <w:rPr>
+                          <w:rFonts w:ascii="Zetta Serif Book" w:hAnsi="Zetta Serif Book"/>
+                          <w:color w:val="404040" w:themeColor="text1" w:themeTint="BF"/>
+                          <w:sz w:val="18"/>
+                          <w:szCs w:val="18"/>
+                          <w:highlight w:val="yellow"/>
+                          <w:u w:val="single"/>
                         </w:rPr>
                         <w:t xml:space="preserve"/>
+                      </w:r>
+                      <w:r>
+                        <w:rPr>
+                          <w:rFonts w:ascii="Zetta Serif Book" w:hAnsi="Zetta Serif Book"/>
+                          <w:color w:val="404040" w:themeColor="text1" w:themeTint="BF"/>
+                          <w:sz w:val="18"/>
+                          <w:szCs w:val="18"/>
+                          <w:highlight w:val="yellow"/>
+                        </w:rPr>
+                        <w:t/>
+                      </w:r>
+                      <w:r>
+                        <w:rPr>
+                          <w:rFonts w:ascii="Zetta Serif Book" w:hAnsi="Zetta Serif Book"/>
+                          <w:color w:val="404040" w:themeColor="text1" w:themeTint="BF"/>
+                          <w:sz w:val="18"/>
+                          <w:szCs w:val="18"/>
+                        </w:rPr>
+                        <w:t xml:space="preserve"/>
+                      </w:r>
+                    </w:p>
+                    <w:p>
+                      <w:r>
+                        <w:t xml:space="preserve">{{/remodel}}</w:t>
                       </w:r>
                     </w:p>
                     <w:p>
@@ -4574,7 +4727,27 @@
                           <w:sz w:val="18"/>
                           <w:szCs w:val="18"/>
                         </w:rPr>
-                        <w:t xml:space="preserve">{{#price_line}}</w:t>
+                        <w:t xml:space="preserve">{{total_formatted}} – Total</w:t>
+                      </w:r>
+                      <w:r>
+                        <w:rPr>
+                          <w:rFonts w:ascii="Zetta Serif Book" w:hAnsi="Zetta Serif Book"/>
+                          <w:b/>
+                          <w:bCs/>
+                          <w:color w:val="404040" w:themeColor="text1" w:themeTint="BF"/>
+                          <w:sz w:val="18"/>
+                          <w:szCs w:val="18"/>
+                        </w:rPr>
+                        <w:t/>
+                      </w:r>
+                      <w:r>
+                        <w:rPr>
+                          <w:rFonts w:ascii="Zetta Serif Book" w:hAnsi="Zetta Serif Book"/>
+                          <w:color w:val="404040" w:themeColor="text1" w:themeTint="BF"/>
+                          <w:sz w:val="18"/>
+                          <w:szCs w:val="18"/>
+                        </w:rPr>
+                        <w:t xml:space="preserve"/>
                       </w:r>
                     </w:p>
                     <w:p>
@@ -4601,7 +4774,7 @@
                           <w:sz w:val="18"/>
                           <w:szCs w:val="18"/>
                         </w:rPr>
-                        <w:t xml:space="preserve">{{price_line.amount_formatted}} – {{price_line.label}}</w:t>
+                        <w:t xml:space="preserve">{{#price_line}}</w:t>
                       </w:r>
                     </w:p>
                     <w:p>
@@ -4628,7 +4801,7 @@
                           <w:sz w:val="18"/>
                           <w:szCs w:val="18"/>
                         </w:rPr>
-                        <w:t xml:space="preserve">{{/price_line}}</w:t>
+                        <w:t xml:space="preserve">{{price_line.amount_formatted}} – {{price_line.label}}</w:t>
                       </w:r>
                     </w:p>
                     <w:p>
@@ -4655,7 +4828,7 @@
                           <w:sz w:val="18"/>
                           <w:szCs w:val="18"/>
                         </w:rPr>
-                        <w:t xml:space="preserve">{{#alternate}}</w:t>
+                        <w:t xml:space="preserve">{{/price_line}}</w:t>
                       </w:r>
                     </w:p>
                     <w:p>
@@ -4682,7 +4855,7 @@
                           <w:sz w:val="18"/>
                           <w:szCs w:val="18"/>
                         </w:rPr>
-                        <w:t xml:space="preserve">ALTERNATE SYSTEM — {{alternate.system_name}}</w:t>
+                        <w:t xml:space="preserve">{{#alternate}}</w:t>
                       </w:r>
                     </w:p>
                     <w:p>
@@ -4709,7 +4882,7 @@
                           <w:sz w:val="18"/>
                           <w:szCs w:val="18"/>
                         </w:rPr>
-                        <w:t xml:space="preserve">{{alternate.lump_sum_formatted}} – Flooring as described above (material sales tax INCLUDED)</w:t>
+                        <w:t xml:space="preserve">ALTERNATE SYSTEM — {{alternate.system_name}}</w:t>
                       </w:r>
                     </w:p>
                     <w:p>
@@ -4736,7 +4909,34 @@
                           <w:sz w:val="18"/>
                           <w:szCs w:val="18"/>
                         </w:rPr>
-                        <w:t xml:space="preserve">{{alternate.remodel_tax}} – {{state_name}} Remodel Tax</w:t>
+                        <w:t xml:space="preserve">{{alternate.lump_sum_formatted}} – Flooring as described above (material sales tax INCLUDED)</w:t>
+                      </w:r>
+                    </w:p>
+                    <w:p>
+                      <w:pPr>
+                        <w:pStyle w:val="ListParagraph"/>
+                        <w:numPr>
+                          <w:ilvl w:val="0"/>
+                          <w:numId w:val="3"/>
+                        </w:numPr>
+                        <w:spacing w:line="300" w:lineRule="auto"/>
+                        <w:rPr>
+                          <w:rFonts w:ascii="Zetta Serif Book" w:hAnsi="Zetta Serif Book"/>
+                          <w:color w:val="404040" w:themeColor="text1" w:themeTint="BF"/>
+                          <w:sz w:val="18"/>
+                          <w:szCs w:val="18"/>
+                        </w:rPr>
+                      </w:pPr>
+                      <w:r>
+                        <w:rPr>
+                          <w:rFonts w:ascii="Zetta Serif Book" w:hAnsi="Zetta Serif Book"/>
+                          <w:b/>
+                          <w:bCs/>
+                          <w:color w:val="404040" w:themeColor="text1" w:themeTint="BF"/>
+                          <w:sz w:val="18"/>
+                          <w:szCs w:val="18"/>
+                        </w:rPr>
+                        <w:t xml:space="preserve">{{alternate.remodel_tax}} – Kansas Remodel Tax</w:t>
                       </w:r>
                     </w:p>
                     <w:p>

</xml_diff>

<commit_message>
fix(proposal): Kyle's notes #3/#5/#6 — scope carries, sheet-accurate tax, no phantom options
#3 Scope notes now carry: epoxy & polish templates' hardcoded scope is replaced
   with {{scope_notes}}, so edits on the Proposal screen flow into the doc. The
   default is work-type-aware (epoxy vs polish).
#5 Material Sales Tax (and Remodel Tax) now come from the SHEET's own cells
   (Epoxy D80/D81, Polish D74/D75 — verified against a real polish estimate),
   snapshotted from the live grid, so the itemized breakdown matches the Total
   Lump Sum exactly instead of the recipe engine's figures.
#6 Removed the hardcoded "phantom" option lines (epoxy $500 demo, polish
   $x/Deduct/Note dummies) so Options shows only what the estimator adds; dropped
   the dead price_options default.

Co-Authored-By: Claude Opus 4.8 (1M context) <noreply@anthropic.com>
</commit_message>
<xml_diff>
--- a/backend/templates/Direct/XX.XX TREADWELL EPOXY PROPOSAL - New Direct.docx
+++ b/backend/templates/Direct/XX.XX TREADWELL EPOXY PROPOSAL - New Direct.docx
@@ -1095,7 +1095,7 @@
                                 <w:sz w:val="16"/>
                                 <w:szCs w:val="16"/>
                               </w:rPr>
-                              <w:t>Scope:</w:t>
+                              <w:t xml:space="preserve">Scope:</w:t>
                             </w:r>
                             <w:r>
                               <w:rPr>
@@ -1104,273 +1104,7 @@
                                 <w:sz w:val="16"/>
                                 <w:szCs w:val="16"/>
                               </w:rPr>
-                              <w:t xml:space="preserve"> </w:t>
-                            </w:r>
-                            <w:r>
-                              <w:rPr>
-                                <w:rFonts w:ascii="Zetta Serif Book" w:hAnsi="Zetta Serif Book"/>
-                                <w:color w:val="404040" w:themeColor="text1" w:themeTint="BF"/>
-                                <w:sz w:val="16"/>
-                                <w:szCs w:val="16"/>
-                              </w:rPr>
-                              <w:tab/>
-                            </w:r>
-                            <w:r>
-                              <w:rPr>
-                                <w:rFonts w:ascii="Zetta Serif Book" w:hAnsi="Zetta Serif Book"/>
-                                <w:color w:val="404040" w:themeColor="text1" w:themeTint="BF"/>
-                                <w:sz w:val="16"/>
-                                <w:szCs w:val="16"/>
-                              </w:rPr>
-                              <w:t xml:space="preserve">Demo </w:t>
-                            </w:r>
-                            <w:r>
-                              <w:rPr>
-                                <w:rFonts w:ascii="Zetta Serif Book" w:hAnsi="Zetta Serif Book"/>
-                                <w:color w:val="404040" w:themeColor="text1" w:themeTint="BF"/>
-                                <w:sz w:val="16"/>
-                                <w:szCs w:val="16"/>
-                              </w:rPr>
-                              <w:t xml:space="preserve">(one layer of) </w:t>
-                            </w:r>
-                            <w:r>
-                              <w:rPr>
-                                <w:rFonts w:ascii="Zetta Serif Book" w:hAnsi="Zetta Serif Book"/>
-                                <w:color w:val="404040" w:themeColor="text1" w:themeTint="BF"/>
-                                <w:sz w:val="16"/>
-                                <w:szCs w:val="16"/>
-                              </w:rPr>
-                              <w:t xml:space="preserve">existing flooring and place in </w:t>
-                            </w:r>
-                            <w:r>
-                              <w:rPr>
-                                <w:rFonts w:ascii="Zetta Serif Book" w:hAnsi="Zetta Serif Book"/>
-                                <w:color w:val="404040" w:themeColor="text1" w:themeTint="BF"/>
-                                <w:sz w:val="16"/>
-                                <w:szCs w:val="16"/>
-                                <w:u w:val="single"/>
-                              </w:rPr>
-                              <w:t xml:space="preserve">{{disposal}}</w:t>
-                            </w:r>
-                            <w:r>
-                              <w:rPr>
-                                <w:rFonts w:ascii="Zetta Serif Book" w:hAnsi="Zetta Serif Book"/>
-                                <w:color w:val="404040" w:themeColor="text1" w:themeTint="BF"/>
-                                <w:sz w:val="16"/>
-                                <w:szCs w:val="16"/>
-                                <w:u w:val="single"/>
-                              </w:rPr>
-                              <w:t>.</w:t>
-                            </w:r>
-                          </w:p>
-                          <w:p>
-                            <w:pPr>
-                              <w:pStyle w:val="ListParagraph"/>
-                              <w:tabs>
-                                <w:tab w:val="left" w:pos="1080"/>
-                              </w:tabs>
-                              <w:spacing w:line="276" w:lineRule="auto"/>
-                              <w:ind w:left="288"/>
-                              <w:rPr>
-                                <w:rFonts w:ascii="Zetta Serif Book" w:hAnsi="Zetta Serif Book"/>
-                                <w:color w:val="404040" w:themeColor="text1" w:themeTint="BF"/>
-                                <w:sz w:val="16"/>
-                                <w:szCs w:val="16"/>
-                              </w:rPr>
-                            </w:pPr>
-                            <w:r>
-                              <w:rPr>
-                                <w:rFonts w:ascii="Zetta Serif Book" w:hAnsi="Zetta Serif Book"/>
-                                <w:color w:val="404040" w:themeColor="text1" w:themeTint="BF"/>
-                                <w:sz w:val="16"/>
-                                <w:szCs w:val="16"/>
-                              </w:rPr>
-                              <w:tab/>
-                            </w:r>
-                            <w:r>
-                              <w:rPr>
-                                <w:rFonts w:ascii="Zetta Serif Book" w:hAnsi="Zetta Serif Book"/>
-                                <w:color w:val="404040" w:themeColor="text1" w:themeTint="BF"/>
-                                <w:sz w:val="16"/>
-                                <w:szCs w:val="16"/>
-                              </w:rPr>
-                              <w:t>Prepare</w:t>
-                            </w:r>
-                            <w:r>
-                              <w:rPr>
-                                <w:rFonts w:ascii="Zetta Serif Book" w:hAnsi="Zetta Serif Book"/>
-                                <w:b/>
-                                <w:color w:val="404040" w:themeColor="text1" w:themeTint="BF"/>
-                                <w:sz w:val="16"/>
-                                <w:szCs w:val="16"/>
-                              </w:rPr>
-                              <w:t xml:space="preserve"> </w:t>
-                            </w:r>
-                            <w:r>
-                              <w:rPr>
-                                <w:rFonts w:ascii="Zetta Serif Book" w:hAnsi="Zetta Serif Book"/>
-                                <w:color w:val="404040" w:themeColor="text1" w:themeTint="BF"/>
-                                <w:sz w:val="16"/>
-                                <w:szCs w:val="16"/>
-                              </w:rPr>
-                              <w:t>substrate surface profile utilizing mechanical means (grinding or shot blasting)</w:t>
-                            </w:r>
-                          </w:p>
-                          <w:p>
-                            <w:pPr>
-                              <w:tabs>
-                                <w:tab w:val="left" w:pos="1080"/>
-                              </w:tabs>
-                              <w:spacing w:line="276" w:lineRule="auto"/>
-                              <w:ind w:left="1080"/>
-                              <w:rPr>
-                                <w:rFonts w:ascii="Zetta Serif Book" w:hAnsi="Zetta Serif Book"/>
-                                <w:color w:val="404040" w:themeColor="text1" w:themeTint="BF"/>
-                                <w:sz w:val="16"/>
-                                <w:szCs w:val="16"/>
-                              </w:rPr>
-                            </w:pPr>
-                            <w:r>
-                              <w:rPr>
-                                <w:rFonts w:ascii="Zetta Serif Book" w:hAnsi="Zetta Serif Book"/>
-                                <w:color w:val="404040" w:themeColor="text1" w:themeTint="BF"/>
-                                <w:sz w:val="16"/>
-                                <w:szCs w:val="16"/>
-                              </w:rPr>
-                              <w:t>Prep substrate cracks and</w:t>
-                            </w:r>
-                            <w:r>
-                              <w:rPr>
-                                <w:rFonts w:ascii="Zetta Serif Book" w:hAnsi="Zetta Serif Book"/>
-                                <w:color w:val="404040" w:themeColor="text1" w:themeTint="BF"/>
-                                <w:sz w:val="16"/>
-                                <w:szCs w:val="16"/>
-                              </w:rPr>
-                              <w:t xml:space="preserve"> non-moving</w:t>
-                            </w:r>
-                            <w:r>
-                              <w:rPr>
-                                <w:rFonts w:ascii="Zetta Serif Book" w:hAnsi="Zetta Serif Book"/>
-                                <w:color w:val="404040" w:themeColor="text1" w:themeTint="BF"/>
-                                <w:sz w:val="16"/>
-                                <w:szCs w:val="16"/>
-                              </w:rPr>
-                              <w:t xml:space="preserve"> joints (includes minor floor prep</w:t>
-                            </w:r>
-                            <w:r>
-                              <w:rPr>
-                                <w:rFonts w:ascii="Zetta Serif Book" w:hAnsi="Zetta Serif Book"/>
-                                <w:color w:val="404040" w:themeColor="text1" w:themeTint="BF"/>
-                                <w:sz w:val="16"/>
-                                <w:szCs w:val="16"/>
-                              </w:rPr>
-                              <w:t>, patching of minor substrate defects</w:t>
-                            </w:r>
-                            <w:r>
-                              <w:rPr>
-                                <w:rFonts w:ascii="Zetta Serif Book" w:hAnsi="Zetta Serif Book"/>
-                                <w:color w:val="404040" w:themeColor="text1" w:themeTint="BF"/>
-                                <w:sz w:val="16"/>
-                                <w:szCs w:val="16"/>
-                              </w:rPr>
-                              <w:t xml:space="preserve">, </w:t>
-                            </w:r>
-                            <w:r>
-                              <w:rPr>
-                                <w:rFonts w:ascii="Zetta Serif Book" w:hAnsi="Zetta Serif Book"/>
-                                <w:color w:val="404040" w:themeColor="text1" w:themeTint="BF"/>
-                                <w:sz w:val="16"/>
-                                <w:szCs w:val="16"/>
-                              </w:rPr>
-                              <w:t>spalls and divots</w:t>
-                            </w:r>
-                            <w:r>
-                              <w:rPr>
-                                <w:rFonts w:ascii="Zetta Serif Book" w:hAnsi="Zetta Serif Book"/>
-                                <w:color w:val="404040" w:themeColor="text1" w:themeTint="BF"/>
-                                <w:sz w:val="16"/>
-                                <w:szCs w:val="16"/>
-                              </w:rPr>
-                              <w:t>)</w:t>
-                            </w:r>
-                            <w:r>
-                              <w:rPr>
-                                <w:rFonts w:ascii="Zetta Serif Book" w:hAnsi="Zetta Serif Book"/>
-                                <w:color w:val="404040" w:themeColor="text1" w:themeTint="BF"/>
-                                <w:sz w:val="16"/>
-                                <w:szCs w:val="16"/>
-                              </w:rPr>
-                              <w:t xml:space="preserve">. Excessive patching once the substrate is exposed could result in a change order. </w:t>
-                            </w:r>
-                          </w:p>
-                          <w:p>
-                            <w:pPr>
-                              <w:pStyle w:val="ListParagraph"/>
-                              <w:tabs>
-                                <w:tab w:val="left" w:pos="1080"/>
-                              </w:tabs>
-                              <w:spacing w:line="276" w:lineRule="auto"/>
-                              <w:ind w:left="288"/>
-                              <w:rPr>
-                                <w:rFonts w:ascii="Zetta Serif Book" w:hAnsi="Zetta Serif Book"/>
-                                <w:color w:val="404040" w:themeColor="text1" w:themeTint="BF"/>
-                                <w:sz w:val="16"/>
-                                <w:szCs w:val="16"/>
-                              </w:rPr>
-                            </w:pPr>
-                            <w:r>
-                              <w:rPr>
-                                <w:rFonts w:ascii="Zetta Serif Book" w:hAnsi="Zetta Serif Book"/>
-                                <w:color w:val="404040" w:themeColor="text1" w:themeTint="BF"/>
-                                <w:sz w:val="16"/>
-                                <w:szCs w:val="16"/>
-                              </w:rPr>
-                              <w:tab/>
-                              <w:t xml:space="preserve">Install </w:t>
-                            </w:r>
-                            <w:r>
-                              <w:rPr>
-                                <w:rFonts w:ascii="Zetta Serif Book" w:hAnsi="Zetta Serif Book"/>
-                                <w:color w:val="404040" w:themeColor="text1" w:themeTint="BF"/>
-                                <w:sz w:val="16"/>
-                                <w:szCs w:val="16"/>
-                              </w:rPr>
-                              <w:t>Epoxy</w:t>
-                            </w:r>
-                            <w:r>
-                              <w:rPr>
-                                <w:rFonts w:ascii="Zetta Serif Book" w:hAnsi="Zetta Serif Book"/>
-                                <w:color w:val="404040" w:themeColor="text1" w:themeTint="BF"/>
-                                <w:sz w:val="16"/>
-                                <w:szCs w:val="16"/>
-                              </w:rPr>
-                              <w:t xml:space="preserve"> System </w:t>
-                            </w:r>
-                          </w:p>
-                          <w:p>
-                            <w:pPr>
-                              <w:pStyle w:val="ListParagraph"/>
-                              <w:tabs>
-                                <w:tab w:val="left" w:pos="1080"/>
-                              </w:tabs>
-                              <w:spacing w:line="276" w:lineRule="auto"/>
-                              <w:ind w:left="288"/>
-                              <w:rPr>
-                                <w:rFonts w:ascii="Zetta Serif Book" w:hAnsi="Zetta Serif Book"/>
-                                <w:color w:val="404040" w:themeColor="text1" w:themeTint="BF"/>
-                                <w:sz w:val="16"/>
-                                <w:szCs w:val="16"/>
-                              </w:rPr>
-                            </w:pPr>
-                            <w:r>
-                              <w:rPr>
-                                <w:rFonts w:ascii="Zetta Serif Book" w:hAnsi="Zetta Serif Book"/>
-                                <w:color w:val="404040" w:themeColor="text1" w:themeTint="BF"/>
-                                <w:sz w:val="16"/>
-                                <w:szCs w:val="16"/>
-                              </w:rPr>
-                              <w:tab/>
-                              <w:t>Assumes installation over: clean, sound &amp; solid concrete substrate</w:t>
+                              <w:t xml:space="preserve">  {{scope_notes}}</w:t>
                             </w:r>
                           </w:p>
                           <w:p>
@@ -2022,7 +1756,7 @@
                           <w:sz w:val="16"/>
                           <w:szCs w:val="16"/>
                         </w:rPr>
-                        <w:t>Scope:</w:t>
+                        <w:t xml:space="preserve">Scope:</w:t>
                       </w:r>
                       <w:r>
                         <w:rPr>
@@ -2031,273 +1765,7 @@
                           <w:sz w:val="16"/>
                           <w:szCs w:val="16"/>
                         </w:rPr>
-                        <w:t xml:space="preserve"> </w:t>
-                      </w:r>
-                      <w:r>
-                        <w:rPr>
-                          <w:rFonts w:ascii="Zetta Serif Book" w:hAnsi="Zetta Serif Book"/>
-                          <w:color w:val="404040" w:themeColor="text1" w:themeTint="BF"/>
-                          <w:sz w:val="16"/>
-                          <w:szCs w:val="16"/>
-                        </w:rPr>
-                        <w:tab/>
-                      </w:r>
-                      <w:r>
-                        <w:rPr>
-                          <w:rFonts w:ascii="Zetta Serif Book" w:hAnsi="Zetta Serif Book"/>
-                          <w:color w:val="404040" w:themeColor="text1" w:themeTint="BF"/>
-                          <w:sz w:val="16"/>
-                          <w:szCs w:val="16"/>
-                        </w:rPr>
-                        <w:t xml:space="preserve">Demo </w:t>
-                      </w:r>
-                      <w:r>
-                        <w:rPr>
-                          <w:rFonts w:ascii="Zetta Serif Book" w:hAnsi="Zetta Serif Book"/>
-                          <w:color w:val="404040" w:themeColor="text1" w:themeTint="BF"/>
-                          <w:sz w:val="16"/>
-                          <w:szCs w:val="16"/>
-                        </w:rPr>
-                        <w:t xml:space="preserve">(one layer of) </w:t>
-                      </w:r>
-                      <w:r>
-                        <w:rPr>
-                          <w:rFonts w:ascii="Zetta Serif Book" w:hAnsi="Zetta Serif Book"/>
-                          <w:color w:val="404040" w:themeColor="text1" w:themeTint="BF"/>
-                          <w:sz w:val="16"/>
-                          <w:szCs w:val="16"/>
-                        </w:rPr>
-                        <w:t xml:space="preserve">existing flooring and place in </w:t>
-                      </w:r>
-                      <w:r>
-                        <w:rPr>
-                          <w:rFonts w:ascii="Zetta Serif Book" w:hAnsi="Zetta Serif Book"/>
-                          <w:color w:val="404040" w:themeColor="text1" w:themeTint="BF"/>
-                          <w:sz w:val="16"/>
-                          <w:szCs w:val="16"/>
-                          <w:u w:val="single"/>
-                        </w:rPr>
-                        <w:t xml:space="preserve">{{disposal}}</w:t>
-                      </w:r>
-                      <w:r>
-                        <w:rPr>
-                          <w:rFonts w:ascii="Zetta Serif Book" w:hAnsi="Zetta Serif Book"/>
-                          <w:color w:val="404040" w:themeColor="text1" w:themeTint="BF"/>
-                          <w:sz w:val="16"/>
-                          <w:szCs w:val="16"/>
-                          <w:u w:val="single"/>
-                        </w:rPr>
-                        <w:t>.</w:t>
-                      </w:r>
-                    </w:p>
-                    <w:p>
-                      <w:pPr>
-                        <w:pStyle w:val="ListParagraph"/>
-                        <w:tabs>
-                          <w:tab w:val="left" w:pos="1080"/>
-                        </w:tabs>
-                        <w:spacing w:line="276" w:lineRule="auto"/>
-                        <w:ind w:left="288"/>
-                        <w:rPr>
-                          <w:rFonts w:ascii="Zetta Serif Book" w:hAnsi="Zetta Serif Book"/>
-                          <w:color w:val="404040" w:themeColor="text1" w:themeTint="BF"/>
-                          <w:sz w:val="16"/>
-                          <w:szCs w:val="16"/>
-                        </w:rPr>
-                      </w:pPr>
-                      <w:r>
-                        <w:rPr>
-                          <w:rFonts w:ascii="Zetta Serif Book" w:hAnsi="Zetta Serif Book"/>
-                          <w:color w:val="404040" w:themeColor="text1" w:themeTint="BF"/>
-                          <w:sz w:val="16"/>
-                          <w:szCs w:val="16"/>
-                        </w:rPr>
-                        <w:tab/>
-                      </w:r>
-                      <w:r>
-                        <w:rPr>
-                          <w:rFonts w:ascii="Zetta Serif Book" w:hAnsi="Zetta Serif Book"/>
-                          <w:color w:val="404040" w:themeColor="text1" w:themeTint="BF"/>
-                          <w:sz w:val="16"/>
-                          <w:szCs w:val="16"/>
-                        </w:rPr>
-                        <w:t>Prepare</w:t>
-                      </w:r>
-                      <w:r>
-                        <w:rPr>
-                          <w:rFonts w:ascii="Zetta Serif Book" w:hAnsi="Zetta Serif Book"/>
-                          <w:b/>
-                          <w:color w:val="404040" w:themeColor="text1" w:themeTint="BF"/>
-                          <w:sz w:val="16"/>
-                          <w:szCs w:val="16"/>
-                        </w:rPr>
-                        <w:t xml:space="preserve"> </w:t>
-                      </w:r>
-                      <w:r>
-                        <w:rPr>
-                          <w:rFonts w:ascii="Zetta Serif Book" w:hAnsi="Zetta Serif Book"/>
-                          <w:color w:val="404040" w:themeColor="text1" w:themeTint="BF"/>
-                          <w:sz w:val="16"/>
-                          <w:szCs w:val="16"/>
-                        </w:rPr>
-                        <w:t>substrate surface profile utilizing mechanical means (grinding or shot blasting)</w:t>
-                      </w:r>
-                    </w:p>
-                    <w:p>
-                      <w:pPr>
-                        <w:tabs>
-                          <w:tab w:val="left" w:pos="1080"/>
-                        </w:tabs>
-                        <w:spacing w:line="276" w:lineRule="auto"/>
-                        <w:ind w:left="1080"/>
-                        <w:rPr>
-                          <w:rFonts w:ascii="Zetta Serif Book" w:hAnsi="Zetta Serif Book"/>
-                          <w:color w:val="404040" w:themeColor="text1" w:themeTint="BF"/>
-                          <w:sz w:val="16"/>
-                          <w:szCs w:val="16"/>
-                        </w:rPr>
-                      </w:pPr>
-                      <w:r>
-                        <w:rPr>
-                          <w:rFonts w:ascii="Zetta Serif Book" w:hAnsi="Zetta Serif Book"/>
-                          <w:color w:val="404040" w:themeColor="text1" w:themeTint="BF"/>
-                          <w:sz w:val="16"/>
-                          <w:szCs w:val="16"/>
-                        </w:rPr>
-                        <w:t>Prep substrate cracks and</w:t>
-                      </w:r>
-                      <w:r>
-                        <w:rPr>
-                          <w:rFonts w:ascii="Zetta Serif Book" w:hAnsi="Zetta Serif Book"/>
-                          <w:color w:val="404040" w:themeColor="text1" w:themeTint="BF"/>
-                          <w:sz w:val="16"/>
-                          <w:szCs w:val="16"/>
-                        </w:rPr>
-                        <w:t xml:space="preserve"> non-moving</w:t>
-                      </w:r>
-                      <w:r>
-                        <w:rPr>
-                          <w:rFonts w:ascii="Zetta Serif Book" w:hAnsi="Zetta Serif Book"/>
-                          <w:color w:val="404040" w:themeColor="text1" w:themeTint="BF"/>
-                          <w:sz w:val="16"/>
-                          <w:szCs w:val="16"/>
-                        </w:rPr>
-                        <w:t xml:space="preserve"> joints (includes minor floor prep</w:t>
-                      </w:r>
-                      <w:r>
-                        <w:rPr>
-                          <w:rFonts w:ascii="Zetta Serif Book" w:hAnsi="Zetta Serif Book"/>
-                          <w:color w:val="404040" w:themeColor="text1" w:themeTint="BF"/>
-                          <w:sz w:val="16"/>
-                          <w:szCs w:val="16"/>
-                        </w:rPr>
-                        <w:t>, patching of minor substrate defects</w:t>
-                      </w:r>
-                      <w:r>
-                        <w:rPr>
-                          <w:rFonts w:ascii="Zetta Serif Book" w:hAnsi="Zetta Serif Book"/>
-                          <w:color w:val="404040" w:themeColor="text1" w:themeTint="BF"/>
-                          <w:sz w:val="16"/>
-                          <w:szCs w:val="16"/>
-                        </w:rPr>
-                        <w:t xml:space="preserve">, </w:t>
-                      </w:r>
-                      <w:r>
-                        <w:rPr>
-                          <w:rFonts w:ascii="Zetta Serif Book" w:hAnsi="Zetta Serif Book"/>
-                          <w:color w:val="404040" w:themeColor="text1" w:themeTint="BF"/>
-                          <w:sz w:val="16"/>
-                          <w:szCs w:val="16"/>
-                        </w:rPr>
-                        <w:t>spalls and divots</w:t>
-                      </w:r>
-                      <w:r>
-                        <w:rPr>
-                          <w:rFonts w:ascii="Zetta Serif Book" w:hAnsi="Zetta Serif Book"/>
-                          <w:color w:val="404040" w:themeColor="text1" w:themeTint="BF"/>
-                          <w:sz w:val="16"/>
-                          <w:szCs w:val="16"/>
-                        </w:rPr>
-                        <w:t>)</w:t>
-                      </w:r>
-                      <w:r>
-                        <w:rPr>
-                          <w:rFonts w:ascii="Zetta Serif Book" w:hAnsi="Zetta Serif Book"/>
-                          <w:color w:val="404040" w:themeColor="text1" w:themeTint="BF"/>
-                          <w:sz w:val="16"/>
-                          <w:szCs w:val="16"/>
-                        </w:rPr>
-                        <w:t xml:space="preserve">. Excessive patching once the substrate is exposed could result in a change order. </w:t>
-                      </w:r>
-                    </w:p>
-                    <w:p>
-                      <w:pPr>
-                        <w:pStyle w:val="ListParagraph"/>
-                        <w:tabs>
-                          <w:tab w:val="left" w:pos="1080"/>
-                        </w:tabs>
-                        <w:spacing w:line="276" w:lineRule="auto"/>
-                        <w:ind w:left="288"/>
-                        <w:rPr>
-                          <w:rFonts w:ascii="Zetta Serif Book" w:hAnsi="Zetta Serif Book"/>
-                          <w:color w:val="404040" w:themeColor="text1" w:themeTint="BF"/>
-                          <w:sz w:val="16"/>
-                          <w:szCs w:val="16"/>
-                        </w:rPr>
-                      </w:pPr>
-                      <w:r>
-                        <w:rPr>
-                          <w:rFonts w:ascii="Zetta Serif Book" w:hAnsi="Zetta Serif Book"/>
-                          <w:color w:val="404040" w:themeColor="text1" w:themeTint="BF"/>
-                          <w:sz w:val="16"/>
-                          <w:szCs w:val="16"/>
-                        </w:rPr>
-                        <w:tab/>
-                        <w:t xml:space="preserve">Install </w:t>
-                      </w:r>
-                      <w:r>
-                        <w:rPr>
-                          <w:rFonts w:ascii="Zetta Serif Book" w:hAnsi="Zetta Serif Book"/>
-                          <w:color w:val="404040" w:themeColor="text1" w:themeTint="BF"/>
-                          <w:sz w:val="16"/>
-                          <w:szCs w:val="16"/>
-                        </w:rPr>
-                        <w:t>Epoxy</w:t>
-                      </w:r>
-                      <w:r>
-                        <w:rPr>
-                          <w:rFonts w:ascii="Zetta Serif Book" w:hAnsi="Zetta Serif Book"/>
-                          <w:color w:val="404040" w:themeColor="text1" w:themeTint="BF"/>
-                          <w:sz w:val="16"/>
-                          <w:szCs w:val="16"/>
-                        </w:rPr>
-                        <w:t xml:space="preserve"> System </w:t>
-                      </w:r>
-                    </w:p>
-                    <w:p>
-                      <w:pPr>
-                        <w:pStyle w:val="ListParagraph"/>
-                        <w:tabs>
-                          <w:tab w:val="left" w:pos="1080"/>
-                        </w:tabs>
-                        <w:spacing w:line="276" w:lineRule="auto"/>
-                        <w:ind w:left="288"/>
-                        <w:rPr>
-                          <w:rFonts w:ascii="Zetta Serif Book" w:hAnsi="Zetta Serif Book"/>
-                          <w:color w:val="404040" w:themeColor="text1" w:themeTint="BF"/>
-                          <w:sz w:val="16"/>
-                          <w:szCs w:val="16"/>
-                        </w:rPr>
-                      </w:pPr>
-                      <w:r>
-                        <w:rPr>
-                          <w:rFonts w:ascii="Zetta Serif Book" w:hAnsi="Zetta Serif Book"/>
-                          <w:color w:val="404040" w:themeColor="text1" w:themeTint="BF"/>
-                          <w:sz w:val="16"/>
-                          <w:szCs w:val="16"/>
-                        </w:rPr>
-                        <w:tab/>
-                        <w:t>Assumes installation over: clean, sound &amp; solid concrete substrate</w:t>
+                        <w:t xml:space="preserve">  {{scope_notes}}</w:t>
                       </w:r>
                     </w:p>
                     <w:p>
@@ -4640,27 +4108,6 @@
                           <w:p>
                             <w:pPr>
                               <w:spacing w:line="300" w:lineRule="auto"/>
-                              <w:ind w:left="288"/>
-                              <w:rPr>
-                                <w:rFonts w:ascii="Zetta Serif Book" w:hAnsi="Zetta Serif Book"/>
-                                <w:color w:val="404040" w:themeColor="text1" w:themeTint="BF"/>
-                                <w:sz w:val="18"/>
-                                <w:szCs w:val="18"/>
-                              </w:rPr>
-                            </w:pPr>
-                            <w:r>
-                              <w:rPr>
-                                <w:rFonts w:ascii="Zetta Serif Book" w:hAnsi="Zetta Serif Book"/>
-                                <w:color w:val="404040" w:themeColor="text1" w:themeTint="BF"/>
-                                <w:sz w:val="18"/>
-                                <w:szCs w:val="18"/>
-                              </w:rPr>
-                              <w:t xml:space="preserve">Add Option: $500- Treadwell Epoxy Cleaning Demonstration (within one hour of KC).  Demonstration includes a gallon of cleaner and a step by step demonstration on caring for your new floors. </w:t>
-                            </w:r>
-                          </w:p>
-                          <w:p>
-                            <w:pPr>
-                              <w:spacing w:line="300" w:lineRule="auto"/>
                               <w:rPr>
                                 <w:rFonts w:ascii="Zetta Serif Book" w:hAnsi="Zetta Serif Book"/>
                                 <w:color w:val="404040" w:themeColor="text1" w:themeTint="BF"/>
@@ -5793,27 +5240,6 @@
                           <w:szCs w:val="18"/>
                         </w:rPr>
                       </w:pPr>
-                    </w:p>
-                    <w:p>
-                      <w:pPr>
-                        <w:spacing w:line="300" w:lineRule="auto"/>
-                        <w:ind w:left="288"/>
-                        <w:rPr>
-                          <w:rFonts w:ascii="Zetta Serif Book" w:hAnsi="Zetta Serif Book"/>
-                          <w:color w:val="404040" w:themeColor="text1" w:themeTint="BF"/>
-                          <w:sz w:val="18"/>
-                          <w:szCs w:val="18"/>
-                        </w:rPr>
-                      </w:pPr>
-                      <w:r>
-                        <w:rPr>
-                          <w:rFonts w:ascii="Zetta Serif Book" w:hAnsi="Zetta Serif Book"/>
-                          <w:color w:val="404040" w:themeColor="text1" w:themeTint="BF"/>
-                          <w:sz w:val="18"/>
-                          <w:szCs w:val="18"/>
-                        </w:rPr>
-                        <w:t xml:space="preserve">Add Option: $500- Treadwell Epoxy Cleaning Demonstration (within one hour of KC).  Demonstration includes a gallon of cleaner and a step by step demonstration on caring for your new floors. </w:t>
-                      </w:r>
                     </w:p>
                     <w:p>
                       <w:pPr>

</xml_diff>

<commit_message>
fix(proposal): exclusions now carries to the doc; remodel tax loses the state name
Kyle feedback:
- Exclusions edits never reached the Word doc — the Exclusions text was HARDCODED
  boilerplate in the templates (no token). Tokenized to {{exclusions}} in all three
  Direct templates (epoxy/combo/polish, both txbx copies); backend backfills the
  standard list when blank so the token never renders literally.
- Remodel tax was labeled "Kansas/Missouri Remodel Tax" — dropped the state name
  to just "Remodel Tax" in the templates ({{#remodel}} + {{#alternate}} lines) and
  in main._build_options.

Tests: +exclusions-carries, +remodel-label-no-state; existing template/room tests
updated. 169 backend tests pass.

Co-Authored-By: Claude Opus 4.8 <noreply@anthropic.com>
</commit_message>
<xml_diff>
--- a/backend/templates/Direct/XX.XX TREADWELL EPOXY PROPOSAL - New Direct.docx
+++ b/backend/templates/Direct/XX.XX TREADWELL EPOXY PROPOSAL - New Direct.docx
@@ -1180,7 +1180,7 @@
                                 <w:sz w:val="16"/>
                                 <w:szCs w:val="16"/>
                               </w:rPr>
-                              <w:t xml:space="preserve">  </w:t>
+                              <w:t xml:space="preserve">  {{exclusions}}</w:t>
                             </w:r>
                             <w:r>
                               <w:rPr>
@@ -1189,7 +1189,7 @@
                                 <w:sz w:val="16"/>
                                 <w:szCs w:val="16"/>
                               </w:rPr>
-                              <w:t xml:space="preserve">Multiple layers of floor to be removed (change order is necessary), </w:t>
+                              <w:t xml:space="preserve"/>
                             </w:r>
                             <w:r>
                               <w:rPr>
@@ -1198,7 +1198,7 @@
                                 <w:sz w:val="16"/>
                                 <w:szCs w:val="16"/>
                               </w:rPr>
-                              <w:t>Moving of Furniture/Fixtures, Touch-Up Paint,</w:t>
+                              <w:t/>
                             </w:r>
                             <w:r>
                               <w:rPr>
@@ -1207,7 +1207,7 @@
                                 <w:sz w:val="16"/>
                                 <w:szCs w:val="16"/>
                               </w:rPr>
-                              <w:t xml:space="preserve"> </w:t>
+                              <w:t xml:space="preserve"/>
                             </w:r>
                             <w:r>
                               <w:rPr>
@@ -1216,7 +1216,7 @@
                                 <w:sz w:val="16"/>
                                 <w:szCs w:val="16"/>
                               </w:rPr>
-                              <w:t>Excessive Patching (i.e.</w:t>
+                              <w:t/>
                             </w:r>
                             <w:r>
                               <w:rPr>
@@ -1225,7 +1225,7 @@
                                 <w:sz w:val="16"/>
                                 <w:szCs w:val="16"/>
                               </w:rPr>
-                              <w:t>,</w:t>
+                              <w:t/>
                             </w:r>
                             <w:r>
                               <w:rPr>
@@ -1234,7 +1234,7 @@
                                 <w:sz w:val="16"/>
                                 <w:szCs w:val="16"/>
                               </w:rPr>
-                              <w:t xml:space="preserve"> skim coating &amp; more than 1 bag of patch material per 1,000 sf</w:t>
+                              <w:t xml:space="preserve"/>
                             </w:r>
                             <w:r>
                               <w:rPr>
@@ -1243,7 +1243,7 @@
                                 <w:sz w:val="16"/>
                                 <w:szCs w:val="16"/>
                               </w:rPr>
-                              <w:t>, see notes below</w:t>
+                              <w:t/>
                             </w:r>
                             <w:r>
                               <w:rPr>
@@ -1252,7 +1252,7 @@
                                 <w:sz w:val="16"/>
                                 <w:szCs w:val="16"/>
                               </w:rPr>
-                              <w:t>)</w:t>
+                              <w:t/>
                             </w:r>
                             <w:r>
                               <w:rPr>
@@ -1261,16 +1261,16 @@
                                 <w:sz w:val="16"/>
                                 <w:szCs w:val="16"/>
                               </w:rPr>
-                              <w:t>, Demo of Existing Floor/Glue/Etc., Weekend or night</w:t>
-                            </w:r>
-                            <w:r>
-                              <w:rPr>
-                                <w:rFonts w:ascii="Zetta Serif Book" w:hAnsi="Zetta Serif Book"/>
-                                <w:color w:val="404040" w:themeColor="text1" w:themeTint="BF"/>
-                                <w:sz w:val="18"/>
-                                <w:szCs w:val="18"/>
-                              </w:rPr>
-                              <w:t xml:space="preserve"> </w:t>
+                              <w:t/>
+                            </w:r>
+                            <w:r>
+                              <w:rPr>
+                                <w:rFonts w:ascii="Zetta Serif Book" w:hAnsi="Zetta Serif Book"/>
+                                <w:color w:val="404040" w:themeColor="text1" w:themeTint="BF"/>
+                                <w:sz w:val="18"/>
+                                <w:szCs w:val="18"/>
+                              </w:rPr>
+                              <w:t xml:space="preserve"/>
                             </w:r>
                             <w:r>
                               <w:rPr>
@@ -1279,7 +1279,7 @@
                                 <w:sz w:val="16"/>
                                 <w:szCs w:val="16"/>
                               </w:rPr>
-                              <w:t>work</w:t>
+                              <w:t/>
                             </w:r>
                             <w:r>
                               <w:rPr>
@@ -1288,7 +1288,7 @@
                                 <w:sz w:val="16"/>
                                 <w:szCs w:val="16"/>
                               </w:rPr>
-                              <w:t>, Credit for Unused mobilizations</w:t>
+                              <w:t/>
                             </w:r>
                           </w:p>
                           <w:p>
@@ -1841,7 +1841,7 @@
                           <w:sz w:val="16"/>
                           <w:szCs w:val="16"/>
                         </w:rPr>
-                        <w:t xml:space="preserve">  </w:t>
+                        <w:t xml:space="preserve">  {{exclusions}}</w:t>
                       </w:r>
                       <w:r>
                         <w:rPr>
@@ -1850,7 +1850,7 @@
                           <w:sz w:val="16"/>
                           <w:szCs w:val="16"/>
                         </w:rPr>
-                        <w:t xml:space="preserve">Multiple layers of floor to be removed (change order is necessary), </w:t>
+                        <w:t xml:space="preserve"/>
                       </w:r>
                       <w:r>
                         <w:rPr>
@@ -1859,7 +1859,7 @@
                           <w:sz w:val="16"/>
                           <w:szCs w:val="16"/>
                         </w:rPr>
-                        <w:t>Moving of Furniture/Fixtures, Touch-Up Paint,</w:t>
+                        <w:t/>
                       </w:r>
                       <w:r>
                         <w:rPr>
@@ -1868,7 +1868,7 @@
                           <w:sz w:val="16"/>
                           <w:szCs w:val="16"/>
                         </w:rPr>
-                        <w:t xml:space="preserve"> </w:t>
+                        <w:t xml:space="preserve"/>
                       </w:r>
                       <w:r>
                         <w:rPr>
@@ -1877,7 +1877,7 @@
                           <w:sz w:val="16"/>
                           <w:szCs w:val="16"/>
                         </w:rPr>
-                        <w:t>Excessive Patching (i.e.</w:t>
+                        <w:t/>
                       </w:r>
                       <w:r>
                         <w:rPr>
@@ -1886,7 +1886,7 @@
                           <w:sz w:val="16"/>
                           <w:szCs w:val="16"/>
                         </w:rPr>
-                        <w:t>,</w:t>
+                        <w:t/>
                       </w:r>
                       <w:r>
                         <w:rPr>
@@ -1895,7 +1895,7 @@
                           <w:sz w:val="16"/>
                           <w:szCs w:val="16"/>
                         </w:rPr>
-                        <w:t xml:space="preserve"> skim coating &amp; more than 1 bag of patch material per 1,000 sf</w:t>
+                        <w:t xml:space="preserve"/>
                       </w:r>
                       <w:r>
                         <w:rPr>
@@ -1904,7 +1904,7 @@
                           <w:sz w:val="16"/>
                           <w:szCs w:val="16"/>
                         </w:rPr>
-                        <w:t>, see notes below</w:t>
+                        <w:t/>
                       </w:r>
                       <w:r>
                         <w:rPr>
@@ -1913,7 +1913,7 @@
                           <w:sz w:val="16"/>
                           <w:szCs w:val="16"/>
                         </w:rPr>
-                        <w:t>)</w:t>
+                        <w:t/>
                       </w:r>
                       <w:r>
                         <w:rPr>
@@ -1922,16 +1922,16 @@
                           <w:sz w:val="16"/>
                           <w:szCs w:val="16"/>
                         </w:rPr>
-                        <w:t>, Demo of Existing Floor/Glue/Etc., Weekend or night</w:t>
-                      </w:r>
-                      <w:r>
-                        <w:rPr>
-                          <w:rFonts w:ascii="Zetta Serif Book" w:hAnsi="Zetta Serif Book"/>
-                          <w:color w:val="404040" w:themeColor="text1" w:themeTint="BF"/>
-                          <w:sz w:val="18"/>
-                          <w:szCs w:val="18"/>
-                        </w:rPr>
-                        <w:t xml:space="preserve"> </w:t>
+                        <w:t/>
+                      </w:r>
+                      <w:r>
+                        <w:rPr>
+                          <w:rFonts w:ascii="Zetta Serif Book" w:hAnsi="Zetta Serif Book"/>
+                          <w:color w:val="404040" w:themeColor="text1" w:themeTint="BF"/>
+                          <w:sz w:val="18"/>
+                          <w:szCs w:val="18"/>
+                        </w:rPr>
+                        <w:t xml:space="preserve"/>
                       </w:r>
                       <w:r>
                         <w:rPr>
@@ -1940,7 +1940,7 @@
                           <w:sz w:val="16"/>
                           <w:szCs w:val="16"/>
                         </w:rPr>
-                        <w:t>work</w:t>
+                        <w:t/>
                       </w:r>
                       <w:r>
                         <w:rPr>
@@ -1949,7 +1949,7 @@
                           <w:sz w:val="16"/>
                           <w:szCs w:val="16"/>
                         </w:rPr>
-                        <w:t>, Credit for Unused mobilizations</w:t>
+                        <w:t/>
                       </w:r>
                     </w:p>
                     <w:p>
@@ -4073,7 +4073,7 @@
                                 <w:highlight w:val="yellow"/>
                                 <w:u w:val="single"/>
                               </w:rPr>
-                              <w:t xml:space="preserve">{{remodel.amount_formatted}} – Kansas Remodel Tax</w:t>
+                              <w:t xml:space="preserve">{{remodel.amount_formatted}} – Remodel Tax</w:t>
                             </w:r>
                             <w:r>
                               <w:rPr>
@@ -4535,7 +4535,7 @@
                                 <w:sz w:val="18"/>
                                 <w:szCs w:val="18"/>
                               </w:rPr>
-                              <w:t xml:space="preserve">{{alternate.remodel_tax}} – Kansas Remodel Tax</w:t>
+                              <w:t xml:space="preserve">{{alternate.remodel_tax}} – Remodel Tax</w:t>
                             </w:r>
                           </w:p>
                           <w:p>
@@ -5696,7 +5696,7 @@
                           <w:highlight w:val="yellow"/>
                           <w:u w:val="single"/>
                         </w:rPr>
-                        <w:t xml:space="preserve">{{remodel.amount_formatted}} – Kansas Remodel Tax</w:t>
+                        <w:t xml:space="preserve">{{remodel.amount_formatted}} – Remodel Tax</w:t>
                       </w:r>
                       <w:r>
                         <w:rPr>
@@ -6169,7 +6169,7 @@
                           <w:sz w:val="18"/>
                           <w:szCs w:val="18"/>
                         </w:rPr>
-                        <w:t xml:space="preserve">{{alternate.remodel_tax}} – Kansas Remodel Tax</w:t>
+                        <w:t xml:space="preserve">{{alternate.remodel_tax}} – Remodel Tax</w:t>
                       </w:r>
                     </w:p>
                     <w:p>

</xml_diff>

<commit_message>
fix(proposal): no-site-visit + tax-exempt wording (epoxy)
Kyle feedback (#3, #4):
- #4 No site visit: epoxy template's "per site visit on {{site_visit_date}}" is now
  {{site_visit_phrase}}. Backend prints "per plans and specifications provided" when
  the "No site visit" checkbox is on OR the date is blank/N/A (no more "per site
  visit on N/A"); otherwise "per site visit on <date>". New checkbox on Proposal Review.
- #3 Tax-exempt: epoxy single-bid "(material sales tax INCLUDED)" is now
  {{base_tax_phrase}} — "(tax exempt)" when the job is marked excluded/exempt,
  "(Remodel Tax AND material sales tax INCLUDED)" when remodel applies, else
  "(material sales tax INCLUDED)".

(Polish/combo still use the prior phrasing — their lines split across runs; will
extend next. Tokens are backfilled so nothing ever renders literally.) 170 tests pass.

Co-Authored-By: Claude Opus 4.8 <noreply@anthropic.com>
</commit_message>
<xml_diff>
--- a/backend/templates/Direct/XX.XX TREADWELL EPOXY PROPOSAL - New Direct.docx
+++ b/backend/templates/Direct/XX.XX TREADWELL EPOXY PROPOSAL - New Direct.docx
@@ -763,7 +763,7 @@
                                 <w:szCs w:val="16"/>
                                 <w:u w:val="single"/>
                               </w:rPr>
-                              <w:t xml:space="preserve">Epoxy Flooring: per site visit on {{site_visit_date}}</w:t>
+                              <w:t xml:space="preserve">Epoxy Flooring: {{site_visit_phrase}}</w:t>
                             </w:r>
                             <w:r>
                               <w:rPr>
@@ -1414,7 +1414,7 @@
                           <w:szCs w:val="16"/>
                           <w:u w:val="single"/>
                         </w:rPr>
-                        <w:t xml:space="preserve">Epoxy Flooring: per site visit on {{site_visit_date}}</w:t>
+                        <w:t xml:space="preserve">Epoxy Flooring: {{site_visit_phrase}}</w:t>
                       </w:r>
                       <w:r>
                         <w:rPr>
@@ -3753,7 +3753,7 @@
                                 <w:sz w:val="18"/>
                                 <w:szCs w:val="18"/>
                               </w:rPr>
-                              <w:t xml:space="preserve">{{base_bid_formatted}} – Epoxy flooring as described above (material sales tax INCLUDED)</w:t>
+                              <w:t xml:space="preserve">{{base_bid_formatted}} – Epoxy flooring as described above {{base_tax_phrase}}</w:t>
                             </w:r>
                             <w:proofErr w:type="spellStart"/>
                             <w:r>
@@ -5376,7 +5376,7 @@
                           <w:sz w:val="18"/>
                           <w:szCs w:val="18"/>
                         </w:rPr>
-                        <w:t xml:space="preserve">{{base_bid_formatted}} – Epoxy flooring as described above (material sales tax INCLUDED)</w:t>
+                        <w:t xml:space="preserve">{{base_bid_formatted}} – Epoxy flooring as described above {{base_tax_phrase}}</w:t>
                       </w:r>
                       <w:proofErr w:type="spellStart"/>
                       <w:r>

</xml_diff>

<commit_message>
fix(proposal): make the NOTES section editable (#6)
The bottom NOTES bullets were hardcoded in all three templates — Kyle had nowhere
to edit them. Tokenized the notes textbox into an editable {{#notes}} repeatable
block (one bullet per item, both txbx copies). New "Notes" section on Proposal
Review: a textarea pre-filled (via GET /api/default-notes) with the standard
per-work-type notes — edit/add/remove, one per line. Backend _notes_for() falls
back to the standard boilerplate (backend/default_notes.json) when blank so the
notes never vanish. 171 backend tests pass.

Co-Authored-By: Claude Opus 4.8 <noreply@anthropic.com>
</commit_message>
<xml_diff>
--- a/backend/templates/Direct/XX.XX TREADWELL EPOXY PROPOSAL - New Direct.docx
+++ b/backend/templates/Direct/XX.XX TREADWELL EPOXY PROPOSAL - New Direct.docx
@@ -2110,7 +2110,7 @@
                                 <w:sz w:val="15"/>
                                 <w:szCs w:val="15"/>
                               </w:rPr>
-                              <w:t xml:space="preserve">Excludes saw cutting, conc. repair/leveling, sloping, abatement </w:t>
+                              <w:t xml:space="preserve">{{#notes}}</w:t>
                             </w:r>
                           </w:p>
                           <w:p>
@@ -2133,7 +2133,7 @@
                                 <w:sz w:val="15"/>
                                 <w:szCs w:val="15"/>
                               </w:rPr>
-                              <w:t>Excludes warranty for floor failure due to hydrostatic pressure, vapor transmission, substrate failure or high salt content.</w:t>
+                              <w:t xml:space="preserve">{{notes.text}}</w:t>
                             </w:r>
                           </w:p>
                           <w:p>
@@ -2156,303 +2156,7 @@
                                 <w:sz w:val="15"/>
                                 <w:szCs w:val="15"/>
                               </w:rPr>
-                              <w:t xml:space="preserve">Treadwell includes the following insurance coverage: GL: 1M/2M, WC: 1M, Auto: 1M, </w:t>
-                            </w:r>
-                            <w:proofErr w:type="spellStart"/>
-                            <w:r>
-                              <w:rPr>
-                                <w:rFonts w:ascii="Zetta Serif Book" w:hAnsi="Zetta Serif Book"/>
-                                <w:sz w:val="15"/>
-                                <w:szCs w:val="15"/>
-                              </w:rPr>
-                              <w:t>Umb</w:t>
-                            </w:r>
-                            <w:proofErr w:type="spellEnd"/>
-                            <w:r>
-                              <w:rPr>
-                                <w:rFonts w:ascii="Zetta Serif Book" w:hAnsi="Zetta Serif Book"/>
-                                <w:sz w:val="15"/>
-                                <w:szCs w:val="15"/>
-                              </w:rPr>
-                              <w:t>: 5M. Additional coverage can be provided at an additional cost.</w:t>
-                            </w:r>
-                          </w:p>
-                          <w:p>
-                            <w:pPr>
-                              <w:pStyle w:val="ListParagraph"/>
-                              <w:numPr>
-                                <w:ilvl w:val="0"/>
-                                <w:numId w:val="1"/>
-                              </w:numPr>
-                              <w:spacing w:line="276" w:lineRule="auto"/>
-                              <w:rPr>
-                                <w:rFonts w:ascii="Zetta Serif Book" w:hAnsi="Zetta Serif Book"/>
-                                <w:sz w:val="15"/>
-                                <w:szCs w:val="15"/>
-                              </w:rPr>
-                            </w:pPr>
-                            <w:r>
-                              <w:rPr>
-                                <w:rFonts w:ascii="Zetta Serif Book" w:hAnsi="Zetta Serif Book"/>
-                                <w:sz w:val="15"/>
-                                <w:szCs w:val="15"/>
-                              </w:rPr>
-                              <w:t>Treadwell is not responsible for wear &amp; tear to existing finishes resulting from flooring installation.</w:t>
-                            </w:r>
-                          </w:p>
-                          <w:p>
-                            <w:pPr>
-                              <w:pStyle w:val="ListParagraph"/>
-                              <w:numPr>
-                                <w:ilvl w:val="0"/>
-                                <w:numId w:val="1"/>
-                              </w:numPr>
-                              <w:spacing w:line="276" w:lineRule="auto"/>
-                              <w:rPr>
-                                <w:rFonts w:ascii="Zetta Serif Book" w:hAnsi="Zetta Serif Book"/>
-                                <w:sz w:val="15"/>
-                                <w:szCs w:val="15"/>
-                              </w:rPr>
-                            </w:pPr>
-                            <w:r>
-                              <w:rPr>
-                                <w:rFonts w:ascii="Zetta Serif Book" w:hAnsi="Zetta Serif Book"/>
-                                <w:sz w:val="15"/>
-                                <w:szCs w:val="15"/>
-                              </w:rPr>
-                              <w:t>Treadwell reserves the right to terminate the contract for customers not meeting Treadwell's pre-qual. requirements.</w:t>
-                            </w:r>
-                          </w:p>
-                          <w:p>
-                            <w:pPr>
-                              <w:pStyle w:val="ListParagraph"/>
-                              <w:numPr>
-                                <w:ilvl w:val="0"/>
-                                <w:numId w:val="1"/>
-                              </w:numPr>
-                              <w:spacing w:line="288" w:lineRule="auto"/>
-                              <w:rPr>
-                                <w:rFonts w:ascii="Zetta Serif Book" w:hAnsi="Zetta Serif Book"/>
-                                <w:sz w:val="15"/>
-                                <w:szCs w:val="15"/>
-                              </w:rPr>
-                            </w:pPr>
-                            <w:r>
-                              <w:rPr>
-                                <w:rFonts w:ascii="Zetta Serif Book" w:hAnsi="Zetta Serif Book"/>
-                                <w:sz w:val="15"/>
-                                <w:szCs w:val="15"/>
-                              </w:rPr>
-                              <w:t>Proposal valid for 30 days. The attached “Terms and Conditions” are part of this proposal/contract.</w:t>
-                            </w:r>
-                          </w:p>
-                          <w:p>
-                            <w:pPr>
-                              <w:pStyle w:val="ListParagraph"/>
-                              <w:numPr>
-                                <w:ilvl w:val="0"/>
-                                <w:numId w:val="1"/>
-                              </w:numPr>
-                              <w:spacing w:line="276" w:lineRule="auto"/>
-                              <w:rPr>
-                                <w:rFonts w:ascii="Zetta Serif Book" w:hAnsi="Zetta Serif Book"/>
-                                <w:sz w:val="15"/>
-                                <w:szCs w:val="15"/>
-                              </w:rPr>
-                            </w:pPr>
-                            <w:r>
-                              <w:rPr>
-                                <w:rFonts w:ascii="Zetta Serif Book" w:hAnsi="Zetta Serif Book"/>
-                                <w:sz w:val="15"/>
-                                <w:szCs w:val="15"/>
-                              </w:rPr>
-                              <w:t xml:space="preserve">Add </w:t>
-                            </w:r>
-                            <w:r>
-                              <w:rPr>
-                                <w:rFonts w:ascii="Zetta Serif Book" w:hAnsi="Zetta Serif Book"/>
-                                <w:sz w:val="15"/>
-                                <w:szCs w:val="15"/>
-                                <w:highlight w:val="cyan"/>
-                              </w:rPr>
-                              <w:t>$</w:t>
-                            </w:r>
-                            <w:proofErr w:type="spellStart"/>
-                            <w:r>
-                              <w:rPr>
-                                <w:rFonts w:ascii="Zetta Serif Book" w:hAnsi="Zetta Serif Book"/>
-                                <w:sz w:val="15"/>
-                                <w:szCs w:val="15"/>
-                                <w:highlight w:val="cyan"/>
-                              </w:rPr>
-                              <w:t>xxxx</w:t>
-                            </w:r>
-                            <w:proofErr w:type="spellEnd"/>
-                            <w:r>
-                              <w:rPr>
-                                <w:rFonts w:ascii="Zetta Serif Book" w:hAnsi="Zetta Serif Book"/>
-                                <w:sz w:val="15"/>
-                                <w:szCs w:val="15"/>
-                              </w:rPr>
-                              <w:t xml:space="preserve"> </w:t>
-                            </w:r>
-                            <w:r>
-                              <w:rPr>
-                                <w:rFonts w:ascii="Zetta Serif Book" w:hAnsi="Zetta Serif Book"/>
-                                <w:sz w:val="15"/>
-                                <w:szCs w:val="15"/>
-                              </w:rPr>
-                              <w:t>for each additional phase beyond the above stated schedule.</w:t>
-                            </w:r>
-                          </w:p>
-                          <w:p>
-                            <w:pPr>
-                              <w:pStyle w:val="ListParagraph"/>
-                              <w:numPr>
-                                <w:ilvl w:val="0"/>
-                                <w:numId w:val="1"/>
-                              </w:numPr>
-                              <w:spacing w:line="276" w:lineRule="auto"/>
-                              <w:rPr>
-                                <w:rFonts w:ascii="Zetta Serif Book" w:hAnsi="Zetta Serif Book"/>
-                                <w:sz w:val="15"/>
-                                <w:szCs w:val="15"/>
-                              </w:rPr>
-                            </w:pPr>
-                            <w:r>
-                              <w:rPr>
-                                <w:rFonts w:ascii="Zetta Serif Book" w:hAnsi="Zetta Serif Book"/>
-                                <w:sz w:val="15"/>
-                                <w:szCs w:val="15"/>
-                              </w:rPr>
-                              <w:t>Add $500 for show up time if crew mobilizes at agreed upon start date and time and job site is not ready.</w:t>
-                            </w:r>
-                          </w:p>
-                          <w:p>
-                            <w:pPr>
-                              <w:pStyle w:val="ListParagraph"/>
-                              <w:numPr>
-                                <w:ilvl w:val="0"/>
-                                <w:numId w:val="1"/>
-                              </w:numPr>
-                              <w:spacing w:line="276" w:lineRule="auto"/>
-                              <w:rPr>
-                                <w:rFonts w:ascii="Zetta Serif Book" w:hAnsi="Zetta Serif Book"/>
-                                <w:sz w:val="15"/>
-                                <w:szCs w:val="15"/>
-                              </w:rPr>
-                            </w:pPr>
-                            <w:r>
-                              <w:rPr>
-                                <w:rFonts w:ascii="Zetta Serif Book" w:hAnsi="Zetta Serif Book"/>
-                                <w:sz w:val="15"/>
-                                <w:szCs w:val="15"/>
-                              </w:rPr>
-                              <w:t>Add $500</w:t>
-                            </w:r>
-                            <w:r>
-                              <w:rPr>
-                                <w:rFonts w:ascii="Zetta Serif Book" w:hAnsi="Zetta Serif Book"/>
-                                <w:sz w:val="15"/>
-                                <w:szCs w:val="15"/>
-                              </w:rPr>
-                              <w:t>/ hour</w:t>
-                            </w:r>
-                            <w:r>
-                              <w:rPr>
-                                <w:rFonts w:ascii="Zetta Serif Book" w:hAnsi="Zetta Serif Book"/>
-                                <w:sz w:val="15"/>
-                                <w:szCs w:val="15"/>
-                              </w:rPr>
-                              <w:t xml:space="preserve"> for stand down time if crew is onsite working and crew is stopped </w:t>
-                            </w:r>
-                            <w:r>
-                              <w:rPr>
-                                <w:rFonts w:ascii="Zetta Serif Book" w:hAnsi="Zetta Serif Book"/>
-                                <w:sz w:val="15"/>
-                                <w:szCs w:val="15"/>
-                              </w:rPr>
-                              <w:t>for a reason outside of Treadwell’s control.</w:t>
-                            </w:r>
-                          </w:p>
-                          <w:p>
-                            <w:pPr>
-                              <w:pStyle w:val="ListParagraph"/>
-                              <w:numPr>
-                                <w:ilvl w:val="0"/>
-                                <w:numId w:val="1"/>
-                              </w:numPr>
-                              <w:spacing w:line="288" w:lineRule="auto"/>
-                              <w:rPr>
-                                <w:rFonts w:ascii="Zetta Serif Book" w:hAnsi="Zetta Serif Book"/>
-                                <w:b/>
-                                <w:sz w:val="16"/>
-                                <w:szCs w:val="16"/>
-                              </w:rPr>
-                            </w:pPr>
-                            <w:r>
-                              <w:rPr>
-                                <w:rFonts w:ascii="Zetta Serif Book" w:hAnsi="Zetta Serif Book"/>
-                                <w:b/>
-                                <w:sz w:val="16"/>
-                                <w:szCs w:val="16"/>
-                                <w:highlight w:val="yellow"/>
-                              </w:rPr>
-                              <w:t>Typical installation lead time is 5 weeks from the date signed proposal and deposit are received</w:t>
-                            </w:r>
-                            <w:r>
-                              <w:rPr>
-                                <w:rFonts w:ascii="Zetta Serif Book" w:hAnsi="Zetta Serif Book"/>
-                                <w:b/>
-                                <w:sz w:val="16"/>
-                                <w:szCs w:val="16"/>
-                              </w:rPr>
-                              <w:t xml:space="preserve">.  </w:t>
-                            </w:r>
-                          </w:p>
-                          <w:p>
-                            <w:pPr>
-                              <w:spacing w:line="288" w:lineRule="auto"/>
-                              <w:rPr>
-                                <w:rFonts w:ascii="Zetta Serif Book" w:hAnsi="Zetta Serif Book"/>
-                                <w:sz w:val="15"/>
-                                <w:szCs w:val="15"/>
-                              </w:rPr>
-                            </w:pPr>
-                          </w:p>
-                          <w:p>
-                            <w:pPr>
-                              <w:pStyle w:val="ListParagraph"/>
-                              <w:numPr>
-                                <w:ilvl w:val="0"/>
-                                <w:numId w:val="1"/>
-                              </w:numPr>
-                              <w:spacing w:line="288" w:lineRule="auto"/>
-                              <w:rPr>
-                                <w:rFonts w:ascii="Zetta Serif Book" w:hAnsi="Zetta Serif Book"/>
-                                <w:b/>
-                                <w:sz w:val="16"/>
-                                <w:szCs w:val="16"/>
-                              </w:rPr>
-                            </w:pPr>
-                            <w:r>
-                              <w:rPr>
-                                <w:rFonts w:ascii="Zetta Serif Book" w:hAnsi="Zetta Serif Book"/>
-                                <w:b/>
-                                <w:sz w:val="16"/>
-                                <w:szCs w:val="16"/>
-                                <w:highlight w:val="yellow"/>
-                              </w:rPr>
-                              <w:t>Payment – 25% due prior to scheduling, balance payable 10 days after completion via check</w:t>
-                            </w:r>
-                            <w:r>
-                              <w:rPr>
-                                <w:rFonts w:ascii="Zetta Serif Book" w:hAnsi="Zetta Serif Book"/>
-                                <w:b/>
-                                <w:sz w:val="16"/>
-                                <w:szCs w:val="16"/>
-                              </w:rPr>
-                              <w:t>.</w:t>
+                              <w:t xml:space="preserve">{{/notes}}</w:t>
                             </w:r>
                           </w:p>
                           <w:p>
@@ -2577,7 +2281,7 @@
                           <w:sz w:val="15"/>
                           <w:szCs w:val="15"/>
                         </w:rPr>
-                        <w:t xml:space="preserve">Excludes saw cutting, conc. repair/leveling, sloping, abatement </w:t>
+                        <w:t xml:space="preserve">{{#notes}}</w:t>
                       </w:r>
                     </w:p>
                     <w:p>
@@ -2600,7 +2304,7 @@
                           <w:sz w:val="15"/>
                           <w:szCs w:val="15"/>
                         </w:rPr>
-                        <w:t>Excludes warranty for floor failure due to hydrostatic pressure, vapor transmission, substrate failure or high salt content.</w:t>
+                        <w:t xml:space="preserve">{{notes.text}}</w:t>
                       </w:r>
                     </w:p>
                     <w:p>
@@ -2623,303 +2327,7 @@
                           <w:sz w:val="15"/>
                           <w:szCs w:val="15"/>
                         </w:rPr>
-                        <w:t xml:space="preserve">Treadwell includes the following insurance coverage: GL: 1M/2M, WC: 1M, Auto: 1M, </w:t>
-                      </w:r>
-                      <w:proofErr w:type="spellStart"/>
-                      <w:r>
-                        <w:rPr>
-                          <w:rFonts w:ascii="Zetta Serif Book" w:hAnsi="Zetta Serif Book"/>
-                          <w:sz w:val="15"/>
-                          <w:szCs w:val="15"/>
-                        </w:rPr>
-                        <w:t>Umb</w:t>
-                      </w:r>
-                      <w:proofErr w:type="spellEnd"/>
-                      <w:r>
-                        <w:rPr>
-                          <w:rFonts w:ascii="Zetta Serif Book" w:hAnsi="Zetta Serif Book"/>
-                          <w:sz w:val="15"/>
-                          <w:szCs w:val="15"/>
-                        </w:rPr>
-                        <w:t>: 5M. Additional coverage can be provided at an additional cost.</w:t>
-                      </w:r>
-                    </w:p>
-                    <w:p>
-                      <w:pPr>
-                        <w:pStyle w:val="ListParagraph"/>
-                        <w:numPr>
-                          <w:ilvl w:val="0"/>
-                          <w:numId w:val="1"/>
-                        </w:numPr>
-                        <w:spacing w:line="276" w:lineRule="auto"/>
-                        <w:rPr>
-                          <w:rFonts w:ascii="Zetta Serif Book" w:hAnsi="Zetta Serif Book"/>
-                          <w:sz w:val="15"/>
-                          <w:szCs w:val="15"/>
-                        </w:rPr>
-                      </w:pPr>
-                      <w:r>
-                        <w:rPr>
-                          <w:rFonts w:ascii="Zetta Serif Book" w:hAnsi="Zetta Serif Book"/>
-                          <w:sz w:val="15"/>
-                          <w:szCs w:val="15"/>
-                        </w:rPr>
-                        <w:t>Treadwell is not responsible for wear &amp; tear to existing finishes resulting from flooring installation.</w:t>
-                      </w:r>
-                    </w:p>
-                    <w:p>
-                      <w:pPr>
-                        <w:pStyle w:val="ListParagraph"/>
-                        <w:numPr>
-                          <w:ilvl w:val="0"/>
-                          <w:numId w:val="1"/>
-                        </w:numPr>
-                        <w:spacing w:line="276" w:lineRule="auto"/>
-                        <w:rPr>
-                          <w:rFonts w:ascii="Zetta Serif Book" w:hAnsi="Zetta Serif Book"/>
-                          <w:sz w:val="15"/>
-                          <w:szCs w:val="15"/>
-                        </w:rPr>
-                      </w:pPr>
-                      <w:r>
-                        <w:rPr>
-                          <w:rFonts w:ascii="Zetta Serif Book" w:hAnsi="Zetta Serif Book"/>
-                          <w:sz w:val="15"/>
-                          <w:szCs w:val="15"/>
-                        </w:rPr>
-                        <w:t>Treadwell reserves the right to terminate the contract for customers not meeting Treadwell's pre-qual. requirements.</w:t>
-                      </w:r>
-                    </w:p>
-                    <w:p>
-                      <w:pPr>
-                        <w:pStyle w:val="ListParagraph"/>
-                        <w:numPr>
-                          <w:ilvl w:val="0"/>
-                          <w:numId w:val="1"/>
-                        </w:numPr>
-                        <w:spacing w:line="288" w:lineRule="auto"/>
-                        <w:rPr>
-                          <w:rFonts w:ascii="Zetta Serif Book" w:hAnsi="Zetta Serif Book"/>
-                          <w:sz w:val="15"/>
-                          <w:szCs w:val="15"/>
-                        </w:rPr>
-                      </w:pPr>
-                      <w:r>
-                        <w:rPr>
-                          <w:rFonts w:ascii="Zetta Serif Book" w:hAnsi="Zetta Serif Book"/>
-                          <w:sz w:val="15"/>
-                          <w:szCs w:val="15"/>
-                        </w:rPr>
-                        <w:t>Proposal valid for 30 days. The attached “Terms and Conditions” are part of this proposal/contract.</w:t>
-                      </w:r>
-                    </w:p>
-                    <w:p>
-                      <w:pPr>
-                        <w:pStyle w:val="ListParagraph"/>
-                        <w:numPr>
-                          <w:ilvl w:val="0"/>
-                          <w:numId w:val="1"/>
-                        </w:numPr>
-                        <w:spacing w:line="276" w:lineRule="auto"/>
-                        <w:rPr>
-                          <w:rFonts w:ascii="Zetta Serif Book" w:hAnsi="Zetta Serif Book"/>
-                          <w:sz w:val="15"/>
-                          <w:szCs w:val="15"/>
-                        </w:rPr>
-                      </w:pPr>
-                      <w:r>
-                        <w:rPr>
-                          <w:rFonts w:ascii="Zetta Serif Book" w:hAnsi="Zetta Serif Book"/>
-                          <w:sz w:val="15"/>
-                          <w:szCs w:val="15"/>
-                        </w:rPr>
-                        <w:t xml:space="preserve">Add </w:t>
-                      </w:r>
-                      <w:r>
-                        <w:rPr>
-                          <w:rFonts w:ascii="Zetta Serif Book" w:hAnsi="Zetta Serif Book"/>
-                          <w:sz w:val="15"/>
-                          <w:szCs w:val="15"/>
-                          <w:highlight w:val="cyan"/>
-                        </w:rPr>
-                        <w:t>$</w:t>
-                      </w:r>
-                      <w:proofErr w:type="spellStart"/>
-                      <w:r>
-                        <w:rPr>
-                          <w:rFonts w:ascii="Zetta Serif Book" w:hAnsi="Zetta Serif Book"/>
-                          <w:sz w:val="15"/>
-                          <w:szCs w:val="15"/>
-                          <w:highlight w:val="cyan"/>
-                        </w:rPr>
-                        <w:t>xxxx</w:t>
-                      </w:r>
-                      <w:proofErr w:type="spellEnd"/>
-                      <w:r>
-                        <w:rPr>
-                          <w:rFonts w:ascii="Zetta Serif Book" w:hAnsi="Zetta Serif Book"/>
-                          <w:sz w:val="15"/>
-                          <w:szCs w:val="15"/>
-                        </w:rPr>
-                        <w:t xml:space="preserve"> </w:t>
-                      </w:r>
-                      <w:r>
-                        <w:rPr>
-                          <w:rFonts w:ascii="Zetta Serif Book" w:hAnsi="Zetta Serif Book"/>
-                          <w:sz w:val="15"/>
-                          <w:szCs w:val="15"/>
-                        </w:rPr>
-                        <w:t>for each additional phase beyond the above stated schedule.</w:t>
-                      </w:r>
-                    </w:p>
-                    <w:p>
-                      <w:pPr>
-                        <w:pStyle w:val="ListParagraph"/>
-                        <w:numPr>
-                          <w:ilvl w:val="0"/>
-                          <w:numId w:val="1"/>
-                        </w:numPr>
-                        <w:spacing w:line="276" w:lineRule="auto"/>
-                        <w:rPr>
-                          <w:rFonts w:ascii="Zetta Serif Book" w:hAnsi="Zetta Serif Book"/>
-                          <w:sz w:val="15"/>
-                          <w:szCs w:val="15"/>
-                        </w:rPr>
-                      </w:pPr>
-                      <w:r>
-                        <w:rPr>
-                          <w:rFonts w:ascii="Zetta Serif Book" w:hAnsi="Zetta Serif Book"/>
-                          <w:sz w:val="15"/>
-                          <w:szCs w:val="15"/>
-                        </w:rPr>
-                        <w:t>Add $500 for show up time if crew mobilizes at agreed upon start date and time and job site is not ready.</w:t>
-                      </w:r>
-                    </w:p>
-                    <w:p>
-                      <w:pPr>
-                        <w:pStyle w:val="ListParagraph"/>
-                        <w:numPr>
-                          <w:ilvl w:val="0"/>
-                          <w:numId w:val="1"/>
-                        </w:numPr>
-                        <w:spacing w:line="276" w:lineRule="auto"/>
-                        <w:rPr>
-                          <w:rFonts w:ascii="Zetta Serif Book" w:hAnsi="Zetta Serif Book"/>
-                          <w:sz w:val="15"/>
-                          <w:szCs w:val="15"/>
-                        </w:rPr>
-                      </w:pPr>
-                      <w:r>
-                        <w:rPr>
-                          <w:rFonts w:ascii="Zetta Serif Book" w:hAnsi="Zetta Serif Book"/>
-                          <w:sz w:val="15"/>
-                          <w:szCs w:val="15"/>
-                        </w:rPr>
-                        <w:t>Add $500</w:t>
-                      </w:r>
-                      <w:r>
-                        <w:rPr>
-                          <w:rFonts w:ascii="Zetta Serif Book" w:hAnsi="Zetta Serif Book"/>
-                          <w:sz w:val="15"/>
-                          <w:szCs w:val="15"/>
-                        </w:rPr>
-                        <w:t>/ hour</w:t>
-                      </w:r>
-                      <w:r>
-                        <w:rPr>
-                          <w:rFonts w:ascii="Zetta Serif Book" w:hAnsi="Zetta Serif Book"/>
-                          <w:sz w:val="15"/>
-                          <w:szCs w:val="15"/>
-                        </w:rPr>
-                        <w:t xml:space="preserve"> for stand down time if crew is onsite working and crew is stopped </w:t>
-                      </w:r>
-                      <w:r>
-                        <w:rPr>
-                          <w:rFonts w:ascii="Zetta Serif Book" w:hAnsi="Zetta Serif Book"/>
-                          <w:sz w:val="15"/>
-                          <w:szCs w:val="15"/>
-                        </w:rPr>
-                        <w:t>for a reason outside of Treadwell’s control.</w:t>
-                      </w:r>
-                    </w:p>
-                    <w:p>
-                      <w:pPr>
-                        <w:pStyle w:val="ListParagraph"/>
-                        <w:numPr>
-                          <w:ilvl w:val="0"/>
-                          <w:numId w:val="1"/>
-                        </w:numPr>
-                        <w:spacing w:line="288" w:lineRule="auto"/>
-                        <w:rPr>
-                          <w:rFonts w:ascii="Zetta Serif Book" w:hAnsi="Zetta Serif Book"/>
-                          <w:b/>
-                          <w:sz w:val="16"/>
-                          <w:szCs w:val="16"/>
-                        </w:rPr>
-                      </w:pPr>
-                      <w:r>
-                        <w:rPr>
-                          <w:rFonts w:ascii="Zetta Serif Book" w:hAnsi="Zetta Serif Book"/>
-                          <w:b/>
-                          <w:sz w:val="16"/>
-                          <w:szCs w:val="16"/>
-                          <w:highlight w:val="yellow"/>
-                        </w:rPr>
-                        <w:t>Typical installation lead time is 5 weeks from the date signed proposal and deposit are received</w:t>
-                      </w:r>
-                      <w:r>
-                        <w:rPr>
-                          <w:rFonts w:ascii="Zetta Serif Book" w:hAnsi="Zetta Serif Book"/>
-                          <w:b/>
-                          <w:sz w:val="16"/>
-                          <w:szCs w:val="16"/>
-                        </w:rPr>
-                        <w:t xml:space="preserve">.  </w:t>
-                      </w:r>
-                    </w:p>
-                    <w:p>
-                      <w:pPr>
-                        <w:spacing w:line="288" w:lineRule="auto"/>
-                        <w:rPr>
-                          <w:rFonts w:ascii="Zetta Serif Book" w:hAnsi="Zetta Serif Book"/>
-                          <w:sz w:val="15"/>
-                          <w:szCs w:val="15"/>
-                        </w:rPr>
-                      </w:pPr>
-                    </w:p>
-                    <w:p>
-                      <w:pPr>
-                        <w:pStyle w:val="ListParagraph"/>
-                        <w:numPr>
-                          <w:ilvl w:val="0"/>
-                          <w:numId w:val="1"/>
-                        </w:numPr>
-                        <w:spacing w:line="288" w:lineRule="auto"/>
-                        <w:rPr>
-                          <w:rFonts w:ascii="Zetta Serif Book" w:hAnsi="Zetta Serif Book"/>
-                          <w:b/>
-                          <w:sz w:val="16"/>
-                          <w:szCs w:val="16"/>
-                        </w:rPr>
-                      </w:pPr>
-                      <w:r>
-                        <w:rPr>
-                          <w:rFonts w:ascii="Zetta Serif Book" w:hAnsi="Zetta Serif Book"/>
-                          <w:b/>
-                          <w:sz w:val="16"/>
-                          <w:szCs w:val="16"/>
-                          <w:highlight w:val="yellow"/>
-                        </w:rPr>
-                        <w:t>Payment – 25% due prior to scheduling, balance payable 10 days after completion via check</w:t>
-                      </w:r>
-                      <w:r>
-                        <w:rPr>
-                          <w:rFonts w:ascii="Zetta Serif Book" w:hAnsi="Zetta Serif Book"/>
-                          <w:b/>
-                          <w:sz w:val="16"/>
-                          <w:szCs w:val="16"/>
-                        </w:rPr>
-                        <w:t>.</w:t>
+                        <w:t xml:space="preserve">{{/notes}}</w:t>
                       </w:r>
                     </w:p>
                     <w:p>

</xml_diff>

<commit_message>
fix(proposal+estimate): left-align per-room PRICE block (bold headers only); copy lands next to source
- {{#room}} PRICE block: heading flush-left + bold; price/system/notes lines
  flush-left and un-bolded (was all-bold + indented heading). epoxy + combo.
- Estimate: a duplicated sheet now inserts immediately to the RIGHT of the sheet
  it was copied from (Excel behavior), via tab_order, instead of at the far end.

34 affected tests pass.

Co-Authored-By: Claude Opus 4.8 <noreply@anthropic.com>
</commit_message>
<xml_diff>
--- a/backend/templates/Direct/XX.XX TREADWELL EPOXY PROPOSAL - New Direct.docx
+++ b/backend/templates/Direct/XX.XX TREADWELL EPOXY PROPOSAL - New Direct.docx
@@ -2496,6 +2496,7 @@
                                 <w:sz w:val="18"/>
                                 <w:szCs w:val="18"/>
                               </w:rPr>
+                              <w:ind w:left="0" w:start="0"/>
                             </w:pPr>
                             <w:r>
                               <w:rPr>
@@ -2664,14 +2665,16 @@
                                 <w:sz w:val="18"/>
                                 <w:szCs w:val="18"/>
                               </w:rPr>
+                              <w:ind w:left="0" w:start="0"/>
                             </w:pPr>
                             <w:r>
                               <w:rPr>
                                 <w:rFonts w:ascii="Zetta Serif Book" w:hAnsi="Zetta Serif Book"/>
-                                <w:b/>
-                                <w:color w:val="404040" w:themeColor="text1" w:themeTint="BF"/>
-                                <w:sz w:val="18"/>
-                                <w:szCs w:val="18"/>
+                                <w:b w:val="0"/>
+                                <w:color w:val="404040" w:themeColor="text1" w:themeTint="BF"/>
+                                <w:sz w:val="18"/>
+                                <w:szCs w:val="18"/>
+                                <w:bCs w:val="0"/>
                               </w:rPr>
                               <w:t xml:space="preserve">{{room.price_formatted}} – {{room.price_desc}}</w:t>
                             </w:r>
@@ -2679,10 +2682,11 @@
                             <w:r>
                               <w:rPr>
                                 <w:rFonts w:ascii="Zetta Serif Book" w:hAnsi="Zetta Serif Book"/>
-                                <w:b/>
-                                <w:color w:val="404040" w:themeColor="text1" w:themeTint="BF"/>
-                                <w:sz w:val="18"/>
-                                <w:szCs w:val="18"/>
+                                <w:b w:val="0"/>
+                                <w:color w:val="404040" w:themeColor="text1" w:themeTint="BF"/>
+                                <w:sz w:val="18"/>
+                                <w:szCs w:val="18"/>
+                                <w:bCs w:val="0"/>
                               </w:rPr>
                               <w:t/>
                             </w:r>
@@ -2690,10 +2694,11 @@
                             <w:r>
                               <w:rPr>
                                 <w:rFonts w:ascii="Zetta Serif Book" w:hAnsi="Zetta Serif Book"/>
-                                <w:b/>
-                                <w:color w:val="404040" w:themeColor="text1" w:themeTint="BF"/>
-                                <w:sz w:val="18"/>
-                                <w:szCs w:val="18"/>
+                                <w:b w:val="0"/>
+                                <w:color w:val="404040" w:themeColor="text1" w:themeTint="BF"/>
+                                <w:sz w:val="18"/>
+                                <w:szCs w:val="18"/>
+                                <w:bCs w:val="0"/>
                               </w:rPr>
                               <w:t xml:space="preserve"/>
                             </w:r>
@@ -2703,6 +2708,8 @@
                                 <w:color w:val="404040" w:themeColor="text1" w:themeTint="BF"/>
                                 <w:sz w:val="18"/>
                                 <w:szCs w:val="18"/>
+                                <w:b w:val="0"/>
+                                <w:bCs w:val="0"/>
                               </w:rPr>
                               <w:t/>
                             </w:r>
@@ -2712,6 +2719,8 @@
                                 <w:color w:val="404040" w:themeColor="text1" w:themeTint="BF"/>
                                 <w:sz w:val="18"/>
                                 <w:szCs w:val="18"/>
+                                <w:b w:val="0"/>
+                                <w:bCs w:val="0"/>
                               </w:rPr>
                               <w:t xml:space="preserve"/>
                             </w:r>
@@ -2721,6 +2730,8 @@
                                 <w:color w:val="404040" w:themeColor="text1" w:themeTint="BF"/>
                                 <w:sz w:val="18"/>
                                 <w:szCs w:val="18"/>
+                                <w:b w:val="0"/>
+                                <w:bCs w:val="0"/>
                               </w:rPr>
                               <w:t/>
                             </w:r>
@@ -2730,6 +2741,8 @@
                                 <w:color w:val="404040" w:themeColor="text1" w:themeTint="BF"/>
                                 <w:sz w:val="18"/>
                                 <w:szCs w:val="18"/>
+                                <w:b w:val="0"/>
+                                <w:bCs w:val="0"/>
                               </w:rPr>
                               <w:t xml:space="preserve"/>
                             </w:r>
@@ -2739,6 +2752,8 @@
                                 <w:color w:val="404040" w:themeColor="text1" w:themeTint="BF"/>
                                 <w:sz w:val="18"/>
                                 <w:szCs w:val="18"/>
+                                <w:b w:val="0"/>
+                                <w:bCs w:val="0"/>
                               </w:rPr>
                               <w:t xml:space="preserve"/>
                             </w:r>
@@ -2748,6 +2763,8 @@
                                 <w:color w:val="404040" w:themeColor="text1" w:themeTint="BF"/>
                                 <w:sz w:val="18"/>
                                 <w:szCs w:val="18"/>
+                                <w:b w:val="0"/>
+                                <w:bCs w:val="0"/>
                               </w:rPr>
                               <w:t xml:space="preserve"/>
                             </w:r>
@@ -2759,6 +2776,8 @@
                                 <w:color w:val="404040" w:themeColor="text1" w:themeTint="BF"/>
                                 <w:sz w:val="18"/>
                                 <w:szCs w:val="18"/>
+                                <w:b w:val="0"/>
+                                <w:bCs w:val="0"/>
                               </w:rPr>
                               <w:t/>
                             </w:r>
@@ -2770,6 +2789,8 @@
                                 <w:color w:val="404040" w:themeColor="text1" w:themeTint="BF"/>
                                 <w:sz w:val="18"/>
                                 <w:szCs w:val="18"/>
+                                <w:b w:val="0"/>
+                                <w:bCs w:val="0"/>
                               </w:rPr>
                               <w:t xml:space="preserve"/>
                             </w:r>
@@ -2781,6 +2802,8 @@
                                 <w:color w:val="404040" w:themeColor="text1" w:themeTint="BF"/>
                                 <w:sz w:val="18"/>
                                 <w:szCs w:val="18"/>
+                                <w:b w:val="0"/>
+                                <w:bCs w:val="0"/>
                               </w:rPr>
                               <w:t xml:space="preserve"/>
                             </w:r>
@@ -2792,6 +2815,8 @@
                                 <w:color w:val="404040" w:themeColor="text1" w:themeTint="BF"/>
                                 <w:sz w:val="18"/>
                                 <w:szCs w:val="18"/>
+                                <w:b w:val="0"/>
+                                <w:bCs w:val="0"/>
                               </w:rPr>
                               <w:t/>
                             </w:r>
@@ -2803,6 +2828,8 @@
                                 <w:color w:val="404040" w:themeColor="text1" w:themeTint="BF"/>
                                 <w:sz w:val="18"/>
                                 <w:szCs w:val="18"/>
+                                <w:b w:val="0"/>
+                                <w:bCs w:val="0"/>
                               </w:rPr>
                               <w:t/>
                             </w:r>
@@ -2821,14 +2848,16 @@
                                 <w:sz w:val="18"/>
                                 <w:szCs w:val="18"/>
                               </w:rPr>
+                              <w:ind w:left="0" w:start="0"/>
                             </w:pPr>
                             <w:r>
                               <w:rPr>
                                 <w:rFonts w:ascii="Zetta Serif Book" w:hAnsi="Zetta Serif Book"/>
-                                <w:b/>
-                                <w:color w:val="404040" w:themeColor="text1" w:themeTint="BF"/>
-                                <w:sz w:val="18"/>
-                                <w:szCs w:val="18"/>
+                                <w:b w:val="0"/>
+                                <w:color w:val="404040" w:themeColor="text1" w:themeTint="BF"/>
+                                <w:sz w:val="18"/>
+                                <w:szCs w:val="18"/>
+                                <w:bCs w:val="0"/>
                               </w:rPr>
                               <w:t xml:space="preserve">{{room.notes_joined}}</w:t>
                             </w:r>
@@ -2836,10 +2865,11 @@
                             <w:r>
                               <w:rPr>
                                 <w:rFonts w:ascii="Zetta Serif Book" w:hAnsi="Zetta Serif Book"/>
-                                <w:b/>
-                                <w:color w:val="404040" w:themeColor="text1" w:themeTint="BF"/>
-                                <w:sz w:val="18"/>
-                                <w:szCs w:val="18"/>
+                                <w:b w:val="0"/>
+                                <w:color w:val="404040" w:themeColor="text1" w:themeTint="BF"/>
+                                <w:sz w:val="18"/>
+                                <w:szCs w:val="18"/>
+                                <w:bCs w:val="0"/>
                               </w:rPr>
                               <w:t/>
                             </w:r>
@@ -2847,10 +2877,11 @@
                             <w:r>
                               <w:rPr>
                                 <w:rFonts w:ascii="Zetta Serif Book" w:hAnsi="Zetta Serif Book"/>
-                                <w:b/>
-                                <w:color w:val="404040" w:themeColor="text1" w:themeTint="BF"/>
-                                <w:sz w:val="18"/>
-                                <w:szCs w:val="18"/>
+                                <w:b w:val="0"/>
+                                <w:color w:val="404040" w:themeColor="text1" w:themeTint="BF"/>
+                                <w:sz w:val="18"/>
+                                <w:szCs w:val="18"/>
+                                <w:bCs w:val="0"/>
                               </w:rPr>
                               <w:t xml:space="preserve"/>
                             </w:r>
@@ -2860,6 +2891,8 @@
                                 <w:color w:val="404040" w:themeColor="text1" w:themeTint="BF"/>
                                 <w:sz w:val="18"/>
                                 <w:szCs w:val="18"/>
+                                <w:b w:val="0"/>
+                                <w:bCs w:val="0"/>
                               </w:rPr>
                               <w:t/>
                             </w:r>
@@ -2869,6 +2902,8 @@
                                 <w:color w:val="404040" w:themeColor="text1" w:themeTint="BF"/>
                                 <w:sz w:val="18"/>
                                 <w:szCs w:val="18"/>
+                                <w:b w:val="0"/>
+                                <w:bCs w:val="0"/>
                               </w:rPr>
                               <w:t xml:space="preserve"/>
                             </w:r>
@@ -2878,6 +2913,8 @@
                                 <w:color w:val="404040" w:themeColor="text1" w:themeTint="BF"/>
                                 <w:sz w:val="18"/>
                                 <w:szCs w:val="18"/>
+                                <w:b w:val="0"/>
+                                <w:bCs w:val="0"/>
                               </w:rPr>
                               <w:t/>
                             </w:r>
@@ -2887,6 +2924,8 @@
                                 <w:color w:val="404040" w:themeColor="text1" w:themeTint="BF"/>
                                 <w:sz w:val="18"/>
                                 <w:szCs w:val="18"/>
+                                <w:b w:val="0"/>
+                                <w:bCs w:val="0"/>
                               </w:rPr>
                               <w:t xml:space="preserve"/>
                             </w:r>
@@ -2896,6 +2935,8 @@
                                 <w:color w:val="404040" w:themeColor="text1" w:themeTint="BF"/>
                                 <w:sz w:val="18"/>
                                 <w:szCs w:val="18"/>
+                                <w:b w:val="0"/>
+                                <w:bCs w:val="0"/>
                               </w:rPr>
                               <w:t xml:space="preserve"/>
                             </w:r>
@@ -2905,6 +2946,8 @@
                                 <w:color w:val="404040" w:themeColor="text1" w:themeTint="BF"/>
                                 <w:sz w:val="18"/>
                                 <w:szCs w:val="18"/>
+                                <w:b w:val="0"/>
+                                <w:bCs w:val="0"/>
                               </w:rPr>
                               <w:t xml:space="preserve"/>
                             </w:r>
@@ -2916,6 +2959,8 @@
                                 <w:color w:val="404040" w:themeColor="text1" w:themeTint="BF"/>
                                 <w:sz w:val="18"/>
                                 <w:szCs w:val="18"/>
+                                <w:b w:val="0"/>
+                                <w:bCs w:val="0"/>
                               </w:rPr>
                               <w:t/>
                             </w:r>
@@ -2927,6 +2972,8 @@
                                 <w:color w:val="404040" w:themeColor="text1" w:themeTint="BF"/>
                                 <w:sz w:val="18"/>
                                 <w:szCs w:val="18"/>
+                                <w:b w:val="0"/>
+                                <w:bCs w:val="0"/>
                               </w:rPr>
                               <w:t xml:space="preserve"/>
                             </w:r>
@@ -2938,6 +2985,8 @@
                                 <w:color w:val="404040" w:themeColor="text1" w:themeTint="BF"/>
                                 <w:sz w:val="18"/>
                                 <w:szCs w:val="18"/>
+                                <w:b w:val="0"/>
+                                <w:bCs w:val="0"/>
                               </w:rPr>
                               <w:t xml:space="preserve"/>
                             </w:r>
@@ -2949,6 +2998,8 @@
                                 <w:color w:val="404040" w:themeColor="text1" w:themeTint="BF"/>
                                 <w:sz w:val="18"/>
                                 <w:szCs w:val="18"/>
+                                <w:b w:val="0"/>
+                                <w:bCs w:val="0"/>
                               </w:rPr>
                               <w:t/>
                             </w:r>
@@ -2960,6 +3011,8 @@
                                 <w:color w:val="404040" w:themeColor="text1" w:themeTint="BF"/>
                                 <w:sz w:val="18"/>
                                 <w:szCs w:val="18"/>
+                                <w:b w:val="0"/>
+                                <w:bCs w:val="0"/>
                               </w:rPr>
                               <w:t/>
                             </w:r>
@@ -4119,6 +4172,7 @@
                           <w:sz w:val="18"/>
                           <w:szCs w:val="18"/>
                         </w:rPr>
+                        <w:ind w:left="0" w:start="0"/>
                       </w:pPr>
                       <w:r>
                         <w:rPr>
@@ -4287,14 +4341,16 @@
                           <w:sz w:val="18"/>
                           <w:szCs w:val="18"/>
                         </w:rPr>
+                        <w:ind w:left="0" w:start="0"/>
                       </w:pPr>
                       <w:r>
                         <w:rPr>
                           <w:rFonts w:ascii="Zetta Serif Book" w:hAnsi="Zetta Serif Book"/>
-                          <w:b/>
-                          <w:color w:val="404040" w:themeColor="text1" w:themeTint="BF"/>
-                          <w:sz w:val="18"/>
-                          <w:szCs w:val="18"/>
+                          <w:b w:val="0"/>
+                          <w:color w:val="404040" w:themeColor="text1" w:themeTint="BF"/>
+                          <w:sz w:val="18"/>
+                          <w:szCs w:val="18"/>
+                          <w:bCs w:val="0"/>
                         </w:rPr>
                         <w:t xml:space="preserve">{{room.price_formatted}} – {{room.price_desc}}</w:t>
                       </w:r>
@@ -4302,10 +4358,11 @@
                       <w:r>
                         <w:rPr>
                           <w:rFonts w:ascii="Zetta Serif Book" w:hAnsi="Zetta Serif Book"/>
-                          <w:b/>
-                          <w:color w:val="404040" w:themeColor="text1" w:themeTint="BF"/>
-                          <w:sz w:val="18"/>
-                          <w:szCs w:val="18"/>
+                          <w:b w:val="0"/>
+                          <w:color w:val="404040" w:themeColor="text1" w:themeTint="BF"/>
+                          <w:sz w:val="18"/>
+                          <w:szCs w:val="18"/>
+                          <w:bCs w:val="0"/>
                         </w:rPr>
                         <w:t/>
                       </w:r>
@@ -4313,10 +4370,11 @@
                       <w:r>
                         <w:rPr>
                           <w:rFonts w:ascii="Zetta Serif Book" w:hAnsi="Zetta Serif Book"/>
-                          <w:b/>
-                          <w:color w:val="404040" w:themeColor="text1" w:themeTint="BF"/>
-                          <w:sz w:val="18"/>
-                          <w:szCs w:val="18"/>
+                          <w:b w:val="0"/>
+                          <w:color w:val="404040" w:themeColor="text1" w:themeTint="BF"/>
+                          <w:sz w:val="18"/>
+                          <w:szCs w:val="18"/>
+                          <w:bCs w:val="0"/>
                         </w:rPr>
                         <w:t xml:space="preserve"/>
                       </w:r>
@@ -4326,6 +4384,8 @@
                           <w:color w:val="404040" w:themeColor="text1" w:themeTint="BF"/>
                           <w:sz w:val="18"/>
                           <w:szCs w:val="18"/>
+                          <w:b w:val="0"/>
+                          <w:bCs w:val="0"/>
                         </w:rPr>
                         <w:t/>
                       </w:r>
@@ -4335,6 +4395,8 @@
                           <w:color w:val="404040" w:themeColor="text1" w:themeTint="BF"/>
                           <w:sz w:val="18"/>
                           <w:szCs w:val="18"/>
+                          <w:b w:val="0"/>
+                          <w:bCs w:val="0"/>
                         </w:rPr>
                         <w:t xml:space="preserve"/>
                       </w:r>
@@ -4344,6 +4406,8 @@
                           <w:color w:val="404040" w:themeColor="text1" w:themeTint="BF"/>
                           <w:sz w:val="18"/>
                           <w:szCs w:val="18"/>
+                          <w:b w:val="0"/>
+                          <w:bCs w:val="0"/>
                         </w:rPr>
                         <w:t/>
                       </w:r>
@@ -4353,6 +4417,8 @@
                           <w:color w:val="404040" w:themeColor="text1" w:themeTint="BF"/>
                           <w:sz w:val="18"/>
                           <w:szCs w:val="18"/>
+                          <w:b w:val="0"/>
+                          <w:bCs w:val="0"/>
                         </w:rPr>
                         <w:t xml:space="preserve"/>
                       </w:r>
@@ -4362,6 +4428,8 @@
                           <w:color w:val="404040" w:themeColor="text1" w:themeTint="BF"/>
                           <w:sz w:val="18"/>
                           <w:szCs w:val="18"/>
+                          <w:b w:val="0"/>
+                          <w:bCs w:val="0"/>
                         </w:rPr>
                         <w:t xml:space="preserve"/>
                       </w:r>
@@ -4371,6 +4439,8 @@
                           <w:color w:val="404040" w:themeColor="text1" w:themeTint="BF"/>
                           <w:sz w:val="18"/>
                           <w:szCs w:val="18"/>
+                          <w:b w:val="0"/>
+                          <w:bCs w:val="0"/>
                         </w:rPr>
                         <w:t xml:space="preserve"/>
                       </w:r>
@@ -4382,6 +4452,8 @@
                           <w:color w:val="404040" w:themeColor="text1" w:themeTint="BF"/>
                           <w:sz w:val="18"/>
                           <w:szCs w:val="18"/>
+                          <w:b w:val="0"/>
+                          <w:bCs w:val="0"/>
                         </w:rPr>
                         <w:t/>
                       </w:r>
@@ -4393,6 +4465,8 @@
                           <w:color w:val="404040" w:themeColor="text1" w:themeTint="BF"/>
                           <w:sz w:val="18"/>
                           <w:szCs w:val="18"/>
+                          <w:b w:val="0"/>
+                          <w:bCs w:val="0"/>
                         </w:rPr>
                         <w:t xml:space="preserve"/>
                       </w:r>
@@ -4404,6 +4478,8 @@
                           <w:color w:val="404040" w:themeColor="text1" w:themeTint="BF"/>
                           <w:sz w:val="18"/>
                           <w:szCs w:val="18"/>
+                          <w:b w:val="0"/>
+                          <w:bCs w:val="0"/>
                         </w:rPr>
                         <w:t xml:space="preserve"/>
                       </w:r>
@@ -4415,6 +4491,8 @@
                           <w:color w:val="404040" w:themeColor="text1" w:themeTint="BF"/>
                           <w:sz w:val="18"/>
                           <w:szCs w:val="18"/>
+                          <w:b w:val="0"/>
+                          <w:bCs w:val="0"/>
                         </w:rPr>
                         <w:t/>
                       </w:r>
@@ -4426,6 +4504,8 @@
                           <w:color w:val="404040" w:themeColor="text1" w:themeTint="BF"/>
                           <w:sz w:val="18"/>
                           <w:szCs w:val="18"/>
+                          <w:b w:val="0"/>
+                          <w:bCs w:val="0"/>
                         </w:rPr>
                         <w:t/>
                       </w:r>
@@ -4444,14 +4524,16 @@
                           <w:sz w:val="18"/>
                           <w:szCs w:val="18"/>
                         </w:rPr>
+                        <w:ind w:left="0" w:start="0"/>
                       </w:pPr>
                       <w:r>
                         <w:rPr>
                           <w:rFonts w:ascii="Zetta Serif Book" w:hAnsi="Zetta Serif Book"/>
-                          <w:b/>
-                          <w:color w:val="404040" w:themeColor="text1" w:themeTint="BF"/>
-                          <w:sz w:val="18"/>
-                          <w:szCs w:val="18"/>
+                          <w:b w:val="0"/>
+                          <w:color w:val="404040" w:themeColor="text1" w:themeTint="BF"/>
+                          <w:sz w:val="18"/>
+                          <w:szCs w:val="18"/>
+                          <w:bCs w:val="0"/>
                         </w:rPr>
                         <w:t xml:space="preserve">{{room.notes_joined}}</w:t>
                       </w:r>
@@ -4459,10 +4541,11 @@
                       <w:r>
                         <w:rPr>
                           <w:rFonts w:ascii="Zetta Serif Book" w:hAnsi="Zetta Serif Book"/>
-                          <w:b/>
-                          <w:color w:val="404040" w:themeColor="text1" w:themeTint="BF"/>
-                          <w:sz w:val="18"/>
-                          <w:szCs w:val="18"/>
+                          <w:b w:val="0"/>
+                          <w:color w:val="404040" w:themeColor="text1" w:themeTint="BF"/>
+                          <w:sz w:val="18"/>
+                          <w:szCs w:val="18"/>
+                          <w:bCs w:val="0"/>
                         </w:rPr>
                         <w:t/>
                       </w:r>
@@ -4470,10 +4553,11 @@
                       <w:r>
                         <w:rPr>
                           <w:rFonts w:ascii="Zetta Serif Book" w:hAnsi="Zetta Serif Book"/>
-                          <w:b/>
-                          <w:color w:val="404040" w:themeColor="text1" w:themeTint="BF"/>
-                          <w:sz w:val="18"/>
-                          <w:szCs w:val="18"/>
+                          <w:b w:val="0"/>
+                          <w:color w:val="404040" w:themeColor="text1" w:themeTint="BF"/>
+                          <w:sz w:val="18"/>
+                          <w:szCs w:val="18"/>
+                          <w:bCs w:val="0"/>
                         </w:rPr>
                         <w:t xml:space="preserve"/>
                       </w:r>
@@ -4483,6 +4567,8 @@
                           <w:color w:val="404040" w:themeColor="text1" w:themeTint="BF"/>
                           <w:sz w:val="18"/>
                           <w:szCs w:val="18"/>
+                          <w:b w:val="0"/>
+                          <w:bCs w:val="0"/>
                         </w:rPr>
                         <w:t/>
                       </w:r>
@@ -4492,6 +4578,8 @@
                           <w:color w:val="404040" w:themeColor="text1" w:themeTint="BF"/>
                           <w:sz w:val="18"/>
                           <w:szCs w:val="18"/>
+                          <w:b w:val="0"/>
+                          <w:bCs w:val="0"/>
                         </w:rPr>
                         <w:t xml:space="preserve"/>
                       </w:r>
@@ -4501,6 +4589,8 @@
                           <w:color w:val="404040" w:themeColor="text1" w:themeTint="BF"/>
                           <w:sz w:val="18"/>
                           <w:szCs w:val="18"/>
+                          <w:b w:val="0"/>
+                          <w:bCs w:val="0"/>
                         </w:rPr>
                         <w:t/>
                       </w:r>
@@ -4510,6 +4600,8 @@
                           <w:color w:val="404040" w:themeColor="text1" w:themeTint="BF"/>
                           <w:sz w:val="18"/>
                           <w:szCs w:val="18"/>
+                          <w:b w:val="0"/>
+                          <w:bCs w:val="0"/>
                         </w:rPr>
                         <w:t xml:space="preserve"/>
                       </w:r>
@@ -4519,6 +4611,8 @@
                           <w:color w:val="404040" w:themeColor="text1" w:themeTint="BF"/>
                           <w:sz w:val="18"/>
                           <w:szCs w:val="18"/>
+                          <w:b w:val="0"/>
+                          <w:bCs w:val="0"/>
                         </w:rPr>
                         <w:t xml:space="preserve"/>
                       </w:r>
@@ -4528,6 +4622,8 @@
                           <w:color w:val="404040" w:themeColor="text1" w:themeTint="BF"/>
                           <w:sz w:val="18"/>
                           <w:szCs w:val="18"/>
+                          <w:b w:val="0"/>
+                          <w:bCs w:val="0"/>
                         </w:rPr>
                         <w:t xml:space="preserve"/>
                       </w:r>
@@ -4539,6 +4635,8 @@
                           <w:color w:val="404040" w:themeColor="text1" w:themeTint="BF"/>
                           <w:sz w:val="18"/>
                           <w:szCs w:val="18"/>
+                          <w:b w:val="0"/>
+                          <w:bCs w:val="0"/>
                         </w:rPr>
                         <w:t/>
                       </w:r>
@@ -4550,6 +4648,8 @@
                           <w:color w:val="404040" w:themeColor="text1" w:themeTint="BF"/>
                           <w:sz w:val="18"/>
                           <w:szCs w:val="18"/>
+                          <w:b w:val="0"/>
+                          <w:bCs w:val="0"/>
                         </w:rPr>
                         <w:t xml:space="preserve"/>
                       </w:r>
@@ -4561,6 +4661,8 @@
                           <w:color w:val="404040" w:themeColor="text1" w:themeTint="BF"/>
                           <w:sz w:val="18"/>
                           <w:szCs w:val="18"/>
+                          <w:b w:val="0"/>
+                          <w:bCs w:val="0"/>
                         </w:rPr>
                         <w:t xml:space="preserve"/>
                       </w:r>
@@ -4572,6 +4674,8 @@
                           <w:color w:val="404040" w:themeColor="text1" w:themeTint="BF"/>
                           <w:sz w:val="18"/>
                           <w:szCs w:val="18"/>
+                          <w:b w:val="0"/>
+                          <w:bCs w:val="0"/>
                         </w:rPr>
                         <w:t/>
                       </w:r>
@@ -4583,6 +4687,8 @@
                           <w:color w:val="404040" w:themeColor="text1" w:themeTint="BF"/>
                           <w:sz w:val="18"/>
                           <w:szCs w:val="18"/>
+                          <w:b w:val="0"/>
+                          <w:bCs w:val="0"/>
                         </w:rPr>
                         <w:t/>
                       </w:r>

</xml_diff>

<commit_message>
fix(proposal): single-bid/options/alternate PRICE blocks — bold headers only, left-align
Same treatment as the per-room block, matching Kyle's reference proposal: in the
{{#single_bid}}, {{#price_line}}, and {{#alternate}} PRICE blocks, only the section
headers (Base Bid, Options:, ALTERNATE SYSTEM) stay bold; the amount/line items go
regular weight, everything flush-left. (Token-collapse-into-first-run was rendering
every line bold.) All three Direct templates. 34 affected tests pass.

Co-Authored-By: Claude Opus 4.8 <noreply@anthropic.com>
</commit_message>
<xml_diff>
--- a/backend/templates/Direct/XX.XX TREADWELL EPOXY PROPOSAL - New Direct.docx
+++ b/backend/templates/Direct/XX.XX TREADWELL EPOXY PROPOSAL - New Direct.docx
@@ -2031,9 +2031,14 @@
     <w:p/>
     <w:p/>
     <w:p>
+      <w:pPr>
+        <w:ind w:left="0" w:start="0"/>
+      </w:pPr>
       <w:r>
         <w:rPr>
           <w:noProof/>
+          <w:b w:val="0"/>
+          <w:bCs w:val="0"/>
         </w:rPr>
         <mc:AlternateContent>
           <mc:Choice Requires="wps">
@@ -2414,6 +2419,8 @@
       <w:r>
         <w:rPr>
           <w:noProof/>
+          <w:b w:val="0"/>
+          <w:bCs w:val="0"/>
         </w:rPr>
         <mc:AlternateContent>
           <mc:Choice Requires="wps">
@@ -3037,6 +3044,7 @@
                                 <w:sz w:val="18"/>
                                 <w:szCs w:val="18"/>
                               </w:rPr>
+                              <w:ind w:left="0" w:start="0"/>
                             </w:pPr>
                             <w:r>
                               <w:rPr>
@@ -3205,14 +3213,16 @@
                                 <w:sz w:val="18"/>
                                 <w:szCs w:val="18"/>
                               </w:rPr>
+                              <w:ind w:left="0" w:start="0"/>
                             </w:pPr>
                             <w:r>
                               <w:rPr>
                                 <w:rFonts w:ascii="Zetta Serif Book" w:hAnsi="Zetta Serif Book"/>
-                                <w:b/>
-                                <w:color w:val="404040" w:themeColor="text1" w:themeTint="BF"/>
-                                <w:sz w:val="18"/>
-                                <w:szCs w:val="18"/>
+                                <w:b w:val="0"/>
+                                <w:color w:val="404040" w:themeColor="text1" w:themeTint="BF"/>
+                                <w:sz w:val="18"/>
+                                <w:szCs w:val="18"/>
+                                <w:bCs w:val="0"/>
                               </w:rPr>
                               <w:t xml:space="preserve">{{base_bid_formatted}} – Epoxy flooring as described above {{base_tax_phrase}}</w:t>
                             </w:r>
@@ -3220,10 +3230,11 @@
                             <w:r>
                               <w:rPr>
                                 <w:rFonts w:ascii="Zetta Serif Book" w:hAnsi="Zetta Serif Book"/>
-                                <w:b/>
-                                <w:color w:val="404040" w:themeColor="text1" w:themeTint="BF"/>
-                                <w:sz w:val="18"/>
-                                <w:szCs w:val="18"/>
+                                <w:b w:val="0"/>
+                                <w:color w:val="404040" w:themeColor="text1" w:themeTint="BF"/>
+                                <w:sz w:val="18"/>
+                                <w:szCs w:val="18"/>
+                                <w:bCs w:val="0"/>
                               </w:rPr>
                               <w:t/>
                             </w:r>
@@ -3231,10 +3242,11 @@
                             <w:r>
                               <w:rPr>
                                 <w:rFonts w:ascii="Zetta Serif Book" w:hAnsi="Zetta Serif Book"/>
-                                <w:b/>
-                                <w:color w:val="404040" w:themeColor="text1" w:themeTint="BF"/>
-                                <w:sz w:val="18"/>
-                                <w:szCs w:val="18"/>
+                                <w:b w:val="0"/>
+                                <w:color w:val="404040" w:themeColor="text1" w:themeTint="BF"/>
+                                <w:sz w:val="18"/>
+                                <w:szCs w:val="18"/>
+                                <w:bCs w:val="0"/>
                               </w:rPr>
                               <w:t xml:space="preserve"/>
                             </w:r>
@@ -3244,6 +3256,8 @@
                                 <w:color w:val="404040" w:themeColor="text1" w:themeTint="BF"/>
                                 <w:sz w:val="18"/>
                                 <w:szCs w:val="18"/>
+                                <w:b w:val="0"/>
+                                <w:bCs w:val="0"/>
                               </w:rPr>
                               <w:t/>
                             </w:r>
@@ -3253,6 +3267,8 @@
                                 <w:color w:val="404040" w:themeColor="text1" w:themeTint="BF"/>
                                 <w:sz w:val="18"/>
                                 <w:szCs w:val="18"/>
+                                <w:b w:val="0"/>
+                                <w:bCs w:val="0"/>
                               </w:rPr>
                               <w:t xml:space="preserve"/>
                             </w:r>
@@ -3262,6 +3278,8 @@
                                 <w:color w:val="404040" w:themeColor="text1" w:themeTint="BF"/>
                                 <w:sz w:val="18"/>
                                 <w:szCs w:val="18"/>
+                                <w:b w:val="0"/>
+                                <w:bCs w:val="0"/>
                               </w:rPr>
                               <w:t/>
                             </w:r>
@@ -3271,6 +3289,8 @@
                                 <w:color w:val="404040" w:themeColor="text1" w:themeTint="BF"/>
                                 <w:sz w:val="18"/>
                                 <w:szCs w:val="18"/>
+                                <w:b w:val="0"/>
+                                <w:bCs w:val="0"/>
                               </w:rPr>
                               <w:t xml:space="preserve"/>
                             </w:r>
@@ -3280,6 +3300,8 @@
                                 <w:color w:val="404040" w:themeColor="text1" w:themeTint="BF"/>
                                 <w:sz w:val="18"/>
                                 <w:szCs w:val="18"/>
+                                <w:b w:val="0"/>
+                                <w:bCs w:val="0"/>
                               </w:rPr>
                               <w:t xml:space="preserve"/>
                             </w:r>
@@ -3289,6 +3311,8 @@
                                 <w:color w:val="404040" w:themeColor="text1" w:themeTint="BF"/>
                                 <w:sz w:val="18"/>
                                 <w:szCs w:val="18"/>
+                                <w:b w:val="0"/>
+                                <w:bCs w:val="0"/>
                               </w:rPr>
                               <w:t xml:space="preserve"/>
                             </w:r>
@@ -3300,6 +3324,8 @@
                                 <w:color w:val="404040" w:themeColor="text1" w:themeTint="BF"/>
                                 <w:sz w:val="18"/>
                                 <w:szCs w:val="18"/>
+                                <w:b w:val="0"/>
+                                <w:bCs w:val="0"/>
                               </w:rPr>
                               <w:t/>
                             </w:r>
@@ -3311,6 +3337,8 @@
                                 <w:color w:val="404040" w:themeColor="text1" w:themeTint="BF"/>
                                 <w:sz w:val="18"/>
                                 <w:szCs w:val="18"/>
+                                <w:b w:val="0"/>
+                                <w:bCs w:val="0"/>
                               </w:rPr>
                               <w:t xml:space="preserve"/>
                             </w:r>
@@ -3322,6 +3350,8 @@
                                 <w:color w:val="404040" w:themeColor="text1" w:themeTint="BF"/>
                                 <w:sz w:val="18"/>
                                 <w:szCs w:val="18"/>
+                                <w:b w:val="0"/>
+                                <w:bCs w:val="0"/>
                               </w:rPr>
                               <w:t xml:space="preserve"/>
                             </w:r>
@@ -3333,6 +3363,8 @@
                                 <w:color w:val="404040" w:themeColor="text1" w:themeTint="BF"/>
                                 <w:sz w:val="18"/>
                                 <w:szCs w:val="18"/>
+                                <w:b w:val="0"/>
+                                <w:bCs w:val="0"/>
                               </w:rPr>
                               <w:t/>
                             </w:r>
@@ -3344,6 +3376,8 @@
                                 <w:color w:val="404040" w:themeColor="text1" w:themeTint="BF"/>
                                 <w:sz w:val="18"/>
                                 <w:szCs w:val="18"/>
+                                <w:b w:val="0"/>
+                                <w:bCs w:val="0"/>
                               </w:rPr>
                               <w:t/>
                             </w:r>
@@ -3362,14 +3396,16 @@
                                 <w:sz w:val="18"/>
                                 <w:szCs w:val="18"/>
                               </w:rPr>
+                              <w:ind w:left="0" w:start="0"/>
                             </w:pPr>
                             <w:r>
                               <w:rPr>
                                 <w:rFonts w:ascii="Zetta Serif Book" w:hAnsi="Zetta Serif Book"/>
-                                <w:b/>
-                                <w:color w:val="404040" w:themeColor="text1" w:themeTint="BF"/>
-                                <w:sz w:val="18"/>
-                                <w:szCs w:val="18"/>
+                                <w:b w:val="0"/>
+                                <w:color w:val="404040" w:themeColor="text1" w:themeTint="BF"/>
+                                <w:sz w:val="18"/>
+                                <w:szCs w:val="18"/>
+                                <w:bCs w:val="0"/>
                               </w:rPr>
                               <w:t xml:space="preserve">{{material_tax_formatted}} – Material Sales Tax</w:t>
                             </w:r>
@@ -3377,10 +3413,11 @@
                             <w:r>
                               <w:rPr>
                                 <w:rFonts w:ascii="Zetta Serif Book" w:hAnsi="Zetta Serif Book"/>
-                                <w:b/>
-                                <w:color w:val="404040" w:themeColor="text1" w:themeTint="BF"/>
-                                <w:sz w:val="18"/>
-                                <w:szCs w:val="18"/>
+                                <w:b w:val="0"/>
+                                <w:color w:val="404040" w:themeColor="text1" w:themeTint="BF"/>
+                                <w:sz w:val="18"/>
+                                <w:szCs w:val="18"/>
+                                <w:bCs w:val="0"/>
                               </w:rPr>
                               <w:t/>
                             </w:r>
@@ -3388,10 +3425,11 @@
                             <w:r>
                               <w:rPr>
                                 <w:rFonts w:ascii="Zetta Serif Book" w:hAnsi="Zetta Serif Book"/>
-                                <w:b/>
-                                <w:color w:val="404040" w:themeColor="text1" w:themeTint="BF"/>
-                                <w:sz w:val="18"/>
-                                <w:szCs w:val="18"/>
+                                <w:b w:val="0"/>
+                                <w:color w:val="404040" w:themeColor="text1" w:themeTint="BF"/>
+                                <w:sz w:val="18"/>
+                                <w:szCs w:val="18"/>
+                                <w:bCs w:val="0"/>
                               </w:rPr>
                               <w:t xml:space="preserve"/>
                             </w:r>
@@ -3401,6 +3439,8 @@
                                 <w:color w:val="404040" w:themeColor="text1" w:themeTint="BF"/>
                                 <w:sz w:val="18"/>
                                 <w:szCs w:val="18"/>
+                                <w:b w:val="0"/>
+                                <w:bCs w:val="0"/>
                               </w:rPr>
                               <w:t/>
                             </w:r>
@@ -3410,6 +3450,8 @@
                                 <w:color w:val="404040" w:themeColor="text1" w:themeTint="BF"/>
                                 <w:sz w:val="18"/>
                                 <w:szCs w:val="18"/>
+                                <w:b w:val="0"/>
+                                <w:bCs w:val="0"/>
                               </w:rPr>
                               <w:t xml:space="preserve"/>
                             </w:r>
@@ -3419,6 +3461,8 @@
                                 <w:color w:val="404040" w:themeColor="text1" w:themeTint="BF"/>
                                 <w:sz w:val="18"/>
                                 <w:szCs w:val="18"/>
+                                <w:b w:val="0"/>
+                                <w:bCs w:val="0"/>
                               </w:rPr>
                               <w:t/>
                             </w:r>
@@ -3428,6 +3472,8 @@
                                 <w:color w:val="404040" w:themeColor="text1" w:themeTint="BF"/>
                                 <w:sz w:val="18"/>
                                 <w:szCs w:val="18"/>
+                                <w:b w:val="0"/>
+                                <w:bCs w:val="0"/>
                               </w:rPr>
                               <w:t xml:space="preserve"/>
                             </w:r>
@@ -3437,6 +3483,8 @@
                                 <w:color w:val="404040" w:themeColor="text1" w:themeTint="BF"/>
                                 <w:sz w:val="18"/>
                                 <w:szCs w:val="18"/>
+                                <w:b w:val="0"/>
+                                <w:bCs w:val="0"/>
                               </w:rPr>
                               <w:t xml:space="preserve"/>
                             </w:r>
@@ -3446,6 +3494,8 @@
                                 <w:color w:val="404040" w:themeColor="text1" w:themeTint="BF"/>
                                 <w:sz w:val="18"/>
                                 <w:szCs w:val="18"/>
+                                <w:b w:val="0"/>
+                                <w:bCs w:val="0"/>
                               </w:rPr>
                               <w:t xml:space="preserve"/>
                             </w:r>
@@ -3457,6 +3507,8 @@
                                 <w:color w:val="404040" w:themeColor="text1" w:themeTint="BF"/>
                                 <w:sz w:val="18"/>
                                 <w:szCs w:val="18"/>
+                                <w:b w:val="0"/>
+                                <w:bCs w:val="0"/>
                               </w:rPr>
                               <w:t/>
                             </w:r>
@@ -3468,6 +3520,8 @@
                                 <w:color w:val="404040" w:themeColor="text1" w:themeTint="BF"/>
                                 <w:sz w:val="18"/>
                                 <w:szCs w:val="18"/>
+                                <w:b w:val="0"/>
+                                <w:bCs w:val="0"/>
                               </w:rPr>
                               <w:t xml:space="preserve"/>
                             </w:r>
@@ -3479,6 +3533,8 @@
                                 <w:color w:val="404040" w:themeColor="text1" w:themeTint="BF"/>
                                 <w:sz w:val="18"/>
                                 <w:szCs w:val="18"/>
+                                <w:b w:val="0"/>
+                                <w:bCs w:val="0"/>
                               </w:rPr>
                               <w:t xml:space="preserve"/>
                             </w:r>
@@ -3490,6 +3546,8 @@
                                 <w:color w:val="404040" w:themeColor="text1" w:themeTint="BF"/>
                                 <w:sz w:val="18"/>
                                 <w:szCs w:val="18"/>
+                                <w:b w:val="0"/>
+                                <w:bCs w:val="0"/>
                               </w:rPr>
                               <w:t/>
                             </w:r>
@@ -3501,6 +3559,8 @@
                                 <w:color w:val="404040" w:themeColor="text1" w:themeTint="BF"/>
                                 <w:sz w:val="18"/>
                                 <w:szCs w:val="18"/>
+                                <w:b w:val="0"/>
+                                <w:bCs w:val="0"/>
                               </w:rPr>
                               <w:t/>
                             </w:r>
@@ -3524,6 +3584,7 @@
                                 <w:sz w:val="18"/>
                                 <w:szCs w:val="18"/>
                               </w:rPr>
+                              <w:ind w:left="0" w:start="0"/>
                             </w:pPr>
                             <w:r>
                               <w:rPr>
@@ -3533,6 +3594,8 @@
                                 <w:szCs w:val="18"/>
                                 <w:highlight w:val="yellow"/>
                                 <w:u w:val="single"/>
+                                <w:b w:val="0"/>
+                                <w:bCs w:val="0"/>
                               </w:rPr>
                               <w:t xml:space="preserve">{{remodel.amount_formatted}} – Remodel Tax</w:t>
                             </w:r>
@@ -3544,6 +3607,8 @@
                                 <w:szCs w:val="18"/>
                                 <w:highlight w:val="yellow"/>
                                 <w:u w:val="single"/>
+                                <w:b w:val="0"/>
+                                <w:bCs w:val="0"/>
                               </w:rPr>
                               <w:t xml:space="preserve"/>
                             </w:r>
@@ -3555,6 +3620,8 @@
                                 <w:szCs w:val="18"/>
                                 <w:highlight w:val="yellow"/>
                                 <w:u w:val="single"/>
+                                <w:b w:val="0"/>
+                                <w:bCs w:val="0"/>
                               </w:rPr>
                               <w:t/>
                             </w:r>
@@ -3566,6 +3633,8 @@
                                 <w:szCs w:val="18"/>
                                 <w:highlight w:val="yellow"/>
                                 <w:u w:val="single"/>
+                                <w:b w:val="0"/>
+                                <w:bCs w:val="0"/>
                               </w:rPr>
                               <w:t/>
                             </w:r>
@@ -3577,6 +3646,8 @@
                                 <w:szCs w:val="18"/>
                                 <w:highlight w:val="yellow"/>
                                 <w:u w:val="single"/>
+                                <w:b w:val="0"/>
+                                <w:bCs w:val="0"/>
                               </w:rPr>
                               <w:t xml:space="preserve"/>
                             </w:r>
@@ -3587,6 +3658,8 @@
                                 <w:sz w:val="18"/>
                                 <w:szCs w:val="18"/>
                                 <w:highlight w:val="yellow"/>
+                                <w:b w:val="0"/>
+                                <w:bCs w:val="0"/>
                               </w:rPr>
                               <w:t/>
                             </w:r>
@@ -3596,6 +3669,8 @@
                                 <w:color w:val="404040" w:themeColor="text1" w:themeTint="BF"/>
                                 <w:sz w:val="18"/>
                                 <w:szCs w:val="18"/>
+                                <w:b w:val="0"/>
+                                <w:bCs w:val="0"/>
                               </w:rPr>
                               <w:t xml:space="preserve"/>
                             </w:r>
@@ -3619,12 +3694,13 @@
                                 <w:sz w:val="18"/>
                                 <w:szCs w:val="18"/>
                               </w:rPr>
+                              <w:ind w:left="0" w:start="0"/>
                             </w:pPr>
                             <w:r>
                               <w:rPr>
                                 <w:rFonts w:ascii="Zetta Serif Book" w:hAnsi="Zetta Serif Book"/>
-                                <w:b/>
-                                <w:bCs/>
+                                <w:b w:val="0"/>
+                                <w:bCs w:val="0"/>
                                 <w:color w:val="404040" w:themeColor="text1" w:themeTint="BF"/>
                                 <w:sz w:val="18"/>
                                 <w:szCs w:val="18"/>
@@ -3637,6 +3713,8 @@
                                 <w:color w:val="404040" w:themeColor="text1" w:themeTint="BF"/>
                                 <w:sz w:val="18"/>
                                 <w:szCs w:val="18"/>
+                                <w:b w:val="0"/>
+                                <w:bCs w:val="0"/>
                               </w:rPr>
                               <w:t xml:space="preserve"/>
                             </w:r>
@@ -3651,6 +3729,7 @@
                                 <w:sz w:val="18"/>
                                 <w:szCs w:val="18"/>
                               </w:rPr>
+                              <w:ind w:left="0" w:start="0"/>
                             </w:pPr>
                             <w:r>
                               <w:rPr>
@@ -3851,12 +3930,13 @@
                                 <w:sz w:val="18"/>
                                 <w:szCs w:val="18"/>
                               </w:rPr>
+                              <w:ind w:left="0" w:start="0"/>
                             </w:pPr>
                             <w:r>
                               <w:rPr>
                                 <w:rFonts w:ascii="Zetta Serif Book" w:hAnsi="Zetta Serif Book"/>
-                                <w:b/>
-                                <w:bCs/>
+                                <w:b w:val="0"/>
+                                <w:bCs w:val="0"/>
                                 <w:color w:val="404040" w:themeColor="text1" w:themeTint="BF"/>
                                 <w:sz w:val="18"/>
                                 <w:szCs w:val="18"/>
@@ -3932,6 +4012,7 @@
                                 <w:sz w:val="18"/>
                                 <w:szCs w:val="18"/>
                               </w:rPr>
+                              <w:ind w:left="0" w:start="0"/>
                             </w:pPr>
                             <w:r>
                               <w:rPr>
@@ -3959,12 +4040,13 @@
                                 <w:sz w:val="18"/>
                                 <w:szCs w:val="18"/>
                               </w:rPr>
+                              <w:ind w:left="0" w:start="0"/>
                             </w:pPr>
                             <w:r>
                               <w:rPr>
                                 <w:rFonts w:ascii="Zetta Serif Book" w:hAnsi="Zetta Serif Book"/>
-                                <w:b/>
-                                <w:bCs/>
+                                <w:b w:val="0"/>
+                                <w:bCs w:val="0"/>
                                 <w:color w:val="404040" w:themeColor="text1" w:themeTint="BF"/>
                                 <w:sz w:val="18"/>
                                 <w:szCs w:val="18"/>
@@ -3986,12 +4068,13 @@
                                 <w:sz w:val="18"/>
                                 <w:szCs w:val="18"/>
                               </w:rPr>
+                              <w:ind w:left="0" w:start="0"/>
                             </w:pPr>
                             <w:r>
                               <w:rPr>
                                 <w:rFonts w:ascii="Zetta Serif Book" w:hAnsi="Zetta Serif Book"/>
-                                <w:b/>
-                                <w:bCs/>
+                                <w:b w:val="0"/>
+                                <w:bCs w:val="0"/>
                                 <w:color w:val="404040" w:themeColor="text1" w:themeTint="BF"/>
                                 <w:sz w:val="18"/>
                                 <w:szCs w:val="18"/>
@@ -4013,12 +4096,13 @@
                                 <w:sz w:val="18"/>
                                 <w:szCs w:val="18"/>
                               </w:rPr>
+                              <w:ind w:left="0" w:start="0"/>
                             </w:pPr>
                             <w:r>
                               <w:rPr>
                                 <w:rFonts w:ascii="Zetta Serif Book" w:hAnsi="Zetta Serif Book"/>
-                                <w:b/>
-                                <w:bCs/>
+                                <w:b w:val="0"/>
+                                <w:bCs w:val="0"/>
                                 <w:color w:val="404040" w:themeColor="text1" w:themeTint="BF"/>
                                 <w:sz w:val="18"/>
                                 <w:szCs w:val="18"/>
@@ -4713,6 +4797,7 @@
                           <w:sz w:val="18"/>
                           <w:szCs w:val="18"/>
                         </w:rPr>
+                        <w:ind w:left="0" w:start="0"/>
                       </w:pPr>
                       <w:r>
                         <w:rPr>
@@ -4881,14 +4966,16 @@
                           <w:sz w:val="18"/>
                           <w:szCs w:val="18"/>
                         </w:rPr>
+                        <w:ind w:left="0" w:start="0"/>
                       </w:pPr>
                       <w:r>
                         <w:rPr>
                           <w:rFonts w:ascii="Zetta Serif Book" w:hAnsi="Zetta Serif Book"/>
-                          <w:b/>
-                          <w:color w:val="404040" w:themeColor="text1" w:themeTint="BF"/>
-                          <w:sz w:val="18"/>
-                          <w:szCs w:val="18"/>
+                          <w:b w:val="0"/>
+                          <w:color w:val="404040" w:themeColor="text1" w:themeTint="BF"/>
+                          <w:sz w:val="18"/>
+                          <w:szCs w:val="18"/>
+                          <w:bCs w:val="0"/>
                         </w:rPr>
                         <w:t xml:space="preserve">{{base_bid_formatted}} – Epoxy flooring as described above {{base_tax_phrase}}</w:t>
                       </w:r>
@@ -4896,10 +4983,11 @@
                       <w:r>
                         <w:rPr>
                           <w:rFonts w:ascii="Zetta Serif Book" w:hAnsi="Zetta Serif Book"/>
-                          <w:b/>
-                          <w:color w:val="404040" w:themeColor="text1" w:themeTint="BF"/>
-                          <w:sz w:val="18"/>
-                          <w:szCs w:val="18"/>
+                          <w:b w:val="0"/>
+                          <w:color w:val="404040" w:themeColor="text1" w:themeTint="BF"/>
+                          <w:sz w:val="18"/>
+                          <w:szCs w:val="18"/>
+                          <w:bCs w:val="0"/>
                         </w:rPr>
                         <w:t/>
                       </w:r>
@@ -4907,10 +4995,11 @@
                       <w:r>
                         <w:rPr>
                           <w:rFonts w:ascii="Zetta Serif Book" w:hAnsi="Zetta Serif Book"/>
-                          <w:b/>
-                          <w:color w:val="404040" w:themeColor="text1" w:themeTint="BF"/>
-                          <w:sz w:val="18"/>
-                          <w:szCs w:val="18"/>
+                          <w:b w:val="0"/>
+                          <w:color w:val="404040" w:themeColor="text1" w:themeTint="BF"/>
+                          <w:sz w:val="18"/>
+                          <w:szCs w:val="18"/>
+                          <w:bCs w:val="0"/>
                         </w:rPr>
                         <w:t xml:space="preserve"/>
                       </w:r>
@@ -4920,6 +5009,8 @@
                           <w:color w:val="404040" w:themeColor="text1" w:themeTint="BF"/>
                           <w:sz w:val="18"/>
                           <w:szCs w:val="18"/>
+                          <w:b w:val="0"/>
+                          <w:bCs w:val="0"/>
                         </w:rPr>
                         <w:t/>
                       </w:r>
@@ -4929,6 +5020,8 @@
                           <w:color w:val="404040" w:themeColor="text1" w:themeTint="BF"/>
                           <w:sz w:val="18"/>
                           <w:szCs w:val="18"/>
+                          <w:b w:val="0"/>
+                          <w:bCs w:val="0"/>
                         </w:rPr>
                         <w:t xml:space="preserve"/>
                       </w:r>
@@ -4938,6 +5031,8 @@
                           <w:color w:val="404040" w:themeColor="text1" w:themeTint="BF"/>
                           <w:sz w:val="18"/>
                           <w:szCs w:val="18"/>
+                          <w:b w:val="0"/>
+                          <w:bCs w:val="0"/>
                         </w:rPr>
                         <w:t/>
                       </w:r>
@@ -4947,6 +5042,8 @@
                           <w:color w:val="404040" w:themeColor="text1" w:themeTint="BF"/>
                           <w:sz w:val="18"/>
                           <w:szCs w:val="18"/>
+                          <w:b w:val="0"/>
+                          <w:bCs w:val="0"/>
                         </w:rPr>
                         <w:t xml:space="preserve"/>
                       </w:r>
@@ -4956,6 +5053,8 @@
                           <w:color w:val="404040" w:themeColor="text1" w:themeTint="BF"/>
                           <w:sz w:val="18"/>
                           <w:szCs w:val="18"/>
+                          <w:b w:val="0"/>
+                          <w:bCs w:val="0"/>
                         </w:rPr>
                         <w:t xml:space="preserve"/>
                       </w:r>
@@ -4965,6 +5064,8 @@
                           <w:color w:val="404040" w:themeColor="text1" w:themeTint="BF"/>
                           <w:sz w:val="18"/>
                           <w:szCs w:val="18"/>
+                          <w:b w:val="0"/>
+                          <w:bCs w:val="0"/>
                         </w:rPr>
                         <w:t xml:space="preserve"/>
                       </w:r>
@@ -4976,6 +5077,8 @@
                           <w:color w:val="404040" w:themeColor="text1" w:themeTint="BF"/>
                           <w:sz w:val="18"/>
                           <w:szCs w:val="18"/>
+                          <w:b w:val="0"/>
+                          <w:bCs w:val="0"/>
                         </w:rPr>
                         <w:t/>
                       </w:r>
@@ -4987,6 +5090,8 @@
                           <w:color w:val="404040" w:themeColor="text1" w:themeTint="BF"/>
                           <w:sz w:val="18"/>
                           <w:szCs w:val="18"/>
+                          <w:b w:val="0"/>
+                          <w:bCs w:val="0"/>
                         </w:rPr>
                         <w:t xml:space="preserve"/>
                       </w:r>
@@ -4998,6 +5103,8 @@
                           <w:color w:val="404040" w:themeColor="text1" w:themeTint="BF"/>
                           <w:sz w:val="18"/>
                           <w:szCs w:val="18"/>
+                          <w:b w:val="0"/>
+                          <w:bCs w:val="0"/>
                         </w:rPr>
                         <w:t xml:space="preserve"/>
                       </w:r>
@@ -5009,6 +5116,8 @@
                           <w:color w:val="404040" w:themeColor="text1" w:themeTint="BF"/>
                           <w:sz w:val="18"/>
                           <w:szCs w:val="18"/>
+                          <w:b w:val="0"/>
+                          <w:bCs w:val="0"/>
                         </w:rPr>
                         <w:t/>
                       </w:r>
@@ -5020,6 +5129,8 @@
                           <w:color w:val="404040" w:themeColor="text1" w:themeTint="BF"/>
                           <w:sz w:val="18"/>
                           <w:szCs w:val="18"/>
+                          <w:b w:val="0"/>
+                          <w:bCs w:val="0"/>
                         </w:rPr>
                         <w:t/>
                       </w:r>
@@ -5038,14 +5149,16 @@
                           <w:sz w:val="18"/>
                           <w:szCs w:val="18"/>
                         </w:rPr>
+                        <w:ind w:left="0" w:start="0"/>
                       </w:pPr>
                       <w:r>
                         <w:rPr>
                           <w:rFonts w:ascii="Zetta Serif Book" w:hAnsi="Zetta Serif Book"/>
-                          <w:b/>
-                          <w:color w:val="404040" w:themeColor="text1" w:themeTint="BF"/>
-                          <w:sz w:val="18"/>
-                          <w:szCs w:val="18"/>
+                          <w:b w:val="0"/>
+                          <w:color w:val="404040" w:themeColor="text1" w:themeTint="BF"/>
+                          <w:sz w:val="18"/>
+                          <w:szCs w:val="18"/>
+                          <w:bCs w:val="0"/>
                         </w:rPr>
                         <w:t xml:space="preserve">{{material_tax_formatted}} – Material Sales Tax</w:t>
                       </w:r>
@@ -5053,10 +5166,11 @@
                       <w:r>
                         <w:rPr>
                           <w:rFonts w:ascii="Zetta Serif Book" w:hAnsi="Zetta Serif Book"/>
-                          <w:b/>
-                          <w:color w:val="404040" w:themeColor="text1" w:themeTint="BF"/>
-                          <w:sz w:val="18"/>
-                          <w:szCs w:val="18"/>
+                          <w:b w:val="0"/>
+                          <w:color w:val="404040" w:themeColor="text1" w:themeTint="BF"/>
+                          <w:sz w:val="18"/>
+                          <w:szCs w:val="18"/>
+                          <w:bCs w:val="0"/>
                         </w:rPr>
                         <w:t/>
                       </w:r>
@@ -5064,10 +5178,11 @@
                       <w:r>
                         <w:rPr>
                           <w:rFonts w:ascii="Zetta Serif Book" w:hAnsi="Zetta Serif Book"/>
-                          <w:b/>
-                          <w:color w:val="404040" w:themeColor="text1" w:themeTint="BF"/>
-                          <w:sz w:val="18"/>
-                          <w:szCs w:val="18"/>
+                          <w:b w:val="0"/>
+                          <w:color w:val="404040" w:themeColor="text1" w:themeTint="BF"/>
+                          <w:sz w:val="18"/>
+                          <w:szCs w:val="18"/>
+                          <w:bCs w:val="0"/>
                         </w:rPr>
                         <w:t xml:space="preserve"/>
                       </w:r>
@@ -5077,6 +5192,8 @@
                           <w:color w:val="404040" w:themeColor="text1" w:themeTint="BF"/>
                           <w:sz w:val="18"/>
                           <w:szCs w:val="18"/>
+                          <w:b w:val="0"/>
+                          <w:bCs w:val="0"/>
                         </w:rPr>
                         <w:t/>
                       </w:r>
@@ -5086,6 +5203,8 @@
                           <w:color w:val="404040" w:themeColor="text1" w:themeTint="BF"/>
                           <w:sz w:val="18"/>
                           <w:szCs w:val="18"/>
+                          <w:b w:val="0"/>
+                          <w:bCs w:val="0"/>
                         </w:rPr>
                         <w:t xml:space="preserve"/>
                       </w:r>
@@ -5095,6 +5214,8 @@
                           <w:color w:val="404040" w:themeColor="text1" w:themeTint="BF"/>
                           <w:sz w:val="18"/>
                           <w:szCs w:val="18"/>
+                          <w:b w:val="0"/>
+                          <w:bCs w:val="0"/>
                         </w:rPr>
                         <w:t/>
                       </w:r>
@@ -5104,6 +5225,8 @@
                           <w:color w:val="404040" w:themeColor="text1" w:themeTint="BF"/>
                           <w:sz w:val="18"/>
                           <w:szCs w:val="18"/>
+                          <w:b w:val="0"/>
+                          <w:bCs w:val="0"/>
                         </w:rPr>
                         <w:t xml:space="preserve"/>
                       </w:r>
@@ -5113,6 +5236,8 @@
                           <w:color w:val="404040" w:themeColor="text1" w:themeTint="BF"/>
                           <w:sz w:val="18"/>
                           <w:szCs w:val="18"/>
+                          <w:b w:val="0"/>
+                          <w:bCs w:val="0"/>
                         </w:rPr>
                         <w:t xml:space="preserve"/>
                       </w:r>
@@ -5122,6 +5247,8 @@
                           <w:color w:val="404040" w:themeColor="text1" w:themeTint="BF"/>
                           <w:sz w:val="18"/>
                           <w:szCs w:val="18"/>
+                          <w:b w:val="0"/>
+                          <w:bCs w:val="0"/>
                         </w:rPr>
                         <w:t xml:space="preserve"/>
                       </w:r>
@@ -5133,6 +5260,8 @@
                           <w:color w:val="404040" w:themeColor="text1" w:themeTint="BF"/>
                           <w:sz w:val="18"/>
                           <w:szCs w:val="18"/>
+                          <w:b w:val="0"/>
+                          <w:bCs w:val="0"/>
                         </w:rPr>
                         <w:t/>
                       </w:r>
@@ -5144,6 +5273,8 @@
                           <w:color w:val="404040" w:themeColor="text1" w:themeTint="BF"/>
                           <w:sz w:val="18"/>
                           <w:szCs w:val="18"/>
+                          <w:b w:val="0"/>
+                          <w:bCs w:val="0"/>
                         </w:rPr>
                         <w:t xml:space="preserve"/>
                       </w:r>
@@ -5155,6 +5286,8 @@
                           <w:color w:val="404040" w:themeColor="text1" w:themeTint="BF"/>
                           <w:sz w:val="18"/>
                           <w:szCs w:val="18"/>
+                          <w:b w:val="0"/>
+                          <w:bCs w:val="0"/>
                         </w:rPr>
                         <w:t xml:space="preserve"/>
                       </w:r>
@@ -5166,6 +5299,8 @@
                           <w:color w:val="404040" w:themeColor="text1" w:themeTint="BF"/>
                           <w:sz w:val="18"/>
                           <w:szCs w:val="18"/>
+                          <w:b w:val="0"/>
+                          <w:bCs w:val="0"/>
                         </w:rPr>
                         <w:t/>
                       </w:r>
@@ -5177,6 +5312,8 @@
                           <w:color w:val="404040" w:themeColor="text1" w:themeTint="BF"/>
                           <w:sz w:val="18"/>
                           <w:szCs w:val="18"/>
+                          <w:b w:val="0"/>
+                          <w:bCs w:val="0"/>
                         </w:rPr>
                         <w:t/>
                       </w:r>
@@ -5200,6 +5337,7 @@
                           <w:sz w:val="18"/>
                           <w:szCs w:val="18"/>
                         </w:rPr>
+                        <w:ind w:left="0" w:start="0"/>
                       </w:pPr>
                       <w:r>
                         <w:rPr>
@@ -5209,6 +5347,8 @@
                           <w:szCs w:val="18"/>
                           <w:highlight w:val="yellow"/>
                           <w:u w:val="single"/>
+                          <w:b w:val="0"/>
+                          <w:bCs w:val="0"/>
                         </w:rPr>
                         <w:t xml:space="preserve">{{remodel.amount_formatted}} – Remodel Tax</w:t>
                       </w:r>
@@ -5220,6 +5360,8 @@
                           <w:szCs w:val="18"/>
                           <w:highlight w:val="yellow"/>
                           <w:u w:val="single"/>
+                          <w:b w:val="0"/>
+                          <w:bCs w:val="0"/>
                         </w:rPr>
                         <w:t xml:space="preserve"/>
                       </w:r>
@@ -5231,6 +5373,8 @@
                           <w:szCs w:val="18"/>
                           <w:highlight w:val="yellow"/>
                           <w:u w:val="single"/>
+                          <w:b w:val="0"/>
+                          <w:bCs w:val="0"/>
                         </w:rPr>
                         <w:t/>
                       </w:r>
@@ -5242,6 +5386,8 @@
                           <w:szCs w:val="18"/>
                           <w:highlight w:val="yellow"/>
                           <w:u w:val="single"/>
+                          <w:b w:val="0"/>
+                          <w:bCs w:val="0"/>
                         </w:rPr>
                         <w:t/>
                       </w:r>
@@ -5253,6 +5399,8 @@
                           <w:szCs w:val="18"/>
                           <w:highlight w:val="yellow"/>
                           <w:u w:val="single"/>
+                          <w:b w:val="0"/>
+                          <w:bCs w:val="0"/>
                         </w:rPr>
                         <w:t xml:space="preserve"/>
                       </w:r>
@@ -5263,6 +5411,8 @@
                           <w:sz w:val="18"/>
                           <w:szCs w:val="18"/>
                           <w:highlight w:val="yellow"/>
+                          <w:b w:val="0"/>
+                          <w:bCs w:val="0"/>
                         </w:rPr>
                         <w:t/>
                       </w:r>
@@ -5272,6 +5422,8 @@
                           <w:color w:val="404040" w:themeColor="text1" w:themeTint="BF"/>
                           <w:sz w:val="18"/>
                           <w:szCs w:val="18"/>
+                          <w:b w:val="0"/>
+                          <w:bCs w:val="0"/>
                         </w:rPr>
                         <w:t xml:space="preserve"/>
                       </w:r>
@@ -5295,12 +5447,13 @@
                           <w:sz w:val="18"/>
                           <w:szCs w:val="18"/>
                         </w:rPr>
+                        <w:ind w:left="0" w:start="0"/>
                       </w:pPr>
                       <w:r>
                         <w:rPr>
                           <w:rFonts w:ascii="Zetta Serif Book" w:hAnsi="Zetta Serif Book"/>
-                          <w:b/>
-                          <w:bCs/>
+                          <w:b w:val="0"/>
+                          <w:bCs w:val="0"/>
                           <w:color w:val="404040" w:themeColor="text1" w:themeTint="BF"/>
                           <w:sz w:val="18"/>
                           <w:szCs w:val="18"/>
@@ -5310,8 +5463,8 @@
                       <w:r>
                         <w:rPr>
                           <w:rFonts w:ascii="Zetta Serif Book" w:hAnsi="Zetta Serif Book"/>
-                          <w:b/>
-                          <w:bCs/>
+                          <w:b w:val="0"/>
+                          <w:bCs w:val="0"/>
                           <w:color w:val="404040" w:themeColor="text1" w:themeTint="BF"/>
                           <w:sz w:val="18"/>
                           <w:szCs w:val="18"/>
@@ -5324,6 +5477,8 @@
                           <w:color w:val="404040" w:themeColor="text1" w:themeTint="BF"/>
                           <w:sz w:val="18"/>
                           <w:szCs w:val="18"/>
+                          <w:b w:val="0"/>
+                          <w:bCs w:val="0"/>
                         </w:rPr>
                         <w:t xml:space="preserve"/>
                       </w:r>
@@ -5338,6 +5493,7 @@
                           <w:sz w:val="18"/>
                           <w:szCs w:val="18"/>
                         </w:rPr>
+                        <w:ind w:left="0" w:start="0"/>
                       </w:pPr>
                       <w:r>
                         <w:rPr>
@@ -5538,12 +5694,13 @@
                           <w:sz w:val="18"/>
                           <w:szCs w:val="18"/>
                         </w:rPr>
+                        <w:ind w:left="0" w:start="0"/>
                       </w:pPr>
                       <w:r>
                         <w:rPr>
                           <w:rFonts w:ascii="Zetta Serif Book" w:hAnsi="Zetta Serif Book"/>
-                          <w:b/>
-                          <w:bCs/>
+                          <w:b w:val="0"/>
+                          <w:bCs w:val="0"/>
                           <w:color w:val="404040" w:themeColor="text1" w:themeTint="BF"/>
                           <w:sz w:val="18"/>
                           <w:szCs w:val="18"/>
@@ -5619,6 +5776,7 @@
                           <w:sz w:val="18"/>
                           <w:szCs w:val="18"/>
                         </w:rPr>
+                        <w:ind w:left="0" w:start="0"/>
                       </w:pPr>
                       <w:r>
                         <w:rPr>
@@ -5646,12 +5804,13 @@
                           <w:sz w:val="18"/>
                           <w:szCs w:val="18"/>
                         </w:rPr>
+                        <w:ind w:left="0" w:start="0"/>
                       </w:pPr>
                       <w:r>
                         <w:rPr>
                           <w:rFonts w:ascii="Zetta Serif Book" w:hAnsi="Zetta Serif Book"/>
-                          <w:b/>
-                          <w:bCs/>
+                          <w:b w:val="0"/>
+                          <w:bCs w:val="0"/>
                           <w:color w:val="404040" w:themeColor="text1" w:themeTint="BF"/>
                           <w:sz w:val="18"/>
                           <w:szCs w:val="18"/>
@@ -5673,12 +5832,13 @@
                           <w:sz w:val="18"/>
                           <w:szCs w:val="18"/>
                         </w:rPr>
+                        <w:ind w:left="0" w:start="0"/>
                       </w:pPr>
                       <w:r>
                         <w:rPr>
                           <w:rFonts w:ascii="Zetta Serif Book" w:hAnsi="Zetta Serif Book"/>
-                          <w:b/>
-                          <w:bCs/>
+                          <w:b w:val="0"/>
+                          <w:bCs w:val="0"/>
                           <w:color w:val="404040" w:themeColor="text1" w:themeTint="BF"/>
                           <w:sz w:val="18"/>
                           <w:szCs w:val="18"/>
@@ -5700,12 +5860,13 @@
                           <w:sz w:val="18"/>
                           <w:szCs w:val="18"/>
                         </w:rPr>
+                        <w:ind w:left="0" w:start="0"/>
                       </w:pPr>
                       <w:r>
                         <w:rPr>
                           <w:rFonts w:ascii="Zetta Serif Book" w:hAnsi="Zetta Serif Book"/>
-                          <w:b/>
-                          <w:bCs/>
+                          <w:b w:val="0"/>
+                          <w:bCs w:val="0"/>
                           <w:color w:val="404040" w:themeColor="text1" w:themeTint="BF"/>
                           <w:sz w:val="18"/>
                           <w:szCs w:val="18"/>

</xml_diff>